<commit_message>
feat: adjust default figure width in subheading function
</commit_message>
<xml_diff>
--- a/docs/academic/paper/AURIS_paper_TR.docx
+++ b/docs/academic/paper/AURIS_paper_TR.docx
@@ -392,6 +392,16 @@
         </w:rPr>
         <w:t>AI-generated music · Deep learning · Gradient boosting · Ensemble learning · Audio classification · Spectral flatness</w:t>
       </w:r>
+    </w:p>
+    <w:p>
+      <w:pPr>
+        <w:sectPr>
+          <w:pgSz w:w="11906" w:h="16838"/>
+          <w:pgMar w:top="1582" w:right="850" w:bottom="278" w:left="850" w:header="720" w:footer="720" w:gutter="0"/>
+          <w:cols w:space="720"/>
+          <w:docGrid w:linePitch="360"/>
+        </w:sectPr>
+      </w:pPr>
     </w:p>
     <w:p>
       <w:pPr>
@@ -747,16 +757,16 @@
         <w:tblLook w:firstColumn="1" w:firstRow="1" w:lastColumn="0" w:lastRow="0" w:noHBand="0" w:noVBand="1" w:val="04A0"/>
       </w:tblPr>
       <w:tblGrid>
-        <w:gridCol w:w="1928"/>
-        <w:gridCol w:w="1928"/>
-        <w:gridCol w:w="1928"/>
-        <w:gridCol w:w="1928"/>
-        <w:gridCol w:w="1928"/>
+        <w:gridCol w:w="2041"/>
+        <w:gridCol w:w="2041"/>
+        <w:gridCol w:w="2041"/>
+        <w:gridCol w:w="2041"/>
+        <w:gridCol w:w="2041"/>
       </w:tblGrid>
       <w:tr>
         <w:tc>
           <w:tcPr>
-            <w:tcW w:type="dxa" w:w="1928"/>
+            <w:tcW w:type="dxa" w:w="2041"/>
             <w:shd w:val="clear" w:color="auto" w:fill="C99347"/>
           </w:tcPr>
           <w:p>
@@ -778,7 +788,7 @@
         </w:tc>
         <w:tc>
           <w:tcPr>
-            <w:tcW w:type="dxa" w:w="1928"/>
+            <w:tcW w:type="dxa" w:w="2041"/>
             <w:shd w:val="clear" w:color="auto" w:fill="C99347"/>
           </w:tcPr>
           <w:p>
@@ -800,7 +810,7 @@
         </w:tc>
         <w:tc>
           <w:tcPr>
-            <w:tcW w:type="dxa" w:w="1928"/>
+            <w:tcW w:type="dxa" w:w="2041"/>
             <w:shd w:val="clear" w:color="auto" w:fill="C99347"/>
           </w:tcPr>
           <w:p>
@@ -822,7 +832,7 @@
         </w:tc>
         <w:tc>
           <w:tcPr>
-            <w:tcW w:type="dxa" w:w="1928"/>
+            <w:tcW w:type="dxa" w:w="2041"/>
             <w:shd w:val="clear" w:color="auto" w:fill="C99347"/>
           </w:tcPr>
           <w:p>
@@ -844,7 +854,7 @@
         </w:tc>
         <w:tc>
           <w:tcPr>
-            <w:tcW w:type="dxa" w:w="1928"/>
+            <w:tcW w:type="dxa" w:w="2041"/>
             <w:shd w:val="clear" w:color="auto" w:fill="C99347"/>
           </w:tcPr>
           <w:p>
@@ -868,7 +878,7 @@
       <w:tr>
         <w:tc>
           <w:tcPr>
-            <w:tcW w:type="dxa" w:w="1928"/>
+            <w:tcW w:type="dxa" w:w="2041"/>
             <w:shd w:val="clear" w:color="auto" w:fill="FFFFFF"/>
           </w:tcPr>
           <w:p>
@@ -890,7 +900,7 @@
         </w:tc>
         <w:tc>
           <w:tcPr>
-            <w:tcW w:type="dxa" w:w="1928"/>
+            <w:tcW w:type="dxa" w:w="2041"/>
             <w:shd w:val="clear" w:color="auto" w:fill="FFFFFF"/>
           </w:tcPr>
           <w:p>
@@ -912,7 +922,7 @@
         </w:tc>
         <w:tc>
           <w:tcPr>
-            <w:tcW w:type="dxa" w:w="1928"/>
+            <w:tcW w:type="dxa" w:w="2041"/>
             <w:shd w:val="clear" w:color="auto" w:fill="FFFFFF"/>
           </w:tcPr>
           <w:p>
@@ -934,7 +944,7 @@
         </w:tc>
         <w:tc>
           <w:tcPr>
-            <w:tcW w:type="dxa" w:w="1928"/>
+            <w:tcW w:type="dxa" w:w="2041"/>
             <w:shd w:val="clear" w:color="auto" w:fill="FFFFFF"/>
           </w:tcPr>
           <w:p>
@@ -956,7 +966,7 @@
         </w:tc>
         <w:tc>
           <w:tcPr>
-            <w:tcW w:type="dxa" w:w="1928"/>
+            <w:tcW w:type="dxa" w:w="2041"/>
             <w:shd w:val="clear" w:color="auto" w:fill="FFFFFF"/>
           </w:tcPr>
           <w:p>
@@ -980,7 +990,7 @@
       <w:tr>
         <w:tc>
           <w:tcPr>
-            <w:tcW w:type="dxa" w:w="1928"/>
+            <w:tcW w:type="dxa" w:w="2041"/>
             <w:shd w:val="clear" w:color="auto" w:fill="F5F0E8"/>
           </w:tcPr>
           <w:p>
@@ -1002,7 +1012,7 @@
         </w:tc>
         <w:tc>
           <w:tcPr>
-            <w:tcW w:type="dxa" w:w="1928"/>
+            <w:tcW w:type="dxa" w:w="2041"/>
             <w:shd w:val="clear" w:color="auto" w:fill="F5F0E8"/>
           </w:tcPr>
           <w:p>
@@ -1024,7 +1034,7 @@
         </w:tc>
         <w:tc>
           <w:tcPr>
-            <w:tcW w:type="dxa" w:w="1928"/>
+            <w:tcW w:type="dxa" w:w="2041"/>
             <w:shd w:val="clear" w:color="auto" w:fill="F5F0E8"/>
           </w:tcPr>
           <w:p>
@@ -1046,7 +1056,7 @@
         </w:tc>
         <w:tc>
           <w:tcPr>
-            <w:tcW w:type="dxa" w:w="1928"/>
+            <w:tcW w:type="dxa" w:w="2041"/>
             <w:shd w:val="clear" w:color="auto" w:fill="F5F0E8"/>
           </w:tcPr>
           <w:p>
@@ -1068,7 +1078,7 @@
         </w:tc>
         <w:tc>
           <w:tcPr>
-            <w:tcW w:type="dxa" w:w="1928"/>
+            <w:tcW w:type="dxa" w:w="2041"/>
             <w:shd w:val="clear" w:color="auto" w:fill="F5F0E8"/>
           </w:tcPr>
           <w:p>
@@ -1092,7 +1102,7 @@
       <w:tr>
         <w:tc>
           <w:tcPr>
-            <w:tcW w:type="dxa" w:w="1928"/>
+            <w:tcW w:type="dxa" w:w="2041"/>
             <w:shd w:val="clear" w:color="auto" w:fill="FFFFFF"/>
           </w:tcPr>
           <w:p>
@@ -1114,7 +1124,7 @@
         </w:tc>
         <w:tc>
           <w:tcPr>
-            <w:tcW w:type="dxa" w:w="1928"/>
+            <w:tcW w:type="dxa" w:w="2041"/>
             <w:shd w:val="clear" w:color="auto" w:fill="FFFFFF"/>
           </w:tcPr>
           <w:p>
@@ -1136,7 +1146,7 @@
         </w:tc>
         <w:tc>
           <w:tcPr>
-            <w:tcW w:type="dxa" w:w="1928"/>
+            <w:tcW w:type="dxa" w:w="2041"/>
             <w:shd w:val="clear" w:color="auto" w:fill="FFFFFF"/>
           </w:tcPr>
           <w:p>
@@ -1158,7 +1168,7 @@
         </w:tc>
         <w:tc>
           <w:tcPr>
-            <w:tcW w:type="dxa" w:w="1928"/>
+            <w:tcW w:type="dxa" w:w="2041"/>
             <w:shd w:val="clear" w:color="auto" w:fill="FFFFFF"/>
           </w:tcPr>
           <w:p>
@@ -1180,7 +1190,7 @@
         </w:tc>
         <w:tc>
           <w:tcPr>
-            <w:tcW w:type="dxa" w:w="1928"/>
+            <w:tcW w:type="dxa" w:w="2041"/>
             <w:shd w:val="clear" w:color="auto" w:fill="FFFFFF"/>
           </w:tcPr>
           <w:p>
@@ -1204,7 +1214,7 @@
       <w:tr>
         <w:tc>
           <w:tcPr>
-            <w:tcW w:type="dxa" w:w="1928"/>
+            <w:tcW w:type="dxa" w:w="2041"/>
             <w:shd w:val="clear" w:color="auto" w:fill="F5F0E8"/>
           </w:tcPr>
           <w:p>
@@ -1226,7 +1236,7 @@
         </w:tc>
         <w:tc>
           <w:tcPr>
-            <w:tcW w:type="dxa" w:w="1928"/>
+            <w:tcW w:type="dxa" w:w="2041"/>
             <w:shd w:val="clear" w:color="auto" w:fill="F5F0E8"/>
           </w:tcPr>
           <w:p>
@@ -1248,7 +1258,7 @@
         </w:tc>
         <w:tc>
           <w:tcPr>
-            <w:tcW w:type="dxa" w:w="1928"/>
+            <w:tcW w:type="dxa" w:w="2041"/>
             <w:shd w:val="clear" w:color="auto" w:fill="F5F0E8"/>
           </w:tcPr>
           <w:p>
@@ -1270,7 +1280,7 @@
         </w:tc>
         <w:tc>
           <w:tcPr>
-            <w:tcW w:type="dxa" w:w="1928"/>
+            <w:tcW w:type="dxa" w:w="2041"/>
             <w:shd w:val="clear" w:color="auto" w:fill="F5F0E8"/>
           </w:tcPr>
           <w:p>
@@ -1292,7 +1302,7 @@
         </w:tc>
         <w:tc>
           <w:tcPr>
-            <w:tcW w:type="dxa" w:w="1928"/>
+            <w:tcW w:type="dxa" w:w="2041"/>
             <w:shd w:val="clear" w:color="auto" w:fill="F5F0E8"/>
           </w:tcPr>
           <w:p>
@@ -1316,7 +1326,7 @@
       <w:tr>
         <w:tc>
           <w:tcPr>
-            <w:tcW w:type="dxa" w:w="1928"/>
+            <w:tcW w:type="dxa" w:w="2041"/>
             <w:shd w:val="clear" w:color="auto" w:fill="FFFFFF"/>
           </w:tcPr>
           <w:p>
@@ -1338,7 +1348,7 @@
         </w:tc>
         <w:tc>
           <w:tcPr>
-            <w:tcW w:type="dxa" w:w="1928"/>
+            <w:tcW w:type="dxa" w:w="2041"/>
             <w:shd w:val="clear" w:color="auto" w:fill="FFFFFF"/>
           </w:tcPr>
           <w:p>
@@ -1360,7 +1370,7 @@
         </w:tc>
         <w:tc>
           <w:tcPr>
-            <w:tcW w:type="dxa" w:w="1928"/>
+            <w:tcW w:type="dxa" w:w="2041"/>
             <w:shd w:val="clear" w:color="auto" w:fill="FFFFFF"/>
           </w:tcPr>
           <w:p>
@@ -1382,7 +1392,7 @@
         </w:tc>
         <w:tc>
           <w:tcPr>
-            <w:tcW w:type="dxa" w:w="1928"/>
+            <w:tcW w:type="dxa" w:w="2041"/>
             <w:shd w:val="clear" w:color="auto" w:fill="FFFFFF"/>
           </w:tcPr>
           <w:p>
@@ -1404,7 +1414,7 @@
         </w:tc>
         <w:tc>
           <w:tcPr>
-            <w:tcW w:type="dxa" w:w="1928"/>
+            <w:tcW w:type="dxa" w:w="2041"/>
             <w:shd w:val="clear" w:color="auto" w:fill="FFFFFF"/>
           </w:tcPr>
           <w:p>
@@ -1428,7 +1438,7 @@
       <w:tr>
         <w:tc>
           <w:tcPr>
-            <w:tcW w:type="dxa" w:w="1928"/>
+            <w:tcW w:type="dxa" w:w="2041"/>
             <w:shd w:val="clear" w:color="auto" w:fill="F5F0E8"/>
           </w:tcPr>
           <w:p>
@@ -1450,7 +1460,7 @@
         </w:tc>
         <w:tc>
           <w:tcPr>
-            <w:tcW w:type="dxa" w:w="1928"/>
+            <w:tcW w:type="dxa" w:w="2041"/>
             <w:shd w:val="clear" w:color="auto" w:fill="F5F0E8"/>
           </w:tcPr>
           <w:p>
@@ -1472,7 +1482,7 @@
         </w:tc>
         <w:tc>
           <w:tcPr>
-            <w:tcW w:type="dxa" w:w="1928"/>
+            <w:tcW w:type="dxa" w:w="2041"/>
             <w:shd w:val="clear" w:color="auto" w:fill="F5F0E8"/>
           </w:tcPr>
           <w:p>
@@ -1494,7 +1504,7 @@
         </w:tc>
         <w:tc>
           <w:tcPr>
-            <w:tcW w:type="dxa" w:w="1928"/>
+            <w:tcW w:type="dxa" w:w="2041"/>
             <w:shd w:val="clear" w:color="auto" w:fill="F5F0E8"/>
           </w:tcPr>
           <w:p>
@@ -1516,7 +1526,7 @@
         </w:tc>
         <w:tc>
           <w:tcPr>
-            <w:tcW w:type="dxa" w:w="1928"/>
+            <w:tcW w:type="dxa" w:w="2041"/>
             <w:shd w:val="clear" w:color="auto" w:fill="F5F0E8"/>
           </w:tcPr>
           <w:p>
@@ -1540,7 +1550,7 @@
       <w:tr>
         <w:tc>
           <w:tcPr>
-            <w:tcW w:type="dxa" w:w="1928"/>
+            <w:tcW w:type="dxa" w:w="2041"/>
             <w:shd w:val="clear" w:color="auto" w:fill="FFFFFF"/>
           </w:tcPr>
           <w:p>
@@ -1562,7 +1572,7 @@
         </w:tc>
         <w:tc>
           <w:tcPr>
-            <w:tcW w:type="dxa" w:w="1928"/>
+            <w:tcW w:type="dxa" w:w="2041"/>
             <w:shd w:val="clear" w:color="auto" w:fill="FFFFFF"/>
           </w:tcPr>
           <w:p>
@@ -1584,7 +1594,7 @@
         </w:tc>
         <w:tc>
           <w:tcPr>
-            <w:tcW w:type="dxa" w:w="1928"/>
+            <w:tcW w:type="dxa" w:w="2041"/>
             <w:shd w:val="clear" w:color="auto" w:fill="FFFFFF"/>
           </w:tcPr>
           <w:p>
@@ -1606,7 +1616,7 @@
         </w:tc>
         <w:tc>
           <w:tcPr>
-            <w:tcW w:type="dxa" w:w="1928"/>
+            <w:tcW w:type="dxa" w:w="2041"/>
             <w:shd w:val="clear" w:color="auto" w:fill="FFFFFF"/>
           </w:tcPr>
           <w:p>
@@ -1628,7 +1638,7 @@
         </w:tc>
         <w:tc>
           <w:tcPr>
-            <w:tcW w:type="dxa" w:w="1928"/>
+            <w:tcW w:type="dxa" w:w="2041"/>
             <w:shd w:val="clear" w:color="auto" w:fill="FFFFFF"/>
           </w:tcPr>
           <w:p>
@@ -1652,7 +1662,7 @@
       <w:tr>
         <w:tc>
           <w:tcPr>
-            <w:tcW w:type="dxa" w:w="1928"/>
+            <w:tcW w:type="dxa" w:w="2041"/>
             <w:shd w:val="clear" w:color="auto" w:fill="F5F0E8"/>
           </w:tcPr>
           <w:p>
@@ -1674,7 +1684,7 @@
         </w:tc>
         <w:tc>
           <w:tcPr>
-            <w:tcW w:type="dxa" w:w="1928"/>
+            <w:tcW w:type="dxa" w:w="2041"/>
             <w:shd w:val="clear" w:color="auto" w:fill="F5F0E8"/>
           </w:tcPr>
           <w:p>
@@ -1696,7 +1706,7 @@
         </w:tc>
         <w:tc>
           <w:tcPr>
-            <w:tcW w:type="dxa" w:w="1928"/>
+            <w:tcW w:type="dxa" w:w="2041"/>
             <w:shd w:val="clear" w:color="auto" w:fill="F5F0E8"/>
           </w:tcPr>
           <w:p>
@@ -1718,7 +1728,7 @@
         </w:tc>
         <w:tc>
           <w:tcPr>
-            <w:tcW w:type="dxa" w:w="1928"/>
+            <w:tcW w:type="dxa" w:w="2041"/>
             <w:shd w:val="clear" w:color="auto" w:fill="F5F0E8"/>
           </w:tcPr>
           <w:p>
@@ -1740,7 +1750,7 @@
         </w:tc>
         <w:tc>
           <w:tcPr>
-            <w:tcW w:type="dxa" w:w="1928"/>
+            <w:tcW w:type="dxa" w:w="2041"/>
             <w:shd w:val="clear" w:color="auto" w:fill="F5F0E8"/>
           </w:tcPr>
           <w:p>
@@ -1809,7 +1819,7 @@
       <w:r>
         <w:drawing>
           <wp:inline xmlns:a="http://schemas.openxmlformats.org/drawingml/2006/main" xmlns:pic="http://schemas.openxmlformats.org/drawingml/2006/picture">
-            <wp:extent cx="5400000" cy="1742967"/>
+            <wp:extent cx="3060000" cy="987681"/>
             <wp:docPr id="1" name="Picture 1"/>
             <wp:cNvGraphicFramePr>
               <a:graphicFrameLocks noChangeAspect="1"/>
@@ -1830,7 +1840,7 @@
                   <pic:spPr>
                     <a:xfrm>
                       <a:off x="0" y="0"/>
-                      <a:ext cx="5400000" cy="1742967"/>
+                      <a:ext cx="3060000" cy="987681"/>
                     </a:xfrm>
                     <a:prstGeom prst="rect"/>
                   </pic:spPr>
@@ -1948,15 +1958,15 @@
         <w:tblLook w:firstColumn="1" w:firstRow="1" w:lastColumn="0" w:lastRow="0" w:noHBand="0" w:noVBand="1" w:val="04A0"/>
       </w:tblPr>
       <w:tblGrid>
-        <w:gridCol w:w="2409"/>
-        <w:gridCol w:w="2409"/>
-        <w:gridCol w:w="2409"/>
-        <w:gridCol w:w="2409"/>
+        <w:gridCol w:w="2551"/>
+        <w:gridCol w:w="2551"/>
+        <w:gridCol w:w="2551"/>
+        <w:gridCol w:w="2551"/>
       </w:tblGrid>
       <w:tr>
         <w:tc>
           <w:tcPr>
-            <w:tcW w:type="dxa" w:w="2409"/>
+            <w:tcW w:type="dxa" w:w="2551"/>
             <w:shd w:val="clear" w:color="auto" w:fill="C99347"/>
           </w:tcPr>
           <w:p>
@@ -1978,7 +1988,7 @@
         </w:tc>
         <w:tc>
           <w:tcPr>
-            <w:tcW w:type="dxa" w:w="2409"/>
+            <w:tcW w:type="dxa" w:w="2551"/>
             <w:shd w:val="clear" w:color="auto" w:fill="C99347"/>
           </w:tcPr>
           <w:p>
@@ -2000,7 +2010,7 @@
         </w:tc>
         <w:tc>
           <w:tcPr>
-            <w:tcW w:type="dxa" w:w="2409"/>
+            <w:tcW w:type="dxa" w:w="2551"/>
             <w:shd w:val="clear" w:color="auto" w:fill="C99347"/>
           </w:tcPr>
           <w:p>
@@ -2022,7 +2032,7 @@
         </w:tc>
         <w:tc>
           <w:tcPr>
-            <w:tcW w:type="dxa" w:w="2409"/>
+            <w:tcW w:type="dxa" w:w="2551"/>
             <w:shd w:val="clear" w:color="auto" w:fill="C99347"/>
           </w:tcPr>
           <w:p>
@@ -2046,7 +2056,7 @@
       <w:tr>
         <w:tc>
           <w:tcPr>
-            <w:tcW w:type="dxa" w:w="2409"/>
+            <w:tcW w:type="dxa" w:w="2551"/>
             <w:shd w:val="clear" w:color="auto" w:fill="FFFFFF"/>
           </w:tcPr>
           <w:p>
@@ -2068,7 +2078,7 @@
         </w:tc>
         <w:tc>
           <w:tcPr>
-            <w:tcW w:type="dxa" w:w="2409"/>
+            <w:tcW w:type="dxa" w:w="2551"/>
             <w:shd w:val="clear" w:color="auto" w:fill="FFFFFF"/>
           </w:tcPr>
           <w:p>
@@ -2090,7 +2100,7 @@
         </w:tc>
         <w:tc>
           <w:tcPr>
-            <w:tcW w:type="dxa" w:w="2409"/>
+            <w:tcW w:type="dxa" w:w="2551"/>
             <w:shd w:val="clear" w:color="auto" w:fill="FFFFFF"/>
           </w:tcPr>
           <w:p>
@@ -2112,7 +2122,7 @@
         </w:tc>
         <w:tc>
           <w:tcPr>
-            <w:tcW w:type="dxa" w:w="2409"/>
+            <w:tcW w:type="dxa" w:w="2551"/>
             <w:shd w:val="clear" w:color="auto" w:fill="FFFFFF"/>
           </w:tcPr>
           <w:p>
@@ -2136,7 +2146,7 @@
       <w:tr>
         <w:tc>
           <w:tcPr>
-            <w:tcW w:type="dxa" w:w="2409"/>
+            <w:tcW w:type="dxa" w:w="2551"/>
             <w:shd w:val="clear" w:color="auto" w:fill="F5F0E8"/>
           </w:tcPr>
           <w:p>
@@ -2158,7 +2168,7 @@
         </w:tc>
         <w:tc>
           <w:tcPr>
-            <w:tcW w:type="dxa" w:w="2409"/>
+            <w:tcW w:type="dxa" w:w="2551"/>
             <w:shd w:val="clear" w:color="auto" w:fill="F5F0E8"/>
           </w:tcPr>
           <w:p>
@@ -2180,7 +2190,7 @@
         </w:tc>
         <w:tc>
           <w:tcPr>
-            <w:tcW w:type="dxa" w:w="2409"/>
+            <w:tcW w:type="dxa" w:w="2551"/>
             <w:shd w:val="clear" w:color="auto" w:fill="F5F0E8"/>
           </w:tcPr>
           <w:p>
@@ -2202,7 +2212,7 @@
         </w:tc>
         <w:tc>
           <w:tcPr>
-            <w:tcW w:type="dxa" w:w="2409"/>
+            <w:tcW w:type="dxa" w:w="2551"/>
             <w:shd w:val="clear" w:color="auto" w:fill="F5F0E8"/>
           </w:tcPr>
           <w:p>
@@ -2226,7 +2236,7 @@
       <w:tr>
         <w:tc>
           <w:tcPr>
-            <w:tcW w:type="dxa" w:w="2409"/>
+            <w:tcW w:type="dxa" w:w="2551"/>
             <w:shd w:val="clear" w:color="auto" w:fill="FFFFFF"/>
           </w:tcPr>
           <w:p>
@@ -2248,7 +2258,7 @@
         </w:tc>
         <w:tc>
           <w:tcPr>
-            <w:tcW w:type="dxa" w:w="2409"/>
+            <w:tcW w:type="dxa" w:w="2551"/>
             <w:shd w:val="clear" w:color="auto" w:fill="FFFFFF"/>
           </w:tcPr>
           <w:p>
@@ -2270,7 +2280,7 @@
         </w:tc>
         <w:tc>
           <w:tcPr>
-            <w:tcW w:type="dxa" w:w="2409"/>
+            <w:tcW w:type="dxa" w:w="2551"/>
             <w:shd w:val="clear" w:color="auto" w:fill="FFFFFF"/>
           </w:tcPr>
           <w:p>
@@ -2292,7 +2302,7 @@
         </w:tc>
         <w:tc>
           <w:tcPr>
-            <w:tcW w:type="dxa" w:w="2409"/>
+            <w:tcW w:type="dxa" w:w="2551"/>
             <w:shd w:val="clear" w:color="auto" w:fill="FFFFFF"/>
           </w:tcPr>
           <w:p>
@@ -2316,7 +2326,7 @@
       <w:tr>
         <w:tc>
           <w:tcPr>
-            <w:tcW w:type="dxa" w:w="2409"/>
+            <w:tcW w:type="dxa" w:w="2551"/>
             <w:shd w:val="clear" w:color="auto" w:fill="F5F0E8"/>
           </w:tcPr>
           <w:p>
@@ -2338,7 +2348,7 @@
         </w:tc>
         <w:tc>
           <w:tcPr>
-            <w:tcW w:type="dxa" w:w="2409"/>
+            <w:tcW w:type="dxa" w:w="2551"/>
             <w:shd w:val="clear" w:color="auto" w:fill="F5F0E8"/>
           </w:tcPr>
           <w:p>
@@ -2360,7 +2370,7 @@
         </w:tc>
         <w:tc>
           <w:tcPr>
-            <w:tcW w:type="dxa" w:w="2409"/>
+            <w:tcW w:type="dxa" w:w="2551"/>
             <w:shd w:val="clear" w:color="auto" w:fill="F5F0E8"/>
           </w:tcPr>
           <w:p>
@@ -2382,7 +2392,7 @@
         </w:tc>
         <w:tc>
           <w:tcPr>
-            <w:tcW w:type="dxa" w:w="2409"/>
+            <w:tcW w:type="dxa" w:w="2551"/>
             <w:shd w:val="clear" w:color="auto" w:fill="F5F0E8"/>
           </w:tcPr>
           <w:p>
@@ -2406,7 +2416,7 @@
       <w:tr>
         <w:tc>
           <w:tcPr>
-            <w:tcW w:type="dxa" w:w="2409"/>
+            <w:tcW w:type="dxa" w:w="2551"/>
             <w:shd w:val="clear" w:color="auto" w:fill="FFFFFF"/>
           </w:tcPr>
           <w:p>
@@ -2428,7 +2438,7 @@
         </w:tc>
         <w:tc>
           <w:tcPr>
-            <w:tcW w:type="dxa" w:w="2409"/>
+            <w:tcW w:type="dxa" w:w="2551"/>
             <w:shd w:val="clear" w:color="auto" w:fill="FFFFFF"/>
           </w:tcPr>
           <w:p>
@@ -2450,7 +2460,7 @@
         </w:tc>
         <w:tc>
           <w:tcPr>
-            <w:tcW w:type="dxa" w:w="2409"/>
+            <w:tcW w:type="dxa" w:w="2551"/>
             <w:shd w:val="clear" w:color="auto" w:fill="FFFFFF"/>
           </w:tcPr>
           <w:p>
@@ -2472,7 +2482,7 @@
         </w:tc>
         <w:tc>
           <w:tcPr>
-            <w:tcW w:type="dxa" w:w="2409"/>
+            <w:tcW w:type="dxa" w:w="2551"/>
             <w:shd w:val="clear" w:color="auto" w:fill="FFFFFF"/>
           </w:tcPr>
           <w:p>
@@ -2496,7 +2506,7 @@
       <w:tr>
         <w:tc>
           <w:tcPr>
-            <w:tcW w:type="dxa" w:w="2409"/>
+            <w:tcW w:type="dxa" w:w="2551"/>
             <w:shd w:val="clear" w:color="auto" w:fill="F5F0E8"/>
           </w:tcPr>
           <w:p>
@@ -2518,7 +2528,7 @@
         </w:tc>
         <w:tc>
           <w:tcPr>
-            <w:tcW w:type="dxa" w:w="2409"/>
+            <w:tcW w:type="dxa" w:w="2551"/>
             <w:shd w:val="clear" w:color="auto" w:fill="F5F0E8"/>
           </w:tcPr>
           <w:p>
@@ -2540,7 +2550,7 @@
         </w:tc>
         <w:tc>
           <w:tcPr>
-            <w:tcW w:type="dxa" w:w="2409"/>
+            <w:tcW w:type="dxa" w:w="2551"/>
             <w:shd w:val="clear" w:color="auto" w:fill="F5F0E8"/>
           </w:tcPr>
           <w:p>
@@ -2562,7 +2572,7 @@
         </w:tc>
         <w:tc>
           <w:tcPr>
-            <w:tcW w:type="dxa" w:w="2409"/>
+            <w:tcW w:type="dxa" w:w="2551"/>
             <w:shd w:val="clear" w:color="auto" w:fill="F5F0E8"/>
           </w:tcPr>
           <w:p>
@@ -2586,7 +2596,7 @@
       <w:tr>
         <w:tc>
           <w:tcPr>
-            <w:tcW w:type="dxa" w:w="2409"/>
+            <w:tcW w:type="dxa" w:w="2551"/>
             <w:shd w:val="clear" w:color="auto" w:fill="FFFFFF"/>
           </w:tcPr>
           <w:p>
@@ -2608,7 +2618,7 @@
         </w:tc>
         <w:tc>
           <w:tcPr>
-            <w:tcW w:type="dxa" w:w="2409"/>
+            <w:tcW w:type="dxa" w:w="2551"/>
             <w:shd w:val="clear" w:color="auto" w:fill="FFFFFF"/>
           </w:tcPr>
           <w:p>
@@ -2630,7 +2640,7 @@
         </w:tc>
         <w:tc>
           <w:tcPr>
-            <w:tcW w:type="dxa" w:w="2409"/>
+            <w:tcW w:type="dxa" w:w="2551"/>
             <w:shd w:val="clear" w:color="auto" w:fill="FFFFFF"/>
           </w:tcPr>
           <w:p>
@@ -2652,7 +2662,7 @@
         </w:tc>
         <w:tc>
           <w:tcPr>
-            <w:tcW w:type="dxa" w:w="2409"/>
+            <w:tcW w:type="dxa" w:w="2551"/>
             <w:shd w:val="clear" w:color="auto" w:fill="FFFFFF"/>
           </w:tcPr>
           <w:p>
@@ -2676,7 +2686,7 @@
       <w:tr>
         <w:tc>
           <w:tcPr>
-            <w:tcW w:type="dxa" w:w="2409"/>
+            <w:tcW w:type="dxa" w:w="2551"/>
             <w:shd w:val="clear" w:color="auto" w:fill="F5F0E8"/>
           </w:tcPr>
           <w:p>
@@ -2698,7 +2708,7 @@
         </w:tc>
         <w:tc>
           <w:tcPr>
-            <w:tcW w:type="dxa" w:w="2409"/>
+            <w:tcW w:type="dxa" w:w="2551"/>
             <w:shd w:val="clear" w:color="auto" w:fill="F5F0E8"/>
           </w:tcPr>
           <w:p>
@@ -2720,7 +2730,7 @@
         </w:tc>
         <w:tc>
           <w:tcPr>
-            <w:tcW w:type="dxa" w:w="2409"/>
+            <w:tcW w:type="dxa" w:w="2551"/>
             <w:shd w:val="clear" w:color="auto" w:fill="F5F0E8"/>
           </w:tcPr>
           <w:p>
@@ -2742,7 +2752,7 @@
         </w:tc>
         <w:tc>
           <w:tcPr>
-            <w:tcW w:type="dxa" w:w="2409"/>
+            <w:tcW w:type="dxa" w:w="2551"/>
             <w:shd w:val="clear" w:color="auto" w:fill="F5F0E8"/>
           </w:tcPr>
           <w:p>
@@ -2766,7 +2776,7 @@
       <w:tr>
         <w:tc>
           <w:tcPr>
-            <w:tcW w:type="dxa" w:w="2409"/>
+            <w:tcW w:type="dxa" w:w="2551"/>
             <w:shd w:val="clear" w:color="auto" w:fill="FFFFFF"/>
           </w:tcPr>
           <w:p>
@@ -2788,7 +2798,7 @@
         </w:tc>
         <w:tc>
           <w:tcPr>
-            <w:tcW w:type="dxa" w:w="2409"/>
+            <w:tcW w:type="dxa" w:w="2551"/>
             <w:shd w:val="clear" w:color="auto" w:fill="FFFFFF"/>
           </w:tcPr>
           <w:p>
@@ -2809,7 +2819,7 @@
         </w:tc>
         <w:tc>
           <w:tcPr>
-            <w:tcW w:type="dxa" w:w="2409"/>
+            <w:tcW w:type="dxa" w:w="2551"/>
             <w:shd w:val="clear" w:color="auto" w:fill="FFFFFF"/>
           </w:tcPr>
           <w:p>
@@ -2831,7 +2841,7 @@
         </w:tc>
         <w:tc>
           <w:tcPr>
-            <w:tcW w:type="dxa" w:w="2409"/>
+            <w:tcW w:type="dxa" w:w="2551"/>
             <w:shd w:val="clear" w:color="auto" w:fill="FFFFFF"/>
           </w:tcPr>
           <w:p>
@@ -2899,7 +2909,7 @@
       <w:r>
         <w:drawing>
           <wp:inline xmlns:a="http://schemas.openxmlformats.org/drawingml/2006/main" xmlns:pic="http://schemas.openxmlformats.org/drawingml/2006/picture">
-            <wp:extent cx="5400000" cy="2939098"/>
+            <wp:extent cx="3060000" cy="1665489"/>
             <wp:docPr id="2" name="Picture 2"/>
             <wp:cNvGraphicFramePr>
               <a:graphicFrameLocks noChangeAspect="1"/>
@@ -2920,7 +2930,7 @@
                   <pic:spPr>
                     <a:xfrm>
                       <a:off x="0" y="0"/>
-                      <a:ext cx="5400000" cy="2939098"/>
+                      <a:ext cx="3060000" cy="1665489"/>
                     </a:xfrm>
                     <a:prstGeom prst="rect"/>
                   </pic:spPr>
@@ -3038,14 +3048,14 @@
         <w:tblLook w:firstColumn="1" w:firstRow="1" w:lastColumn="0" w:lastRow="0" w:noHBand="0" w:noVBand="1" w:val="04A0"/>
       </w:tblPr>
       <w:tblGrid>
-        <w:gridCol w:w="3213"/>
-        <w:gridCol w:w="3213"/>
-        <w:gridCol w:w="3213"/>
+        <w:gridCol w:w="3402"/>
+        <w:gridCol w:w="3402"/>
+        <w:gridCol w:w="3402"/>
       </w:tblGrid>
       <w:tr>
         <w:tc>
           <w:tcPr>
-            <w:tcW w:type="dxa" w:w="3213"/>
+            <w:tcW w:type="dxa" w:w="3402"/>
             <w:shd w:val="clear" w:color="auto" w:fill="C99347"/>
           </w:tcPr>
           <w:p>
@@ -3067,7 +3077,7 @@
         </w:tc>
         <w:tc>
           <w:tcPr>
-            <w:tcW w:type="dxa" w:w="3213"/>
+            <w:tcW w:type="dxa" w:w="3402"/>
             <w:shd w:val="clear" w:color="auto" w:fill="C99347"/>
           </w:tcPr>
           <w:p>
@@ -3089,7 +3099,7 @@
         </w:tc>
         <w:tc>
           <w:tcPr>
-            <w:tcW w:type="dxa" w:w="3213"/>
+            <w:tcW w:type="dxa" w:w="3402"/>
             <w:shd w:val="clear" w:color="auto" w:fill="C99347"/>
           </w:tcPr>
           <w:p>
@@ -3113,7 +3123,7 @@
       <w:tr>
         <w:tc>
           <w:tcPr>
-            <w:tcW w:type="dxa" w:w="3213"/>
+            <w:tcW w:type="dxa" w:w="3402"/>
             <w:shd w:val="clear" w:color="auto" w:fill="FFFFFF"/>
           </w:tcPr>
           <w:p>
@@ -3135,7 +3145,7 @@
         </w:tc>
         <w:tc>
           <w:tcPr>
-            <w:tcW w:type="dxa" w:w="3213"/>
+            <w:tcW w:type="dxa" w:w="3402"/>
             <w:shd w:val="clear" w:color="auto" w:fill="FFFFFF"/>
           </w:tcPr>
           <w:p>
@@ -3157,7 +3167,7 @@
         </w:tc>
         <w:tc>
           <w:tcPr>
-            <w:tcW w:type="dxa" w:w="3213"/>
+            <w:tcW w:type="dxa" w:w="3402"/>
             <w:shd w:val="clear" w:color="auto" w:fill="FFFFFF"/>
           </w:tcPr>
           <w:p>
@@ -3181,7 +3191,7 @@
       <w:tr>
         <w:tc>
           <w:tcPr>
-            <w:tcW w:type="dxa" w:w="3213"/>
+            <w:tcW w:type="dxa" w:w="3402"/>
             <w:shd w:val="clear" w:color="auto" w:fill="F5F0E8"/>
           </w:tcPr>
           <w:p>
@@ -3203,7 +3213,7 @@
         </w:tc>
         <w:tc>
           <w:tcPr>
-            <w:tcW w:type="dxa" w:w="3213"/>
+            <w:tcW w:type="dxa" w:w="3402"/>
             <w:shd w:val="clear" w:color="auto" w:fill="F5F0E8"/>
           </w:tcPr>
           <w:p>
@@ -3225,7 +3235,7 @@
         </w:tc>
         <w:tc>
           <w:tcPr>
-            <w:tcW w:type="dxa" w:w="3213"/>
+            <w:tcW w:type="dxa" w:w="3402"/>
             <w:shd w:val="clear" w:color="auto" w:fill="F5F0E8"/>
           </w:tcPr>
           <w:p>
@@ -3249,7 +3259,7 @@
       <w:tr>
         <w:tc>
           <w:tcPr>
-            <w:tcW w:type="dxa" w:w="3213"/>
+            <w:tcW w:type="dxa" w:w="3402"/>
             <w:shd w:val="clear" w:color="auto" w:fill="FFFFFF"/>
           </w:tcPr>
           <w:p>
@@ -3271,7 +3281,7 @@
         </w:tc>
         <w:tc>
           <w:tcPr>
-            <w:tcW w:type="dxa" w:w="3213"/>
+            <w:tcW w:type="dxa" w:w="3402"/>
             <w:shd w:val="clear" w:color="auto" w:fill="FFFFFF"/>
           </w:tcPr>
           <w:p>
@@ -3293,7 +3303,7 @@
         </w:tc>
         <w:tc>
           <w:tcPr>
-            <w:tcW w:type="dxa" w:w="3213"/>
+            <w:tcW w:type="dxa" w:w="3402"/>
             <w:shd w:val="clear" w:color="auto" w:fill="FFFFFF"/>
           </w:tcPr>
           <w:p>
@@ -3317,7 +3327,7 @@
       <w:tr>
         <w:tc>
           <w:tcPr>
-            <w:tcW w:type="dxa" w:w="3213"/>
+            <w:tcW w:type="dxa" w:w="3402"/>
             <w:shd w:val="clear" w:color="auto" w:fill="F5F0E8"/>
           </w:tcPr>
           <w:p>
@@ -3339,7 +3349,7 @@
         </w:tc>
         <w:tc>
           <w:tcPr>
-            <w:tcW w:type="dxa" w:w="3213"/>
+            <w:tcW w:type="dxa" w:w="3402"/>
             <w:shd w:val="clear" w:color="auto" w:fill="F5F0E8"/>
           </w:tcPr>
           <w:p>
@@ -3361,7 +3371,7 @@
         </w:tc>
         <w:tc>
           <w:tcPr>
-            <w:tcW w:type="dxa" w:w="3213"/>
+            <w:tcW w:type="dxa" w:w="3402"/>
             <w:shd w:val="clear" w:color="auto" w:fill="F5F0E8"/>
           </w:tcPr>
           <w:p>
@@ -3385,7 +3395,7 @@
       <w:tr>
         <w:tc>
           <w:tcPr>
-            <w:tcW w:type="dxa" w:w="3213"/>
+            <w:tcW w:type="dxa" w:w="3402"/>
             <w:shd w:val="clear" w:color="auto" w:fill="FFFFFF"/>
           </w:tcPr>
           <w:p>
@@ -3407,7 +3417,7 @@
         </w:tc>
         <w:tc>
           <w:tcPr>
-            <w:tcW w:type="dxa" w:w="3213"/>
+            <w:tcW w:type="dxa" w:w="3402"/>
             <w:shd w:val="clear" w:color="auto" w:fill="FFFFFF"/>
           </w:tcPr>
           <w:p>
@@ -3429,7 +3439,7 @@
         </w:tc>
         <w:tc>
           <w:tcPr>
-            <w:tcW w:type="dxa" w:w="3213"/>
+            <w:tcW w:type="dxa" w:w="3402"/>
             <w:shd w:val="clear" w:color="auto" w:fill="FFFFFF"/>
           </w:tcPr>
           <w:p>
@@ -3453,7 +3463,7 @@
       <w:tr>
         <w:tc>
           <w:tcPr>
-            <w:tcW w:type="dxa" w:w="3213"/>
+            <w:tcW w:type="dxa" w:w="3402"/>
             <w:shd w:val="clear" w:color="auto" w:fill="F5F0E8"/>
           </w:tcPr>
           <w:p>
@@ -3475,7 +3485,7 @@
         </w:tc>
         <w:tc>
           <w:tcPr>
-            <w:tcW w:type="dxa" w:w="3213"/>
+            <w:tcW w:type="dxa" w:w="3402"/>
             <w:shd w:val="clear" w:color="auto" w:fill="F5F0E8"/>
           </w:tcPr>
           <w:p>
@@ -3497,7 +3507,7 @@
         </w:tc>
         <w:tc>
           <w:tcPr>
-            <w:tcW w:type="dxa" w:w="3213"/>
+            <w:tcW w:type="dxa" w:w="3402"/>
             <w:shd w:val="clear" w:color="auto" w:fill="F5F0E8"/>
           </w:tcPr>
           <w:p>
@@ -3521,7 +3531,7 @@
       <w:tr>
         <w:tc>
           <w:tcPr>
-            <w:tcW w:type="dxa" w:w="3213"/>
+            <w:tcW w:type="dxa" w:w="3402"/>
             <w:shd w:val="clear" w:color="auto" w:fill="FFFFFF"/>
           </w:tcPr>
           <w:p>
@@ -3543,7 +3553,7 @@
         </w:tc>
         <w:tc>
           <w:tcPr>
-            <w:tcW w:type="dxa" w:w="3213"/>
+            <w:tcW w:type="dxa" w:w="3402"/>
             <w:shd w:val="clear" w:color="auto" w:fill="FFFFFF"/>
           </w:tcPr>
           <w:p>
@@ -3565,7 +3575,7 @@
         </w:tc>
         <w:tc>
           <w:tcPr>
-            <w:tcW w:type="dxa" w:w="3213"/>
+            <w:tcW w:type="dxa" w:w="3402"/>
             <w:shd w:val="clear" w:color="auto" w:fill="FFFFFF"/>
           </w:tcPr>
           <w:p>
@@ -3589,7 +3599,7 @@
       <w:tr>
         <w:tc>
           <w:tcPr>
-            <w:tcW w:type="dxa" w:w="3213"/>
+            <w:tcW w:type="dxa" w:w="3402"/>
             <w:shd w:val="clear" w:color="auto" w:fill="F5F0E8"/>
           </w:tcPr>
           <w:p>
@@ -3611,7 +3621,7 @@
         </w:tc>
         <w:tc>
           <w:tcPr>
-            <w:tcW w:type="dxa" w:w="3213"/>
+            <w:tcW w:type="dxa" w:w="3402"/>
             <w:shd w:val="clear" w:color="auto" w:fill="F5F0E8"/>
           </w:tcPr>
           <w:p>
@@ -3633,7 +3643,7 @@
         </w:tc>
         <w:tc>
           <w:tcPr>
-            <w:tcW w:type="dxa" w:w="3213"/>
+            <w:tcW w:type="dxa" w:w="3402"/>
             <w:shd w:val="clear" w:color="auto" w:fill="F5F0E8"/>
           </w:tcPr>
           <w:p>
@@ -3657,7 +3667,7 @@
       <w:tr>
         <w:tc>
           <w:tcPr>
-            <w:tcW w:type="dxa" w:w="3213"/>
+            <w:tcW w:type="dxa" w:w="3402"/>
             <w:shd w:val="clear" w:color="auto" w:fill="FFFFFF"/>
           </w:tcPr>
           <w:p>
@@ -3679,7 +3689,7 @@
         </w:tc>
         <w:tc>
           <w:tcPr>
-            <w:tcW w:type="dxa" w:w="3213"/>
+            <w:tcW w:type="dxa" w:w="3402"/>
             <w:shd w:val="clear" w:color="auto" w:fill="FFFFFF"/>
           </w:tcPr>
           <w:p>
@@ -3701,7 +3711,7 @@
         </w:tc>
         <w:tc>
           <w:tcPr>
-            <w:tcW w:type="dxa" w:w="3213"/>
+            <w:tcW w:type="dxa" w:w="3402"/>
             <w:shd w:val="clear" w:color="auto" w:fill="FFFFFF"/>
           </w:tcPr>
           <w:p>
@@ -3725,7 +3735,7 @@
       <w:tr>
         <w:tc>
           <w:tcPr>
-            <w:tcW w:type="dxa" w:w="3213"/>
+            <w:tcW w:type="dxa" w:w="3402"/>
             <w:shd w:val="clear" w:color="auto" w:fill="F5F0E8"/>
           </w:tcPr>
           <w:p>
@@ -3747,7 +3757,7 @@
         </w:tc>
         <w:tc>
           <w:tcPr>
-            <w:tcW w:type="dxa" w:w="3213"/>
+            <w:tcW w:type="dxa" w:w="3402"/>
             <w:shd w:val="clear" w:color="auto" w:fill="F5F0E8"/>
           </w:tcPr>
           <w:p>
@@ -3769,7 +3779,7 @@
         </w:tc>
         <w:tc>
           <w:tcPr>
-            <w:tcW w:type="dxa" w:w="3213"/>
+            <w:tcW w:type="dxa" w:w="3402"/>
             <w:shd w:val="clear" w:color="auto" w:fill="F5F0E8"/>
           </w:tcPr>
           <w:p>
@@ -3793,7 +3803,7 @@
       <w:tr>
         <w:tc>
           <w:tcPr>
-            <w:tcW w:type="dxa" w:w="3213"/>
+            <w:tcW w:type="dxa" w:w="3402"/>
             <w:shd w:val="clear" w:color="auto" w:fill="FFFFFF"/>
           </w:tcPr>
           <w:p>
@@ -3815,7 +3825,7 @@
         </w:tc>
         <w:tc>
           <w:tcPr>
-            <w:tcW w:type="dxa" w:w="3213"/>
+            <w:tcW w:type="dxa" w:w="3402"/>
             <w:shd w:val="clear" w:color="auto" w:fill="FFFFFF"/>
           </w:tcPr>
           <w:p>
@@ -3837,7 +3847,7 @@
         </w:tc>
         <w:tc>
           <w:tcPr>
-            <w:tcW w:type="dxa" w:w="3213"/>
+            <w:tcW w:type="dxa" w:w="3402"/>
             <w:shd w:val="clear" w:color="auto" w:fill="FFFFFF"/>
           </w:tcPr>
           <w:p>
@@ -4004,18 +4014,18 @@
         <w:tblLook w:firstColumn="1" w:firstRow="1" w:lastColumn="0" w:lastRow="0" w:noHBand="0" w:noVBand="1" w:val="04A0"/>
       </w:tblPr>
       <w:tblGrid>
-        <w:gridCol w:w="1377"/>
-        <w:gridCol w:w="1377"/>
-        <w:gridCol w:w="1377"/>
-        <w:gridCol w:w="1377"/>
-        <w:gridCol w:w="1377"/>
-        <w:gridCol w:w="1377"/>
-        <w:gridCol w:w="1377"/>
+        <w:gridCol w:w="1458"/>
+        <w:gridCol w:w="1458"/>
+        <w:gridCol w:w="1458"/>
+        <w:gridCol w:w="1458"/>
+        <w:gridCol w:w="1458"/>
+        <w:gridCol w:w="1458"/>
+        <w:gridCol w:w="1458"/>
       </w:tblGrid>
       <w:tr>
         <w:tc>
           <w:tcPr>
-            <w:tcW w:type="dxa" w:w="1377"/>
+            <w:tcW w:type="dxa" w:w="1458"/>
             <w:shd w:val="clear" w:color="auto" w:fill="C99347"/>
           </w:tcPr>
           <w:p>
@@ -4037,7 +4047,7 @@
         </w:tc>
         <w:tc>
           <w:tcPr>
-            <w:tcW w:type="dxa" w:w="1377"/>
+            <w:tcW w:type="dxa" w:w="1458"/>
             <w:shd w:val="clear" w:color="auto" w:fill="C99347"/>
           </w:tcPr>
           <w:p>
@@ -4059,7 +4069,7 @@
         </w:tc>
         <w:tc>
           <w:tcPr>
-            <w:tcW w:type="dxa" w:w="1377"/>
+            <w:tcW w:type="dxa" w:w="1458"/>
             <w:shd w:val="clear" w:color="auto" w:fill="C99347"/>
           </w:tcPr>
           <w:p>
@@ -4081,7 +4091,7 @@
         </w:tc>
         <w:tc>
           <w:tcPr>
-            <w:tcW w:type="dxa" w:w="1377"/>
+            <w:tcW w:type="dxa" w:w="1458"/>
             <w:shd w:val="clear" w:color="auto" w:fill="C99347"/>
           </w:tcPr>
           <w:p>
@@ -4103,7 +4113,7 @@
         </w:tc>
         <w:tc>
           <w:tcPr>
-            <w:tcW w:type="dxa" w:w="1377"/>
+            <w:tcW w:type="dxa" w:w="1458"/>
             <w:shd w:val="clear" w:color="auto" w:fill="C99347"/>
           </w:tcPr>
           <w:p>
@@ -4125,7 +4135,7 @@
         </w:tc>
         <w:tc>
           <w:tcPr>
-            <w:tcW w:type="dxa" w:w="1377"/>
+            <w:tcW w:type="dxa" w:w="1458"/>
             <w:shd w:val="clear" w:color="auto" w:fill="C99347"/>
           </w:tcPr>
           <w:p>
@@ -4147,7 +4157,7 @@
         </w:tc>
         <w:tc>
           <w:tcPr>
-            <w:tcW w:type="dxa" w:w="1377"/>
+            <w:tcW w:type="dxa" w:w="1458"/>
             <w:shd w:val="clear" w:color="auto" w:fill="C99347"/>
           </w:tcPr>
           <w:p>
@@ -4171,7 +4181,7 @@
       <w:tr>
         <w:tc>
           <w:tcPr>
-            <w:tcW w:type="dxa" w:w="1377"/>
+            <w:tcW w:type="dxa" w:w="1458"/>
             <w:shd w:val="clear" w:color="auto" w:fill="FFFFFF"/>
           </w:tcPr>
           <w:p>
@@ -4193,7 +4203,7 @@
         </w:tc>
         <w:tc>
           <w:tcPr>
-            <w:tcW w:type="dxa" w:w="1377"/>
+            <w:tcW w:type="dxa" w:w="1458"/>
             <w:shd w:val="clear" w:color="auto" w:fill="FFFFFF"/>
           </w:tcPr>
           <w:p>
@@ -4215,7 +4225,7 @@
         </w:tc>
         <w:tc>
           <w:tcPr>
-            <w:tcW w:type="dxa" w:w="1377"/>
+            <w:tcW w:type="dxa" w:w="1458"/>
             <w:shd w:val="clear" w:color="auto" w:fill="FFFFFF"/>
           </w:tcPr>
           <w:p>
@@ -4237,7 +4247,7 @@
         </w:tc>
         <w:tc>
           <w:tcPr>
-            <w:tcW w:type="dxa" w:w="1377"/>
+            <w:tcW w:type="dxa" w:w="1458"/>
             <w:shd w:val="clear" w:color="auto" w:fill="FFFFFF"/>
           </w:tcPr>
           <w:p>
@@ -4259,7 +4269,7 @@
         </w:tc>
         <w:tc>
           <w:tcPr>
-            <w:tcW w:type="dxa" w:w="1377"/>
+            <w:tcW w:type="dxa" w:w="1458"/>
             <w:shd w:val="clear" w:color="auto" w:fill="FFFFFF"/>
           </w:tcPr>
           <w:p>
@@ -4281,7 +4291,7 @@
         </w:tc>
         <w:tc>
           <w:tcPr>
-            <w:tcW w:type="dxa" w:w="1377"/>
+            <w:tcW w:type="dxa" w:w="1458"/>
             <w:shd w:val="clear" w:color="auto" w:fill="FFFFFF"/>
           </w:tcPr>
           <w:p>
@@ -4303,7 +4313,7 @@
         </w:tc>
         <w:tc>
           <w:tcPr>
-            <w:tcW w:type="dxa" w:w="1377"/>
+            <w:tcW w:type="dxa" w:w="1458"/>
             <w:shd w:val="clear" w:color="auto" w:fill="FFFFFF"/>
           </w:tcPr>
           <w:p>
@@ -4327,7 +4337,7 @@
       <w:tr>
         <w:tc>
           <w:tcPr>
-            <w:tcW w:type="dxa" w:w="1377"/>
+            <w:tcW w:type="dxa" w:w="1458"/>
             <w:shd w:val="clear" w:color="auto" w:fill="F5F0E8"/>
           </w:tcPr>
           <w:p>
@@ -4349,7 +4359,7 @@
         </w:tc>
         <w:tc>
           <w:tcPr>
-            <w:tcW w:type="dxa" w:w="1377"/>
+            <w:tcW w:type="dxa" w:w="1458"/>
             <w:shd w:val="clear" w:color="auto" w:fill="F5F0E8"/>
           </w:tcPr>
           <w:p>
@@ -4371,7 +4381,7 @@
         </w:tc>
         <w:tc>
           <w:tcPr>
-            <w:tcW w:type="dxa" w:w="1377"/>
+            <w:tcW w:type="dxa" w:w="1458"/>
             <w:shd w:val="clear" w:color="auto" w:fill="F5F0E8"/>
           </w:tcPr>
           <w:p>
@@ -4393,7 +4403,7 @@
         </w:tc>
         <w:tc>
           <w:tcPr>
-            <w:tcW w:type="dxa" w:w="1377"/>
+            <w:tcW w:type="dxa" w:w="1458"/>
             <w:shd w:val="clear" w:color="auto" w:fill="F5F0E8"/>
           </w:tcPr>
           <w:p>
@@ -4415,7 +4425,7 @@
         </w:tc>
         <w:tc>
           <w:tcPr>
-            <w:tcW w:type="dxa" w:w="1377"/>
+            <w:tcW w:type="dxa" w:w="1458"/>
             <w:shd w:val="clear" w:color="auto" w:fill="F5F0E8"/>
           </w:tcPr>
           <w:p>
@@ -4437,7 +4447,7 @@
         </w:tc>
         <w:tc>
           <w:tcPr>
-            <w:tcW w:type="dxa" w:w="1377"/>
+            <w:tcW w:type="dxa" w:w="1458"/>
             <w:shd w:val="clear" w:color="auto" w:fill="F5F0E8"/>
           </w:tcPr>
           <w:p>
@@ -4459,7 +4469,7 @@
         </w:tc>
         <w:tc>
           <w:tcPr>
-            <w:tcW w:type="dxa" w:w="1377"/>
+            <w:tcW w:type="dxa" w:w="1458"/>
             <w:shd w:val="clear" w:color="auto" w:fill="F5F0E8"/>
           </w:tcPr>
           <w:p>
@@ -4483,7 +4493,7 @@
       <w:tr>
         <w:tc>
           <w:tcPr>
-            <w:tcW w:type="dxa" w:w="1377"/>
+            <w:tcW w:type="dxa" w:w="1458"/>
             <w:shd w:val="clear" w:color="auto" w:fill="FFFFFF"/>
           </w:tcPr>
           <w:p>
@@ -4505,7 +4515,7 @@
         </w:tc>
         <w:tc>
           <w:tcPr>
-            <w:tcW w:type="dxa" w:w="1377"/>
+            <w:tcW w:type="dxa" w:w="1458"/>
             <w:shd w:val="clear" w:color="auto" w:fill="FFFFFF"/>
           </w:tcPr>
           <w:p>
@@ -4527,7 +4537,7 @@
         </w:tc>
         <w:tc>
           <w:tcPr>
-            <w:tcW w:type="dxa" w:w="1377"/>
+            <w:tcW w:type="dxa" w:w="1458"/>
             <w:shd w:val="clear" w:color="auto" w:fill="FFFFFF"/>
           </w:tcPr>
           <w:p>
@@ -4549,7 +4559,7 @@
         </w:tc>
         <w:tc>
           <w:tcPr>
-            <w:tcW w:type="dxa" w:w="1377"/>
+            <w:tcW w:type="dxa" w:w="1458"/>
             <w:shd w:val="clear" w:color="auto" w:fill="FFFFFF"/>
           </w:tcPr>
           <w:p>
@@ -4571,7 +4581,7 @@
         </w:tc>
         <w:tc>
           <w:tcPr>
-            <w:tcW w:type="dxa" w:w="1377"/>
+            <w:tcW w:type="dxa" w:w="1458"/>
             <w:shd w:val="clear" w:color="auto" w:fill="FFFFFF"/>
           </w:tcPr>
           <w:p>
@@ -4593,7 +4603,7 @@
         </w:tc>
         <w:tc>
           <w:tcPr>
-            <w:tcW w:type="dxa" w:w="1377"/>
+            <w:tcW w:type="dxa" w:w="1458"/>
             <w:shd w:val="clear" w:color="auto" w:fill="FFFFFF"/>
           </w:tcPr>
           <w:p>
@@ -4615,7 +4625,7 @@
         </w:tc>
         <w:tc>
           <w:tcPr>
-            <w:tcW w:type="dxa" w:w="1377"/>
+            <w:tcW w:type="dxa" w:w="1458"/>
             <w:shd w:val="clear" w:color="auto" w:fill="FFFFFF"/>
           </w:tcPr>
           <w:p>
@@ -4639,7 +4649,7 @@
       <w:tr>
         <w:tc>
           <w:tcPr>
-            <w:tcW w:type="dxa" w:w="1377"/>
+            <w:tcW w:type="dxa" w:w="1458"/>
             <w:shd w:val="clear" w:color="auto" w:fill="F5F0E8"/>
           </w:tcPr>
           <w:p>
@@ -4661,7 +4671,7 @@
         </w:tc>
         <w:tc>
           <w:tcPr>
-            <w:tcW w:type="dxa" w:w="1377"/>
+            <w:tcW w:type="dxa" w:w="1458"/>
             <w:shd w:val="clear" w:color="auto" w:fill="F5F0E8"/>
           </w:tcPr>
           <w:p>
@@ -4683,7 +4693,7 @@
         </w:tc>
         <w:tc>
           <w:tcPr>
-            <w:tcW w:type="dxa" w:w="1377"/>
+            <w:tcW w:type="dxa" w:w="1458"/>
             <w:shd w:val="clear" w:color="auto" w:fill="F5F0E8"/>
           </w:tcPr>
           <w:p>
@@ -4705,7 +4715,7 @@
         </w:tc>
         <w:tc>
           <w:tcPr>
-            <w:tcW w:type="dxa" w:w="1377"/>
+            <w:tcW w:type="dxa" w:w="1458"/>
             <w:shd w:val="clear" w:color="auto" w:fill="F5F0E8"/>
           </w:tcPr>
           <w:p>
@@ -4727,7 +4737,7 @@
         </w:tc>
         <w:tc>
           <w:tcPr>
-            <w:tcW w:type="dxa" w:w="1377"/>
+            <w:tcW w:type="dxa" w:w="1458"/>
             <w:shd w:val="clear" w:color="auto" w:fill="F5F0E8"/>
           </w:tcPr>
           <w:p>
@@ -4749,7 +4759,7 @@
         </w:tc>
         <w:tc>
           <w:tcPr>
-            <w:tcW w:type="dxa" w:w="1377"/>
+            <w:tcW w:type="dxa" w:w="1458"/>
             <w:shd w:val="clear" w:color="auto" w:fill="F5F0E8"/>
           </w:tcPr>
           <w:p>
@@ -4771,7 +4781,7 @@
         </w:tc>
         <w:tc>
           <w:tcPr>
-            <w:tcW w:type="dxa" w:w="1377"/>
+            <w:tcW w:type="dxa" w:w="1458"/>
             <w:shd w:val="clear" w:color="auto" w:fill="F5F0E8"/>
           </w:tcPr>
           <w:p>
@@ -4795,7 +4805,7 @@
       <w:tr>
         <w:tc>
           <w:tcPr>
-            <w:tcW w:type="dxa" w:w="1377"/>
+            <w:tcW w:type="dxa" w:w="1458"/>
             <w:shd w:val="clear" w:color="auto" w:fill="FFFFFF"/>
           </w:tcPr>
           <w:p>
@@ -4817,7 +4827,7 @@
         </w:tc>
         <w:tc>
           <w:tcPr>
-            <w:tcW w:type="dxa" w:w="1377"/>
+            <w:tcW w:type="dxa" w:w="1458"/>
             <w:shd w:val="clear" w:color="auto" w:fill="FFFFFF"/>
           </w:tcPr>
           <w:p>
@@ -4839,7 +4849,7 @@
         </w:tc>
         <w:tc>
           <w:tcPr>
-            <w:tcW w:type="dxa" w:w="1377"/>
+            <w:tcW w:type="dxa" w:w="1458"/>
             <w:shd w:val="clear" w:color="auto" w:fill="FFFFFF"/>
           </w:tcPr>
           <w:p>
@@ -4861,7 +4871,7 @@
         </w:tc>
         <w:tc>
           <w:tcPr>
-            <w:tcW w:type="dxa" w:w="1377"/>
+            <w:tcW w:type="dxa" w:w="1458"/>
             <w:shd w:val="clear" w:color="auto" w:fill="FFFFFF"/>
           </w:tcPr>
           <w:p>
@@ -4883,7 +4893,7 @@
         </w:tc>
         <w:tc>
           <w:tcPr>
-            <w:tcW w:type="dxa" w:w="1377"/>
+            <w:tcW w:type="dxa" w:w="1458"/>
             <w:shd w:val="clear" w:color="auto" w:fill="FFFFFF"/>
           </w:tcPr>
           <w:p>
@@ -4905,7 +4915,7 @@
         </w:tc>
         <w:tc>
           <w:tcPr>
-            <w:tcW w:type="dxa" w:w="1377"/>
+            <w:tcW w:type="dxa" w:w="1458"/>
             <w:shd w:val="clear" w:color="auto" w:fill="FFFFFF"/>
           </w:tcPr>
           <w:p>
@@ -4927,7 +4937,7 @@
         </w:tc>
         <w:tc>
           <w:tcPr>
-            <w:tcW w:type="dxa" w:w="1377"/>
+            <w:tcW w:type="dxa" w:w="1458"/>
             <w:shd w:val="clear" w:color="auto" w:fill="FFFFFF"/>
           </w:tcPr>
           <w:p>
@@ -4951,7 +4961,7 @@
       <w:tr>
         <w:tc>
           <w:tcPr>
-            <w:tcW w:type="dxa" w:w="1377"/>
+            <w:tcW w:type="dxa" w:w="1458"/>
             <w:shd w:val="clear" w:color="auto" w:fill="F5F0E8"/>
           </w:tcPr>
           <w:p>
@@ -4973,7 +4983,7 @@
         </w:tc>
         <w:tc>
           <w:tcPr>
-            <w:tcW w:type="dxa" w:w="1377"/>
+            <w:tcW w:type="dxa" w:w="1458"/>
             <w:shd w:val="clear" w:color="auto" w:fill="F5F0E8"/>
           </w:tcPr>
           <w:p>
@@ -4995,7 +5005,7 @@
         </w:tc>
         <w:tc>
           <w:tcPr>
-            <w:tcW w:type="dxa" w:w="1377"/>
+            <w:tcW w:type="dxa" w:w="1458"/>
             <w:shd w:val="clear" w:color="auto" w:fill="F5F0E8"/>
           </w:tcPr>
           <w:p>
@@ -5017,7 +5027,7 @@
         </w:tc>
         <w:tc>
           <w:tcPr>
-            <w:tcW w:type="dxa" w:w="1377"/>
+            <w:tcW w:type="dxa" w:w="1458"/>
             <w:shd w:val="clear" w:color="auto" w:fill="F5F0E8"/>
           </w:tcPr>
           <w:p>
@@ -5039,7 +5049,7 @@
         </w:tc>
         <w:tc>
           <w:tcPr>
-            <w:tcW w:type="dxa" w:w="1377"/>
+            <w:tcW w:type="dxa" w:w="1458"/>
             <w:shd w:val="clear" w:color="auto" w:fill="F5F0E8"/>
           </w:tcPr>
           <w:p>
@@ -5061,7 +5071,7 @@
         </w:tc>
         <w:tc>
           <w:tcPr>
-            <w:tcW w:type="dxa" w:w="1377"/>
+            <w:tcW w:type="dxa" w:w="1458"/>
             <w:shd w:val="clear" w:color="auto" w:fill="F5F0E8"/>
           </w:tcPr>
           <w:p>
@@ -5083,7 +5093,7 @@
         </w:tc>
         <w:tc>
           <w:tcPr>
-            <w:tcW w:type="dxa" w:w="1377"/>
+            <w:tcW w:type="dxa" w:w="1458"/>
             <w:shd w:val="clear" w:color="auto" w:fill="F5F0E8"/>
           </w:tcPr>
           <w:p>
@@ -5107,7 +5117,7 @@
       <w:tr>
         <w:tc>
           <w:tcPr>
-            <w:tcW w:type="dxa" w:w="1377"/>
+            <w:tcW w:type="dxa" w:w="1458"/>
             <w:shd w:val="clear" w:color="auto" w:fill="FFFFFF"/>
           </w:tcPr>
           <w:p>
@@ -5129,7 +5139,7 @@
         </w:tc>
         <w:tc>
           <w:tcPr>
-            <w:tcW w:type="dxa" w:w="1377"/>
+            <w:tcW w:type="dxa" w:w="1458"/>
             <w:shd w:val="clear" w:color="auto" w:fill="FFFFFF"/>
           </w:tcPr>
           <w:p>
@@ -5151,7 +5161,7 @@
         </w:tc>
         <w:tc>
           <w:tcPr>
-            <w:tcW w:type="dxa" w:w="1377"/>
+            <w:tcW w:type="dxa" w:w="1458"/>
             <w:shd w:val="clear" w:color="auto" w:fill="FFFFFF"/>
           </w:tcPr>
           <w:p>
@@ -5173,7 +5183,7 @@
         </w:tc>
         <w:tc>
           <w:tcPr>
-            <w:tcW w:type="dxa" w:w="1377"/>
+            <w:tcW w:type="dxa" w:w="1458"/>
             <w:shd w:val="clear" w:color="auto" w:fill="FFFFFF"/>
           </w:tcPr>
           <w:p>
@@ -5195,7 +5205,7 @@
         </w:tc>
         <w:tc>
           <w:tcPr>
-            <w:tcW w:type="dxa" w:w="1377"/>
+            <w:tcW w:type="dxa" w:w="1458"/>
             <w:shd w:val="clear" w:color="auto" w:fill="FFFFFF"/>
           </w:tcPr>
           <w:p>
@@ -5217,7 +5227,7 @@
         </w:tc>
         <w:tc>
           <w:tcPr>
-            <w:tcW w:type="dxa" w:w="1377"/>
+            <w:tcW w:type="dxa" w:w="1458"/>
             <w:shd w:val="clear" w:color="auto" w:fill="FFFFFF"/>
           </w:tcPr>
           <w:p>
@@ -5239,7 +5249,7 @@
         </w:tc>
         <w:tc>
           <w:tcPr>
-            <w:tcW w:type="dxa" w:w="1377"/>
+            <w:tcW w:type="dxa" w:w="1458"/>
             <w:shd w:val="clear" w:color="auto" w:fill="FFFFFF"/>
           </w:tcPr>
           <w:p>
@@ -5263,7 +5273,7 @@
       <w:tr>
         <w:tc>
           <w:tcPr>
-            <w:tcW w:type="dxa" w:w="1377"/>
+            <w:tcW w:type="dxa" w:w="1458"/>
             <w:shd w:val="clear" w:color="auto" w:fill="F5F0E8"/>
           </w:tcPr>
           <w:p>
@@ -5285,7 +5295,7 @@
         </w:tc>
         <w:tc>
           <w:tcPr>
-            <w:tcW w:type="dxa" w:w="1377"/>
+            <w:tcW w:type="dxa" w:w="1458"/>
             <w:shd w:val="clear" w:color="auto" w:fill="F5F0E8"/>
           </w:tcPr>
           <w:p>
@@ -5307,7 +5317,7 @@
         </w:tc>
         <w:tc>
           <w:tcPr>
-            <w:tcW w:type="dxa" w:w="1377"/>
+            <w:tcW w:type="dxa" w:w="1458"/>
             <w:shd w:val="clear" w:color="auto" w:fill="F5F0E8"/>
           </w:tcPr>
           <w:p>
@@ -5329,7 +5339,7 @@
         </w:tc>
         <w:tc>
           <w:tcPr>
-            <w:tcW w:type="dxa" w:w="1377"/>
+            <w:tcW w:type="dxa" w:w="1458"/>
             <w:shd w:val="clear" w:color="auto" w:fill="F5F0E8"/>
           </w:tcPr>
           <w:p>
@@ -5351,7 +5361,7 @@
         </w:tc>
         <w:tc>
           <w:tcPr>
-            <w:tcW w:type="dxa" w:w="1377"/>
+            <w:tcW w:type="dxa" w:w="1458"/>
             <w:shd w:val="clear" w:color="auto" w:fill="F5F0E8"/>
           </w:tcPr>
           <w:p>
@@ -5373,7 +5383,7 @@
         </w:tc>
         <w:tc>
           <w:tcPr>
-            <w:tcW w:type="dxa" w:w="1377"/>
+            <w:tcW w:type="dxa" w:w="1458"/>
             <w:shd w:val="clear" w:color="auto" w:fill="F5F0E8"/>
           </w:tcPr>
           <w:p>
@@ -5395,7 +5405,7 @@
         </w:tc>
         <w:tc>
           <w:tcPr>
-            <w:tcW w:type="dxa" w:w="1377"/>
+            <w:tcW w:type="dxa" w:w="1458"/>
             <w:shd w:val="clear" w:color="auto" w:fill="F5F0E8"/>
           </w:tcPr>
           <w:p>
@@ -5419,7 +5429,7 @@
       <w:tr>
         <w:tc>
           <w:tcPr>
-            <w:tcW w:type="dxa" w:w="1377"/>
+            <w:tcW w:type="dxa" w:w="1458"/>
             <w:shd w:val="clear" w:color="auto" w:fill="FFFFFF"/>
           </w:tcPr>
           <w:p>
@@ -5441,7 +5451,7 @@
         </w:tc>
         <w:tc>
           <w:tcPr>
-            <w:tcW w:type="dxa" w:w="1377"/>
+            <w:tcW w:type="dxa" w:w="1458"/>
             <w:shd w:val="clear" w:color="auto" w:fill="FFFFFF"/>
           </w:tcPr>
           <w:p>
@@ -5463,7 +5473,7 @@
         </w:tc>
         <w:tc>
           <w:tcPr>
-            <w:tcW w:type="dxa" w:w="1377"/>
+            <w:tcW w:type="dxa" w:w="1458"/>
             <w:shd w:val="clear" w:color="auto" w:fill="FFFFFF"/>
           </w:tcPr>
           <w:p>
@@ -5485,7 +5495,7 @@
         </w:tc>
         <w:tc>
           <w:tcPr>
-            <w:tcW w:type="dxa" w:w="1377"/>
+            <w:tcW w:type="dxa" w:w="1458"/>
             <w:shd w:val="clear" w:color="auto" w:fill="FFFFFF"/>
           </w:tcPr>
           <w:p>
@@ -5507,7 +5517,7 @@
         </w:tc>
         <w:tc>
           <w:tcPr>
-            <w:tcW w:type="dxa" w:w="1377"/>
+            <w:tcW w:type="dxa" w:w="1458"/>
             <w:shd w:val="clear" w:color="auto" w:fill="FFFFFF"/>
           </w:tcPr>
           <w:p>
@@ -5529,7 +5539,7 @@
         </w:tc>
         <w:tc>
           <w:tcPr>
-            <w:tcW w:type="dxa" w:w="1377"/>
+            <w:tcW w:type="dxa" w:w="1458"/>
             <w:shd w:val="clear" w:color="auto" w:fill="FFFFFF"/>
           </w:tcPr>
           <w:p>
@@ -5551,7 +5561,7 @@
         </w:tc>
         <w:tc>
           <w:tcPr>
-            <w:tcW w:type="dxa" w:w="1377"/>
+            <w:tcW w:type="dxa" w:w="1458"/>
             <w:shd w:val="clear" w:color="auto" w:fill="FFFFFF"/>
           </w:tcPr>
           <w:p>
@@ -5575,7 +5585,7 @@
       <w:tr>
         <w:tc>
           <w:tcPr>
-            <w:tcW w:type="dxa" w:w="1377"/>
+            <w:tcW w:type="dxa" w:w="1458"/>
             <w:shd w:val="clear" w:color="auto" w:fill="F5F0E8"/>
           </w:tcPr>
           <w:p>
@@ -5597,7 +5607,7 @@
         </w:tc>
         <w:tc>
           <w:tcPr>
-            <w:tcW w:type="dxa" w:w="1377"/>
+            <w:tcW w:type="dxa" w:w="1458"/>
             <w:shd w:val="clear" w:color="auto" w:fill="F5F0E8"/>
           </w:tcPr>
           <w:p>
@@ -5619,7 +5629,7 @@
         </w:tc>
         <w:tc>
           <w:tcPr>
-            <w:tcW w:type="dxa" w:w="1377"/>
+            <w:tcW w:type="dxa" w:w="1458"/>
             <w:shd w:val="clear" w:color="auto" w:fill="F5F0E8"/>
           </w:tcPr>
           <w:p>
@@ -5641,7 +5651,7 @@
         </w:tc>
         <w:tc>
           <w:tcPr>
-            <w:tcW w:type="dxa" w:w="1377"/>
+            <w:tcW w:type="dxa" w:w="1458"/>
             <w:shd w:val="clear" w:color="auto" w:fill="F5F0E8"/>
           </w:tcPr>
           <w:p>
@@ -5663,7 +5673,7 @@
         </w:tc>
         <w:tc>
           <w:tcPr>
-            <w:tcW w:type="dxa" w:w="1377"/>
+            <w:tcW w:type="dxa" w:w="1458"/>
             <w:shd w:val="clear" w:color="auto" w:fill="F5F0E8"/>
           </w:tcPr>
           <w:p>
@@ -5685,7 +5695,7 @@
         </w:tc>
         <w:tc>
           <w:tcPr>
-            <w:tcW w:type="dxa" w:w="1377"/>
+            <w:tcW w:type="dxa" w:w="1458"/>
             <w:shd w:val="clear" w:color="auto" w:fill="F5F0E8"/>
           </w:tcPr>
           <w:p>
@@ -5707,7 +5717,7 @@
         </w:tc>
         <w:tc>
           <w:tcPr>
-            <w:tcW w:type="dxa" w:w="1377"/>
+            <w:tcW w:type="dxa" w:w="1458"/>
             <w:shd w:val="clear" w:color="auto" w:fill="F5F0E8"/>
           </w:tcPr>
           <w:p>
@@ -5731,7 +5741,7 @@
       <w:tr>
         <w:tc>
           <w:tcPr>
-            <w:tcW w:type="dxa" w:w="1377"/>
+            <w:tcW w:type="dxa" w:w="1458"/>
             <w:shd w:val="clear" w:color="auto" w:fill="FFFFFF"/>
           </w:tcPr>
           <w:p>
@@ -5753,7 +5763,7 @@
         </w:tc>
         <w:tc>
           <w:tcPr>
-            <w:tcW w:type="dxa" w:w="1377"/>
+            <w:tcW w:type="dxa" w:w="1458"/>
             <w:shd w:val="clear" w:color="auto" w:fill="FFFFFF"/>
           </w:tcPr>
           <w:p>
@@ -5775,7 +5785,7 @@
         </w:tc>
         <w:tc>
           <w:tcPr>
-            <w:tcW w:type="dxa" w:w="1377"/>
+            <w:tcW w:type="dxa" w:w="1458"/>
             <w:shd w:val="clear" w:color="auto" w:fill="FFFFFF"/>
           </w:tcPr>
           <w:p>
@@ -5797,7 +5807,7 @@
         </w:tc>
         <w:tc>
           <w:tcPr>
-            <w:tcW w:type="dxa" w:w="1377"/>
+            <w:tcW w:type="dxa" w:w="1458"/>
             <w:shd w:val="clear" w:color="auto" w:fill="FFFFFF"/>
           </w:tcPr>
           <w:p>
@@ -5819,7 +5829,7 @@
         </w:tc>
         <w:tc>
           <w:tcPr>
-            <w:tcW w:type="dxa" w:w="1377"/>
+            <w:tcW w:type="dxa" w:w="1458"/>
             <w:shd w:val="clear" w:color="auto" w:fill="FFFFFF"/>
           </w:tcPr>
           <w:p>
@@ -5841,7 +5851,7 @@
         </w:tc>
         <w:tc>
           <w:tcPr>
-            <w:tcW w:type="dxa" w:w="1377"/>
+            <w:tcW w:type="dxa" w:w="1458"/>
             <w:shd w:val="clear" w:color="auto" w:fill="FFFFFF"/>
           </w:tcPr>
           <w:p>
@@ -5863,7 +5873,7 @@
         </w:tc>
         <w:tc>
           <w:tcPr>
-            <w:tcW w:type="dxa" w:w="1377"/>
+            <w:tcW w:type="dxa" w:w="1458"/>
             <w:shd w:val="clear" w:color="auto" w:fill="FFFFFF"/>
           </w:tcPr>
           <w:p>
@@ -5899,7 +5909,7 @@
       <w:r>
         <w:drawing>
           <wp:inline xmlns:a="http://schemas.openxmlformats.org/drawingml/2006/main" xmlns:pic="http://schemas.openxmlformats.org/drawingml/2006/picture">
-            <wp:extent cx="5040000" cy="2493052"/>
+            <wp:extent cx="2880000" cy="1424601"/>
             <wp:docPr id="3" name="Picture 3"/>
             <wp:cNvGraphicFramePr>
               <a:graphicFrameLocks noChangeAspect="1"/>
@@ -5920,7 +5930,7 @@
                   <pic:spPr>
                     <a:xfrm>
                       <a:off x="0" y="0"/>
-                      <a:ext cx="5040000" cy="2493052"/>
+                      <a:ext cx="2880000" cy="1424601"/>
                     </a:xfrm>
                     <a:prstGeom prst="rect"/>
                   </pic:spPr>
@@ -5973,7 +5983,7 @@
       <w:r>
         <w:drawing>
           <wp:inline xmlns:a="http://schemas.openxmlformats.org/drawingml/2006/main" xmlns:pic="http://schemas.openxmlformats.org/drawingml/2006/picture">
-            <wp:extent cx="4140000" cy="3461538"/>
+            <wp:extent cx="3060000" cy="2558528"/>
             <wp:docPr id="4" name="Picture 4"/>
             <wp:cNvGraphicFramePr>
               <a:graphicFrameLocks noChangeAspect="1"/>
@@ -5994,7 +6004,7 @@
                   <pic:spPr>
                     <a:xfrm>
                       <a:off x="0" y="0"/>
-                      <a:ext cx="4140000" cy="3461538"/>
+                      <a:ext cx="3060000" cy="2558528"/>
                     </a:xfrm>
                     <a:prstGeom prst="rect"/>
                   </pic:spPr>
@@ -6047,7 +6057,7 @@
       <w:r>
         <w:drawing>
           <wp:inline xmlns:a="http://schemas.openxmlformats.org/drawingml/2006/main" xmlns:pic="http://schemas.openxmlformats.org/drawingml/2006/picture">
-            <wp:extent cx="5040000" cy="3020134"/>
+            <wp:extent cx="2880000" cy="1725791"/>
             <wp:docPr id="5" name="Picture 5"/>
             <wp:cNvGraphicFramePr>
               <a:graphicFrameLocks noChangeAspect="1"/>
@@ -6068,7 +6078,7 @@
                   <pic:spPr>
                     <a:xfrm>
                       <a:off x="0" y="0"/>
-                      <a:ext cx="5040000" cy="3020134"/>
+                      <a:ext cx="2880000" cy="1725791"/>
                     </a:xfrm>
                     <a:prstGeom prst="rect"/>
                   </pic:spPr>
@@ -6154,7 +6164,7 @@
       <w:r>
         <w:drawing>
           <wp:inline xmlns:a="http://schemas.openxmlformats.org/drawingml/2006/main" xmlns:pic="http://schemas.openxmlformats.org/drawingml/2006/picture">
-            <wp:extent cx="5040000" cy="1810217"/>
+            <wp:extent cx="2880000" cy="1034410"/>
             <wp:docPr id="6" name="Picture 6"/>
             <wp:cNvGraphicFramePr>
               <a:graphicFrameLocks noChangeAspect="1"/>
@@ -6175,7 +6185,7 @@
                   <pic:spPr>
                     <a:xfrm>
                       <a:off x="0" y="0"/>
-                      <a:ext cx="5040000" cy="1810217"/>
+                      <a:ext cx="2880000" cy="1034410"/>
                     </a:xfrm>
                     <a:prstGeom prst="rect"/>
                   </pic:spPr>
@@ -6228,7 +6238,7 @@
       <w:r>
         <w:drawing>
           <wp:inline xmlns:a="http://schemas.openxmlformats.org/drawingml/2006/main" xmlns:pic="http://schemas.openxmlformats.org/drawingml/2006/picture">
-            <wp:extent cx="5400000" cy="1408323"/>
+            <wp:extent cx="3060000" cy="798050"/>
             <wp:docPr id="7" name="Picture 7"/>
             <wp:cNvGraphicFramePr>
               <a:graphicFrameLocks noChangeAspect="1"/>
@@ -6249,7 +6259,7 @@
                   <pic:spPr>
                     <a:xfrm>
                       <a:off x="0" y="0"/>
-                      <a:ext cx="5400000" cy="1408323"/>
+                      <a:ext cx="3060000" cy="798050"/>
                     </a:xfrm>
                     <a:prstGeom prst="rect"/>
                   </pic:spPr>
@@ -6335,7 +6345,7 @@
       <w:r>
         <w:drawing>
           <wp:inline xmlns:a="http://schemas.openxmlformats.org/drawingml/2006/main" xmlns:pic="http://schemas.openxmlformats.org/drawingml/2006/picture">
-            <wp:extent cx="5400000" cy="3059182"/>
+            <wp:extent cx="3060000" cy="1733537"/>
             <wp:docPr id="8" name="Picture 8"/>
             <wp:cNvGraphicFramePr>
               <a:graphicFrameLocks noChangeAspect="1"/>
@@ -6356,7 +6366,7 @@
                   <pic:spPr>
                     <a:xfrm>
                       <a:off x="0" y="0"/>
-                      <a:ext cx="5400000" cy="3059182"/>
+                      <a:ext cx="3060000" cy="1733537"/>
                     </a:xfrm>
                     <a:prstGeom prst="rect"/>
                   </pic:spPr>
@@ -6474,14 +6484,14 @@
         <w:tblLook w:firstColumn="1" w:firstRow="1" w:lastColumn="0" w:lastRow="0" w:noHBand="0" w:noVBand="1" w:val="04A0"/>
       </w:tblPr>
       <w:tblGrid>
-        <w:gridCol w:w="3213"/>
-        <w:gridCol w:w="3213"/>
-        <w:gridCol w:w="3213"/>
+        <w:gridCol w:w="3402"/>
+        <w:gridCol w:w="3402"/>
+        <w:gridCol w:w="3402"/>
       </w:tblGrid>
       <w:tr>
         <w:tc>
           <w:tcPr>
-            <w:tcW w:type="dxa" w:w="3213"/>
+            <w:tcW w:type="dxa" w:w="3402"/>
             <w:shd w:val="clear" w:color="auto" w:fill="C99347"/>
           </w:tcPr>
           <w:p>
@@ -6503,7 +6513,7 @@
         </w:tc>
         <w:tc>
           <w:tcPr>
-            <w:tcW w:type="dxa" w:w="3213"/>
+            <w:tcW w:type="dxa" w:w="3402"/>
             <w:shd w:val="clear" w:color="auto" w:fill="C99347"/>
           </w:tcPr>
           <w:p>
@@ -6525,7 +6535,7 @@
         </w:tc>
         <w:tc>
           <w:tcPr>
-            <w:tcW w:type="dxa" w:w="3213"/>
+            <w:tcW w:type="dxa" w:w="3402"/>
             <w:shd w:val="clear" w:color="auto" w:fill="C99347"/>
           </w:tcPr>
           <w:p>
@@ -6549,7 +6559,7 @@
       <w:tr>
         <w:tc>
           <w:tcPr>
-            <w:tcW w:type="dxa" w:w="3213"/>
+            <w:tcW w:type="dxa" w:w="3402"/>
             <w:shd w:val="clear" w:color="auto" w:fill="FFFFFF"/>
           </w:tcPr>
           <w:p>
@@ -6571,7 +6581,7 @@
         </w:tc>
         <w:tc>
           <w:tcPr>
-            <w:tcW w:type="dxa" w:w="3213"/>
+            <w:tcW w:type="dxa" w:w="3402"/>
             <w:shd w:val="clear" w:color="auto" w:fill="FFFFFF"/>
           </w:tcPr>
           <w:p>
@@ -6593,7 +6603,7 @@
         </w:tc>
         <w:tc>
           <w:tcPr>
-            <w:tcW w:type="dxa" w:w="3213"/>
+            <w:tcW w:type="dxa" w:w="3402"/>
             <w:shd w:val="clear" w:color="auto" w:fill="FFFFFF"/>
           </w:tcPr>
           <w:p>
@@ -6617,7 +6627,7 @@
       <w:tr>
         <w:tc>
           <w:tcPr>
-            <w:tcW w:type="dxa" w:w="3213"/>
+            <w:tcW w:type="dxa" w:w="3402"/>
             <w:shd w:val="clear" w:color="auto" w:fill="F5F0E8"/>
           </w:tcPr>
           <w:p>
@@ -6639,7 +6649,7 @@
         </w:tc>
         <w:tc>
           <w:tcPr>
-            <w:tcW w:type="dxa" w:w="3213"/>
+            <w:tcW w:type="dxa" w:w="3402"/>
             <w:shd w:val="clear" w:color="auto" w:fill="F5F0E8"/>
           </w:tcPr>
           <w:p>
@@ -6661,7 +6671,7 @@
         </w:tc>
         <w:tc>
           <w:tcPr>
-            <w:tcW w:type="dxa" w:w="3213"/>
+            <w:tcW w:type="dxa" w:w="3402"/>
             <w:shd w:val="clear" w:color="auto" w:fill="F5F0E8"/>
           </w:tcPr>
           <w:p>
@@ -6685,7 +6695,7 @@
       <w:tr>
         <w:tc>
           <w:tcPr>
-            <w:tcW w:type="dxa" w:w="3213"/>
+            <w:tcW w:type="dxa" w:w="3402"/>
             <w:shd w:val="clear" w:color="auto" w:fill="FFFFFF"/>
           </w:tcPr>
           <w:p>
@@ -6707,7 +6717,7 @@
         </w:tc>
         <w:tc>
           <w:tcPr>
-            <w:tcW w:type="dxa" w:w="3213"/>
+            <w:tcW w:type="dxa" w:w="3402"/>
             <w:shd w:val="clear" w:color="auto" w:fill="FFFFFF"/>
           </w:tcPr>
           <w:p>
@@ -6729,7 +6739,7 @@
         </w:tc>
         <w:tc>
           <w:tcPr>
-            <w:tcW w:type="dxa" w:w="3213"/>
+            <w:tcW w:type="dxa" w:w="3402"/>
             <w:shd w:val="clear" w:color="auto" w:fill="FFFFFF"/>
           </w:tcPr>
           <w:p>
@@ -6753,7 +6763,7 @@
       <w:tr>
         <w:tc>
           <w:tcPr>
-            <w:tcW w:type="dxa" w:w="3213"/>
+            <w:tcW w:type="dxa" w:w="3402"/>
             <w:shd w:val="clear" w:color="auto" w:fill="F5F0E8"/>
           </w:tcPr>
           <w:p>
@@ -6775,7 +6785,7 @@
         </w:tc>
         <w:tc>
           <w:tcPr>
-            <w:tcW w:type="dxa" w:w="3213"/>
+            <w:tcW w:type="dxa" w:w="3402"/>
             <w:shd w:val="clear" w:color="auto" w:fill="F5F0E8"/>
           </w:tcPr>
           <w:p>
@@ -6797,7 +6807,7 @@
         </w:tc>
         <w:tc>
           <w:tcPr>
-            <w:tcW w:type="dxa" w:w="3213"/>
+            <w:tcW w:type="dxa" w:w="3402"/>
             <w:shd w:val="clear" w:color="auto" w:fill="F5F0E8"/>
           </w:tcPr>
           <w:p>
@@ -6821,7 +6831,7 @@
       <w:tr>
         <w:tc>
           <w:tcPr>
-            <w:tcW w:type="dxa" w:w="3213"/>
+            <w:tcW w:type="dxa" w:w="3402"/>
             <w:shd w:val="clear" w:color="auto" w:fill="FFFFFF"/>
           </w:tcPr>
           <w:p>
@@ -6843,7 +6853,7 @@
         </w:tc>
         <w:tc>
           <w:tcPr>
-            <w:tcW w:type="dxa" w:w="3213"/>
+            <w:tcW w:type="dxa" w:w="3402"/>
             <w:shd w:val="clear" w:color="auto" w:fill="FFFFFF"/>
           </w:tcPr>
           <w:p>
@@ -6865,7 +6875,7 @@
         </w:tc>
         <w:tc>
           <w:tcPr>
-            <w:tcW w:type="dxa" w:w="3213"/>
+            <w:tcW w:type="dxa" w:w="3402"/>
             <w:shd w:val="clear" w:color="auto" w:fill="FFFFFF"/>
           </w:tcPr>
           <w:p>
@@ -6889,7 +6899,7 @@
       <w:tr>
         <w:tc>
           <w:tcPr>
-            <w:tcW w:type="dxa" w:w="3213"/>
+            <w:tcW w:type="dxa" w:w="3402"/>
             <w:shd w:val="clear" w:color="auto" w:fill="F5F0E8"/>
           </w:tcPr>
           <w:p>
@@ -6911,7 +6921,7 @@
         </w:tc>
         <w:tc>
           <w:tcPr>
-            <w:tcW w:type="dxa" w:w="3213"/>
+            <w:tcW w:type="dxa" w:w="3402"/>
             <w:shd w:val="clear" w:color="auto" w:fill="F5F0E8"/>
           </w:tcPr>
           <w:p>
@@ -6933,7 +6943,7 @@
         </w:tc>
         <w:tc>
           <w:tcPr>
-            <w:tcW w:type="dxa" w:w="3213"/>
+            <w:tcW w:type="dxa" w:w="3402"/>
             <w:shd w:val="clear" w:color="auto" w:fill="F5F0E8"/>
           </w:tcPr>
           <w:p>
@@ -6957,7 +6967,7 @@
       <w:tr>
         <w:tc>
           <w:tcPr>
-            <w:tcW w:type="dxa" w:w="3213"/>
+            <w:tcW w:type="dxa" w:w="3402"/>
             <w:shd w:val="clear" w:color="auto" w:fill="FFFFFF"/>
           </w:tcPr>
           <w:p>
@@ -6979,7 +6989,7 @@
         </w:tc>
         <w:tc>
           <w:tcPr>
-            <w:tcW w:type="dxa" w:w="3213"/>
+            <w:tcW w:type="dxa" w:w="3402"/>
             <w:shd w:val="clear" w:color="auto" w:fill="FFFFFF"/>
           </w:tcPr>
           <w:p>
@@ -7001,7 +7011,7 @@
         </w:tc>
         <w:tc>
           <w:tcPr>
-            <w:tcW w:type="dxa" w:w="3213"/>
+            <w:tcW w:type="dxa" w:w="3402"/>
             <w:shd w:val="clear" w:color="auto" w:fill="FFFFFF"/>
           </w:tcPr>
           <w:p>
@@ -7025,7 +7035,7 @@
       <w:tr>
         <w:tc>
           <w:tcPr>
-            <w:tcW w:type="dxa" w:w="3213"/>
+            <w:tcW w:type="dxa" w:w="3402"/>
             <w:shd w:val="clear" w:color="auto" w:fill="F5F0E8"/>
           </w:tcPr>
           <w:p>
@@ -7047,7 +7057,7 @@
         </w:tc>
         <w:tc>
           <w:tcPr>
-            <w:tcW w:type="dxa" w:w="3213"/>
+            <w:tcW w:type="dxa" w:w="3402"/>
             <w:shd w:val="clear" w:color="auto" w:fill="F5F0E8"/>
           </w:tcPr>
           <w:p>
@@ -7069,7 +7079,7 @@
         </w:tc>
         <w:tc>
           <w:tcPr>
-            <w:tcW w:type="dxa" w:w="3213"/>
+            <w:tcW w:type="dxa" w:w="3402"/>
             <w:shd w:val="clear" w:color="auto" w:fill="F5F0E8"/>
           </w:tcPr>
           <w:p>
@@ -7093,7 +7103,7 @@
       <w:tr>
         <w:tc>
           <w:tcPr>
-            <w:tcW w:type="dxa" w:w="3213"/>
+            <w:tcW w:type="dxa" w:w="3402"/>
             <w:shd w:val="clear" w:color="auto" w:fill="FFFFFF"/>
           </w:tcPr>
           <w:p>
@@ -7115,7 +7125,7 @@
         </w:tc>
         <w:tc>
           <w:tcPr>
-            <w:tcW w:type="dxa" w:w="3213"/>
+            <w:tcW w:type="dxa" w:w="3402"/>
             <w:shd w:val="clear" w:color="auto" w:fill="FFFFFF"/>
           </w:tcPr>
           <w:p>
@@ -7137,7 +7147,7 @@
         </w:tc>
         <w:tc>
           <w:tcPr>
-            <w:tcW w:type="dxa" w:w="3213"/>
+            <w:tcW w:type="dxa" w:w="3402"/>
             <w:shd w:val="clear" w:color="auto" w:fill="FFFFFF"/>
           </w:tcPr>
           <w:p>
@@ -7161,7 +7171,7 @@
       <w:tr>
         <w:tc>
           <w:tcPr>
-            <w:tcW w:type="dxa" w:w="3213"/>
+            <w:tcW w:type="dxa" w:w="3402"/>
             <w:shd w:val="clear" w:color="auto" w:fill="F5F0E8"/>
           </w:tcPr>
           <w:p>
@@ -7183,7 +7193,7 @@
         </w:tc>
         <w:tc>
           <w:tcPr>
-            <w:tcW w:type="dxa" w:w="3213"/>
+            <w:tcW w:type="dxa" w:w="3402"/>
             <w:shd w:val="clear" w:color="auto" w:fill="F5F0E8"/>
           </w:tcPr>
           <w:p>
@@ -7205,7 +7215,7 @@
         </w:tc>
         <w:tc>
           <w:tcPr>
-            <w:tcW w:type="dxa" w:w="3213"/>
+            <w:tcW w:type="dxa" w:w="3402"/>
             <w:shd w:val="clear" w:color="auto" w:fill="F5F0E8"/>
           </w:tcPr>
           <w:p>
@@ -7241,7 +7251,7 @@
       <w:r>
         <w:drawing>
           <wp:inline xmlns:a="http://schemas.openxmlformats.org/drawingml/2006/main" xmlns:pic="http://schemas.openxmlformats.org/drawingml/2006/picture">
-            <wp:extent cx="5040000" cy="4019697"/>
+            <wp:extent cx="2880000" cy="2296970"/>
             <wp:docPr id="9" name="Picture 9"/>
             <wp:cNvGraphicFramePr>
               <a:graphicFrameLocks noChangeAspect="1"/>
@@ -7262,7 +7272,7 @@
                   <pic:spPr>
                     <a:xfrm>
                       <a:off x="0" y="0"/>
-                      <a:ext cx="5040000" cy="4019697"/>
+                      <a:ext cx="2880000" cy="2296970"/>
                     </a:xfrm>
                     <a:prstGeom prst="rect"/>
                   </pic:spPr>
@@ -7315,7 +7325,7 @@
       <w:r>
         <w:drawing>
           <wp:inline xmlns:a="http://schemas.openxmlformats.org/drawingml/2006/main" xmlns:pic="http://schemas.openxmlformats.org/drawingml/2006/picture">
-            <wp:extent cx="4320000" cy="4577120"/>
+            <wp:extent cx="3060000" cy="3242127"/>
             <wp:docPr id="10" name="Picture 10"/>
             <wp:cNvGraphicFramePr>
               <a:graphicFrameLocks noChangeAspect="1"/>
@@ -7336,7 +7346,7 @@
                   <pic:spPr>
                     <a:xfrm>
                       <a:off x="0" y="0"/>
-                      <a:ext cx="4320000" cy="4577120"/>
+                      <a:ext cx="3060000" cy="3242127"/>
                     </a:xfrm>
                     <a:prstGeom prst="rect"/>
                   </pic:spPr>
@@ -7422,7 +7432,7 @@
       <w:r>
         <w:drawing>
           <wp:inline xmlns:a="http://schemas.openxmlformats.org/drawingml/2006/main" xmlns:pic="http://schemas.openxmlformats.org/drawingml/2006/picture">
-            <wp:extent cx="3960000" cy="3489296"/>
+            <wp:extent cx="3060000" cy="2696274"/>
             <wp:docPr id="11" name="Picture 11"/>
             <wp:cNvGraphicFramePr>
               <a:graphicFrameLocks noChangeAspect="1"/>
@@ -7443,7 +7453,7 @@
                   <pic:spPr>
                     <a:xfrm>
                       <a:off x="0" y="0"/>
-                      <a:ext cx="3960000" cy="3489296"/>
+                      <a:ext cx="3060000" cy="2696274"/>
                     </a:xfrm>
                     <a:prstGeom prst="rect"/>
                   </pic:spPr>
@@ -7512,7 +7522,7 @@
       <w:r>
         <w:drawing>
           <wp:inline xmlns:a="http://schemas.openxmlformats.org/drawingml/2006/main" xmlns:pic="http://schemas.openxmlformats.org/drawingml/2006/picture">
-            <wp:extent cx="5040000" cy="3221815"/>
+            <wp:extent cx="2880000" cy="1841037"/>
             <wp:docPr id="12" name="Picture 12"/>
             <wp:cNvGraphicFramePr>
               <a:graphicFrameLocks noChangeAspect="1"/>
@@ -7533,7 +7543,7 @@
                   <pic:spPr>
                     <a:xfrm>
                       <a:off x="0" y="0"/>
-                      <a:ext cx="5040000" cy="3221815"/>
+                      <a:ext cx="2880000" cy="1841037"/>
                     </a:xfrm>
                     <a:prstGeom prst="rect"/>
                   </pic:spPr>
@@ -7586,7 +7596,7 @@
       <w:r>
         <w:drawing>
           <wp:inline xmlns:a="http://schemas.openxmlformats.org/drawingml/2006/main" xmlns:pic="http://schemas.openxmlformats.org/drawingml/2006/picture">
-            <wp:extent cx="3780000" cy="3592003"/>
+            <wp:extent cx="3060000" cy="2907812"/>
             <wp:docPr id="13" name="Picture 13"/>
             <wp:cNvGraphicFramePr>
               <a:graphicFrameLocks noChangeAspect="1"/>
@@ -7607,7 +7617,7 @@
                   <pic:spPr>
                     <a:xfrm>
                       <a:off x="0" y="0"/>
-                      <a:ext cx="3780000" cy="3592003"/>
+                      <a:ext cx="3060000" cy="2907812"/>
                     </a:xfrm>
                     <a:prstGeom prst="rect"/>
                   </pic:spPr>
@@ -7660,7 +7670,7 @@
       <w:r>
         <w:drawing>
           <wp:inline xmlns:a="http://schemas.openxmlformats.org/drawingml/2006/main" xmlns:pic="http://schemas.openxmlformats.org/drawingml/2006/picture">
-            <wp:extent cx="3780000" cy="3592003"/>
+            <wp:extent cx="3060000" cy="2907812"/>
             <wp:docPr id="14" name="Picture 14"/>
             <wp:cNvGraphicFramePr>
               <a:graphicFrameLocks noChangeAspect="1"/>
@@ -7681,7 +7691,7 @@
                   <pic:spPr>
                     <a:xfrm>
                       <a:off x="0" y="0"/>
-                      <a:ext cx="3780000" cy="3592003"/>
+                      <a:ext cx="3060000" cy="2907812"/>
                     </a:xfrm>
                     <a:prstGeom prst="rect"/>
                   </pic:spPr>
@@ -7767,7 +7777,7 @@
       <w:r>
         <w:drawing>
           <wp:inline xmlns:a="http://schemas.openxmlformats.org/drawingml/2006/main" xmlns:pic="http://schemas.openxmlformats.org/drawingml/2006/picture">
-            <wp:extent cx="5040000" cy="3532112"/>
+            <wp:extent cx="2880000" cy="2018350"/>
             <wp:docPr id="15" name="Picture 15"/>
             <wp:cNvGraphicFramePr>
               <a:graphicFrameLocks noChangeAspect="1"/>
@@ -7788,7 +7798,7 @@
                   <pic:spPr>
                     <a:xfrm>
                       <a:off x="0" y="0"/>
-                      <a:ext cx="5040000" cy="3532112"/>
+                      <a:ext cx="2880000" cy="2018350"/>
                     </a:xfrm>
                     <a:prstGeom prst="rect"/>
                   </pic:spPr>
@@ -7874,7 +7884,7 @@
       <w:r>
         <w:drawing>
           <wp:inline xmlns:a="http://schemas.openxmlformats.org/drawingml/2006/main" xmlns:pic="http://schemas.openxmlformats.org/drawingml/2006/picture">
-            <wp:extent cx="5040000" cy="2550954"/>
+            <wp:extent cx="2880000" cy="1457688"/>
             <wp:docPr id="16" name="Picture 16"/>
             <wp:cNvGraphicFramePr>
               <a:graphicFrameLocks noChangeAspect="1"/>
@@ -7895,7 +7905,7 @@
                   <pic:spPr>
                     <a:xfrm>
                       <a:off x="0" y="0"/>
-                      <a:ext cx="5040000" cy="2550954"/>
+                      <a:ext cx="2880000" cy="1457688"/>
                     </a:xfrm>
                     <a:prstGeom prst="rect"/>
                   </pic:spPr>
@@ -7948,7 +7958,7 @@
       <w:r>
         <w:drawing>
           <wp:inline xmlns:a="http://schemas.openxmlformats.org/drawingml/2006/main" xmlns:pic="http://schemas.openxmlformats.org/drawingml/2006/picture">
-            <wp:extent cx="5040000" cy="3497091"/>
+            <wp:extent cx="2880000" cy="1998338"/>
             <wp:docPr id="17" name="Picture 17"/>
             <wp:cNvGraphicFramePr>
               <a:graphicFrameLocks noChangeAspect="1"/>
@@ -7969,7 +7979,7 @@
                   <pic:spPr>
                     <a:xfrm>
                       <a:off x="0" y="0"/>
-                      <a:ext cx="5040000" cy="3497091"/>
+                      <a:ext cx="2880000" cy="1998338"/>
                     </a:xfrm>
                     <a:prstGeom prst="rect"/>
                   </pic:spPr>
@@ -8187,7 +8197,7 @@
       <w:r>
         <w:drawing>
           <wp:inline xmlns:a="http://schemas.openxmlformats.org/drawingml/2006/main" xmlns:pic="http://schemas.openxmlformats.org/drawingml/2006/picture">
-            <wp:extent cx="5040000" cy="3215172"/>
+            <wp:extent cx="2880000" cy="1837241"/>
             <wp:docPr id="18" name="Picture 18"/>
             <wp:cNvGraphicFramePr>
               <a:graphicFrameLocks noChangeAspect="1"/>
@@ -8208,7 +8218,7 @@
                   <pic:spPr>
                     <a:xfrm>
                       <a:off x="0" y="0"/>
-                      <a:ext cx="5040000" cy="3215172"/>
+                      <a:ext cx="2880000" cy="1837241"/>
                     </a:xfrm>
                     <a:prstGeom prst="rect"/>
                   </pic:spPr>
@@ -8294,7 +8304,7 @@
       <w:r>
         <w:drawing>
           <wp:inline xmlns:a="http://schemas.openxmlformats.org/drawingml/2006/main" xmlns:pic="http://schemas.openxmlformats.org/drawingml/2006/picture">
-            <wp:extent cx="5040000" cy="4629884"/>
+            <wp:extent cx="3060000" cy="2811001"/>
             <wp:docPr id="19" name="Picture 19"/>
             <wp:cNvGraphicFramePr>
               <a:graphicFrameLocks noChangeAspect="1"/>
@@ -8315,7 +8325,7 @@
                   <pic:spPr>
                     <a:xfrm>
                       <a:off x="0" y="0"/>
-                      <a:ext cx="5040000" cy="4629884"/>
+                      <a:ext cx="3060000" cy="2811001"/>
                     </a:xfrm>
                     <a:prstGeom prst="rect"/>
                   </pic:spPr>
@@ -8401,7 +8411,7 @@
       <w:r>
         <w:drawing>
           <wp:inline xmlns:a="http://schemas.openxmlformats.org/drawingml/2006/main" xmlns:pic="http://schemas.openxmlformats.org/drawingml/2006/picture">
-            <wp:extent cx="5040000" cy="3388966"/>
+            <wp:extent cx="2880000" cy="1936552"/>
             <wp:docPr id="20" name="Picture 20"/>
             <wp:cNvGraphicFramePr>
               <a:graphicFrameLocks noChangeAspect="1"/>
@@ -8422,7 +8432,7 @@
                   <pic:spPr>
                     <a:xfrm>
                       <a:off x="0" y="0"/>
-                      <a:ext cx="5040000" cy="3388966"/>
+                      <a:ext cx="2880000" cy="1936552"/>
                     </a:xfrm>
                     <a:prstGeom prst="rect"/>
                   </pic:spPr>
@@ -9209,10 +9219,11 @@
       </w:r>
     </w:p>
     <w:sectPr>
+      <w:type w:val="continuous"/>
       <w:pgSz w:w="11906" w:h="16838"/>
-      <w:pgMar w:top="1701" w:right="1134" w:bottom="1134" w:left="1134" w:header="720" w:footer="720" w:gutter="0"/>
-      <w:cols w:space="720"/>
+      <w:pgMar w:top="1582" w:right="850" w:bottom="278" w:left="850" w:header="720" w:footer="720" w:gutter="0"/>
       <w:docGrid w:linePitch="360"/>
+      <w:cols w:num="2" w:space="283" w:equalWidth="1"/>
     </w:sectPr>
   </w:body>
 </w:document>

</xml_diff>

<commit_message>
feat: update conclusions section and enhance future work discussion in AURIS paper
</commit_message>
<xml_diff>
--- a/docs/academic/paper/AURIS_paper_TR.docx
+++ b/docs/academic/paper/AURIS_paper_TR.docx
@@ -8560,7 +8560,7 @@
           <w:color w:val="333333"/>
           <w:sz w:val="17"/>
         </w:rPr>
-        <w:t>4. Sonuç (Conclusion)</w:t>
+        <w:t>Sonuçlar (Conclusions)</w:t>
       </w:r>
     </w:p>
     <w:p>
@@ -8577,7 +8577,7 @@
           <w:color w:val="333333"/>
           <w:sz w:val="17"/>
         </w:rPr>
-        <w:t>Bu çalışmada, yapay zekâ tarafından üretilen müziği insan kompozisyonundan ayırt etmek için AURIS adlı uçtan-uca bir sistem sunulmuştur. Sistem, 47 boyutlu elle tasarlanmış bir akustik öznitelik vektörünü, on iki veya daha fazla yapay zekâ üretim sisteminden derlenen 5.195 örnek üzerinde eğitilen on bir sınıflandırma modelinden oluşan bir topluluk ile eşleştirmektedir. Temel ampirik bulgular şunlardır: LightGBM, %95,48 ortalama ROC-AUC değeri ile en yüksek performansı elde etmekte, Deep MLP %95,42 ile çok yakın bir ikinci sıra almakta ve LightGBM aynı zamanda havuzdaki en düşük katlar-arası varyansı (±0,0023) göstermektedir. Spektral düzlük, yapay zekâ-insan ayrımı için en bilgilendirici tek öznitelik olarak ortaya çıkmakta ve bu örüntü sentetik ve kaydedilmiş spektrumlar arasındaki fark açısından yorumlanabilir niteliktedir. Youden J ölçütü ile her kat için eşik optimizasyonu, mevcut 1:1,5 sınıf dengesizliği altında varsayılan 0,5 kesim noktasını sistematik biçimde geçmektedir. Tanı analizi iki sınırlamayı açıkça ortaya koymaktadır: tüm ağaç toplulukları eğitim ile çapraz doğrulama doğruluğu arasında 8-14 puanlık bir fark sergilemekte ve öznitelik çıkarma, 47 özniteliğin sondaki yaklaşık on yedisinin ölçülebilir ek doğruluk sağlamadığını göstermektedir.</w:t>
+        <w:t>Bu çalışmada, GenAI tarafından üretilen müziği insan tarafından bestelenmiş kayıtlardan ayırt edebilmek için AURIS adlı uçtan-uca bir tespit sistemi önerilmiştir. Önerilen sistem; 47 boyutlu elle tasarlanmış bir akustik öznitelik vektörünü, on iki veya daha fazla GenAI üretim sisteminden derlenen 5.195 örnek üzerinde eğitilen on bir sınıflandırma modelinden oluşan bir topluluk ile birleştirmektedir. Elde edilen temel ampirik bulgular şu şekilde özetlenebilir: LightGBM modeli, %95,48 ortalama ROC-AUC değeri ile en yüksek performansı elde etmiş; DMLP ise %95,42 ile çok yakın bir ikinci sırayı almıştır. Ayrıca LightGBM, ±0,0023 standart sapma ile havuzdaki en düşük katlar-arası varyansa sahip modeli oluşturmuştur. Spektral düzlük özniteliği, GenAI ile insan müziği ayrımı için en bilgilendirici tek öznitelik olarak öne çıkmakta; bu örüntü, sentetik ve kaydedilmiş spektrumlar arasındaki fark üzerinden yorumlanabilir bir nitelik taşımaktadır. Youden J ölçütü ile her kat için optimize edilen θ* = 0,4316 karar eşiği, mevcut 1:1,5 sınıf dengesizliği altında varsayılan 0,5 kesim noktasını sistematik biçimde geçmektedir. Tanılayıcı analiz ise iki önemli sınırlamayı açık biçimde ortaya koymaktadır: (𝑖) tüm ağaç tabanlı modeller eğitim ile çapraz doğrulama doğrulukları arasında 8-14 puanlık bir fark sergilemekte ve (𝑖𝑖) 47 özniteliğin önem sırasına göre sondaki yaklaşık on yedisi ölçülebilir bir ek doğruluk sağlamamaktadır.</w:t>
       </w:r>
     </w:p>
     <w:p>
@@ -8594,7 +8594,7 @@
           <w:color w:val="333333"/>
           <w:sz w:val="17"/>
         </w:rPr>
-        <w:t>Gelecek çalışmalar dört yön takip edecektir. Birincisi, SONICS [23] ve FakeMusicCaps [24] gibi gelişmekte olan halka açık kıyaslamalar üzerinde resmi bir üretici-modeller arası tutulan değerlendirme gerçekleştirilecektir. İkincisi, ince ayar yapılmış wav2vec2 [13] modeli, öznitelik tabanlı sınıflandırıcılarla doğrudan karşılaştırma için 5-katlı çapraz doğrulama protokolüne entegre edilecektir. Üçüncüsü, düşmanca sağlamlık MP3 sıkıştırma, perde kaydırma ve zaman gerdirme altında açıkça değerlendirilecektir. Dördüncüsü, veri kümesi on bin örneğe doğru genişletilecek ve ortaya çıkan yapay zekâ üretim sistemleri eklenecektir; özellikle Li vd. [5] tarafından tanımlanan üretici-modeller arası genelleme zorluğuna odaklanılacaktır.</w:t>
+        <w:t>Bu araştırma, GenAI tarafından üretilen müziklerin tespiti alanında derin öğrenme ve topluluk öğrenmesi tekniklerinin etkinliğini vurgulayarak, çok üreticili müzik tespiti alanında daha fazla ilerleme için umut verici yollar sunmaktadır. Gelecek çalışmalar kapsamında dört yön takip edilecektir. Birincisi, SONICS [23] ve FakeMusicCaps [24] gibi gelişmekte olan halka açık kıyaslamalar üzerinde resmi bir üretici-modeller arası tutulan değerlendirme gerçekleştirilecektir. İkincisi, ince ayar yapılmış wav2vec2 [13] modeli, öznitelik tabanlı sınıflandırıcılarla doğrudan karşılaştırma için 5-katlı çapraz doğrulama protokolüne entegre edilecektir. Üçüncüsü, düşmanca sağlamlık (adversarial robustness); MP3 sıkıştırma, perde kaydırma ve zaman gerdirme gibi ses manipülasyonları altında açıkça değerlendirilecektir. Dördüncüsü, kullanılan veri kümesi on bin örneğe doğru genişletilecek ve ortaya çıkan yeni GenAI üretim sistemleri kapsama dahil edilecektir; özellikle Li vd. [5] tarafından tanımlanan üretici-modeller arası genelleme zorluğuna odaklanılması hedeflenmektedir.</w:t>
       </w:r>
     </w:p>
     <w:p>
@@ -8602,143 +8602,6 @@
         <w:spacing w:before="240" w:after="80" w:line="240" w:lineRule="auto"/>
         <w:jc w:val="left"/>
         <w:keepNext/>
-      </w:pPr>
-      <w:r>
-        <w:rPr>
-          <w:rFonts w:ascii="Times New Roman" w:hAnsi="Times New Roman" w:cs="Times New Roman" w:eastAsia="Times New Roman"/>
-          <w:b/>
-          <w:i w:val="0"/>
-          <w:color w:val="333333"/>
-          <w:sz w:val="17"/>
-        </w:rPr>
-        <w:t>Yapay Zekâ Beyanı (AI Disclosure)</w:t>
-      </w:r>
-    </w:p>
-    <w:p>
-      <w:pPr>
-        <w:spacing w:line="240" w:lineRule="auto" w:before="0" w:after="120"/>
-        <w:ind w:firstLine="283"/>
-        <w:jc w:val="both"/>
-      </w:pPr>
-      <w:r>
-        <w:rPr>
-          <w:rFonts w:ascii="Times New Roman" w:hAnsi="Times New Roman" w:cs="Times New Roman" w:eastAsia="Times New Roman"/>
-          <w:b w:val="0"/>
-          <w:i w:val="0"/>
-          <w:color w:val="333333"/>
-          <w:sz w:val="17"/>
-        </w:rPr>
-        <w:t>Üretken yapay zekâ, bu çalışmanın hazırlanması sırasında dil düzenlemesi ve şekil/analiz kodunun bir kısmı için yardımcı bir araç olarak kullanılmıştır. Tüm veriler, eğitilmiş modeller ve deneysel sonuçlar yazara aittir ve raporlanan her sayısal değer dayanak alınan veriler ile doğrulanmıştır. Yazar, tüm içeriğin bütünlüğü ve doğruluğunun sorumluluğunu üstlenmektedir.</w:t>
-      </w:r>
-    </w:p>
-    <w:p>
-      <w:pPr>
-        <w:spacing w:before="240" w:after="80" w:line="240" w:lineRule="auto"/>
-        <w:jc w:val="left"/>
-        <w:keepNext/>
-      </w:pPr>
-      <w:r>
-        <w:rPr>
-          <w:rFonts w:ascii="Times New Roman" w:hAnsi="Times New Roman" w:cs="Times New Roman" w:eastAsia="Times New Roman"/>
-          <w:b/>
-          <w:i w:val="0"/>
-          <w:color w:val="333333"/>
-          <w:sz w:val="17"/>
-        </w:rPr>
-        <w:t>Yazar Katkıları (Author Contributions)</w:t>
-      </w:r>
-    </w:p>
-    <w:p>
-      <w:pPr>
-        <w:spacing w:line="240" w:lineRule="auto" w:before="0" w:after="120"/>
-        <w:ind w:firstLine="283"/>
-        <w:jc w:val="both"/>
-      </w:pPr>
-      <w:r>
-        <w:rPr>
-          <w:rFonts w:ascii="Times New Roman" w:hAnsi="Times New Roman" w:cs="Times New Roman" w:eastAsia="Times New Roman"/>
-          <w:b w:val="0"/>
-          <w:i w:val="0"/>
-          <w:color w:val="333333"/>
-          <w:sz w:val="17"/>
-        </w:rPr>
-        <w:t>Hasan Arthur Altuntaş: Kavramsallaştırma, metodoloji, yazılım, veri küratörlüğü, biçimsel analiz, araştırma, yazma — taslak hazırlama, yazma — inceleme ve düzenleme, görselleştirme.</w:t>
-      </w:r>
-    </w:p>
-    <w:p>
-      <w:pPr>
-        <w:spacing w:before="240" w:after="80" w:line="240" w:lineRule="auto"/>
-        <w:jc w:val="left"/>
-        <w:keepNext/>
-      </w:pPr>
-      <w:r>
-        <w:rPr>
-          <w:rFonts w:ascii="Times New Roman" w:hAnsi="Times New Roman" w:cs="Times New Roman" w:eastAsia="Times New Roman"/>
-          <w:b/>
-          <w:i w:val="0"/>
-          <w:color w:val="333333"/>
-          <w:sz w:val="17"/>
-        </w:rPr>
-        <w:t>Teşekkür (Acknowledgement)</w:t>
-      </w:r>
-    </w:p>
-    <w:p>
-      <w:pPr>
-        <w:spacing w:line="240" w:lineRule="auto" w:before="0" w:after="120"/>
-        <w:ind w:firstLine="283"/>
-        <w:jc w:val="both"/>
-      </w:pPr>
-      <w:r>
-        <w:rPr>
-          <w:rFonts w:ascii="Times New Roman" w:hAnsi="Times New Roman" w:cs="Times New Roman" w:eastAsia="Times New Roman"/>
-          <w:b w:val="0"/>
-          <w:i w:val="0"/>
-          <w:color w:val="333333"/>
-          <w:sz w:val="17"/>
-        </w:rPr>
-        <w:t>Bu araştırma herhangi bir dış finansman almamıştır.</w:t>
-      </w:r>
-    </w:p>
-    <w:p>
-      <w:pPr>
-        <w:spacing w:before="240" w:after="80" w:line="240" w:lineRule="auto"/>
-        <w:jc w:val="left"/>
-        <w:keepNext/>
-      </w:pPr>
-      <w:r>
-        <w:rPr>
-          <w:rFonts w:ascii="Times New Roman" w:hAnsi="Times New Roman" w:cs="Times New Roman" w:eastAsia="Times New Roman"/>
-          <w:b/>
-          <w:i w:val="0"/>
-          <w:color w:val="333333"/>
-          <w:sz w:val="17"/>
-        </w:rPr>
-        <w:t>Çıkar Çatışması (Conflict of Interest)</w:t>
-      </w:r>
-    </w:p>
-    <w:p>
-      <w:pPr>
-        <w:spacing w:line="240" w:lineRule="auto" w:before="0" w:after="120"/>
-        <w:ind w:firstLine="283"/>
-        <w:jc w:val="both"/>
-      </w:pPr>
-      <w:r>
-        <w:rPr>
-          <w:rFonts w:ascii="Times New Roman" w:hAnsi="Times New Roman" w:cs="Times New Roman" w:eastAsia="Times New Roman"/>
-          <w:b w:val="0"/>
-          <w:i w:val="0"/>
-          <w:color w:val="333333"/>
-          <w:sz w:val="17"/>
-        </w:rPr>
-        <w:t>Yazar herhangi bir çıkar çatışması beyan etmemektedir.</w:t>
-      </w:r>
-    </w:p>
-    <w:p>
-      <w:pPr>
-        <w:spacing w:before="240" w:after="80" w:line="240" w:lineRule="auto"/>
-        <w:jc w:val="left"/>
-        <w:keepNext/>
-        <w:pageBreakBefore/>
       </w:pPr>
       <w:r>
         <w:rPr>

</xml_diff>

<commit_message>
Refactor discussion sections in AURIS paper: update headings and enhance clarity of results. Consolidate findings on spectral flatness, cross-generator generalization, 1D-CNN performance, and overfitting diagnosis. Revise limitations section for improved articulation of constraints and implications.
</commit_message>
<xml_diff>
--- a/docs/academic/paper/AURIS_paper_TR.docx
+++ b/docs/academic/paper/AURIS_paper_TR.docx
@@ -3958,7 +3958,7 @@
           <w:color w:val="333333"/>
           <w:sz w:val="17"/>
         </w:rPr>
-        <w:t>3. Sonuçlar ve Tartışma (Results and Discussion)</w:t>
+        <w:t>3. Sonuçlar ve Tartışmalar (Results and Discussions)</w:t>
       </w:r>
     </w:p>
     <w:p>
@@ -8066,7 +8066,7 @@
           <w:color w:val="333333"/>
           <w:sz w:val="17"/>
         </w:rPr>
-        <w:t>3.8. Spektral Düzlüğün Baskınlığı Neden? (Why Spectral Flatness Dominates)</w:t>
+        <w:t>3.8. Tartışma (Discussion)</w:t>
       </w:r>
     </w:p>
     <w:p>
@@ -8083,24 +8083,7 @@
           <w:color w:val="333333"/>
           <w:sz w:val="17"/>
         </w:rPr>
-        <w:t>Spektral düzlüğün öznitelik önem sıralamasındaki baskınlığı, daha geniş ses derin sahte literatürü ile tutarlı ve yorumlanabilir bir bulgudur [6]. Spektral düzlük, bir sinyalin güç spektrumunun geometrik ve aritmetik ortalamaları arasındaki oranı ölçmekte ve spektrumun ne kadar tonal veya gürültü-benzeri olduğunu yakalamaktadır. Güncel yapay zekâ üretim sistemleri, algısal kalite ölçütlerini -ki bu ölçütler tonal zenginliği desteklemektedir- optimize etme eğilimindedir ve bunun yan etkisi olarak spektrumları insan kayıtlarınınkinden sistematik olarak daha temiz olan sinyaller üretmektedir. İnsan kayıtları buna karşın kayıt ortamlarının, mikrofon ön-yükselticilerinin ve enstrümantal performansın katkıda bulunduğu geniş bantlı gürültüyü taşımaktadır.</w:t>
-      </w:r>
-    </w:p>
-    <w:p>
-      <w:pPr>
-        <w:spacing w:before="160" w:after="40" w:line="240" w:lineRule="auto"/>
-        <w:jc w:val="left"/>
-        <w:keepNext/>
-      </w:pPr>
-      <w:r>
-        <w:rPr>
-          <w:rFonts w:ascii="Times New Roman" w:hAnsi="Times New Roman" w:cs="Times New Roman" w:eastAsia="Times New Roman"/>
-          <w:b/>
-          <w:i/>
-          <w:color w:val="333333"/>
-          <w:sz w:val="17"/>
-        </w:rPr>
-        <w:t>3.9. Üretici Modeller Arası Genelleme (Cross-Generator Generalisation)</w:t>
+        <w:t>Bu alt bölümde, elde edilen deneysel sonuçlar literatür ışığında ayrıntılı biçimde tartışılmıştır. Spektral düzlük özniteliğinin öznitelik önem sıralamasındaki baskın konumu, daha geniş ses derin sahte literatürüyle [6] tutarlı ve yorumlanabilir bir bulgu niteliğindedir. Spektral düzlük, bir sinyalin güç spektrumunun geometrik ve aritmetik ortalamaları arasındaki oranı ölçerek spektrumun ne kadar tonal veya gürültü-benzeri olduğunu yakalamaktadır. Güncel GenAI üretim sistemleri, algısal kalite ölçütlerini optimize etme eğiliminde olup bunun yan etkisi olarak insan kayıtlarınınkinden sistematik biçimde daha temiz spektrumlar üreten sinyaller ortaya çıkarmaktadır. İnsan kayıtları ise kayıt ortamı, mikrofon ön-yükselticileri ve enstrümantal performansın katkıda bulunduğu geniş bantlı gürültüyü taşımaktadır. Bu yapısal fark, spektral düzlüğün ayırt edici güç olarak öne çıkmasının temel nedenini oluşturmaktadır.</w:t>
       </w:r>
     </w:p>
     <w:p>
@@ -8117,24 +8100,7 @@
           <w:color w:val="333333"/>
           <w:sz w:val="17"/>
         </w:rPr>
-        <w:t>Veri kümesi otoregresif modellerden (MusicGen [1]) difüzyon-tabanlı sistemlere (AudioLDM [2]) ve ticari üreticilere (Suno, Udio) kadar on iki veya daha fazla yapay zekâ üretim sistemini kapsamaktadır. Bu çeşitliliğin amacı, modeli tek bir üretici ailenin parmak izlerine aşırı uydurmaktan kaçınmaktır. §3.7'de raporlanan kaynak bazlı sonuçlar, bu yaklaşımın kısmen başarılı olduğunu göstermektedir; Suno ve Echoes parçalarında %88-93 duyarlılık elde edilmekte ancak deepfake alt kümesinde performans %50'ye düşmektedir. Bu sonuç, Li vd. [5] tarafından alanın açık problemi olarak işaret edilen üretici-modeller arası genelleme zorluğunu doğrulamaktadır.</w:t>
-      </w:r>
-    </w:p>
-    <w:p>
-      <w:pPr>
-        <w:spacing w:before="160" w:after="40" w:line="240" w:lineRule="auto"/>
-        <w:jc w:val="left"/>
-        <w:keepNext/>
-      </w:pPr>
-      <w:r>
-        <w:rPr>
-          <w:rFonts w:ascii="Times New Roman" w:hAnsi="Times New Roman" w:cs="Times New Roman" w:eastAsia="Times New Roman"/>
-          <w:b/>
-          <w:i/>
-          <w:color w:val="333333"/>
-          <w:sz w:val="17"/>
-        </w:rPr>
-        <w:t>3.10. 1D-CNN Neden Düşük Performans Gösteriyor? (Why the 1D-CNN Underperforms)</w:t>
+        <w:t>Üretici modeller arası genelleme bağlamında, kullanılan veri kümesinin otoregresif modellerden (MusicGen [1]) difüzyon tabanlı sistemlere (AudioLDM [2]) ve ticari üreticilere (Suno, Udio) kadar on iki veya daha fazla GenAI üretim sistemini kapsadığı görülmektedir. Bu çeşitliliğin temel amacı, modelin tek bir üretici ailenin parmak izlerine aşırı uyum sağlamasını engellemektir. Bölüm 3.7'de raporlanan kaynak bazlı sonuçlar bu yaklaşımın kısmen başarılı olduğunu göstermektedir; Suno ve Echoes parçalarında %88-93 duyarlılık değeri elde edilirken deepfake alt kümesinde bu değer %50'ye düşmektedir. Bu sonuç, Li vd. [5] tarafından alanın açık problemi olarak işaret edilen üretici modeller arası genelleme zorluğunu doğrular niteliktedir.</w:t>
       </w:r>
     </w:p>
     <w:p>
@@ -8151,24 +8117,7 @@
           <w:color w:val="333333"/>
           <w:sz w:val="17"/>
         </w:rPr>
-        <w:t>1D-CNN'nin diğer mimarilere kıyasla belirgin biçimde düşük performansı (ROC-AUC = 0,8543) mimari bir uyumsuzluğun sonucudur. Tek boyutlu konvolüsyon, bir dizi boyunca yerel korelasyonları sömürmek üzere tasarlanmıştır; ancak AURIS'in girişi sıralanmamış 47 boyutlu düz bir öznitelik vektörüdür ve vektörün bitişik indeksleri ilgisiz miktarlara karşılık gelmektedir -bir spektral istatistik yanında bir tempo istatistiği, yanında bir vokal skor-. Bu liste boyunca bir çekirdek kaydıran konvolüsyonun öğreneceği anlamlı bir öteleme değişmezliği bulunmamaktadır. Sonuç olarak 1D-CNN, vektörü bir bütün olarak işleyen diğer üç DL mimarisinin gerisinde kalmakta ve doğrulukta Lojistik Regresyon tarafından bile geçilmektedir.</w:t>
-      </w:r>
-    </w:p>
-    <w:p>
-      <w:pPr>
-        <w:spacing w:before="160" w:after="40" w:line="240" w:lineRule="auto"/>
-        <w:jc w:val="left"/>
-        <w:keepNext/>
-      </w:pPr>
-      <w:r>
-        <w:rPr>
-          <w:rFonts w:ascii="Times New Roman" w:hAnsi="Times New Roman" w:cs="Times New Roman" w:eastAsia="Times New Roman"/>
-          <w:b/>
-          <w:i/>
-          <w:color w:val="333333"/>
-          <w:sz w:val="17"/>
-        </w:rPr>
-        <w:t>3.11. Kalibrasyon ve Operasyonel Yararlılık (Calibration and Operational Utility)</w:t>
+        <w:t>1D-CNN modelinin diğer mimarilere kıyasla belirgin biçimde düşük performansı (ROC-AUC = 0,8543), mimari bir uyumsuzluğun sonucu olarak değerlendirilmektedir. Tek boyutlu evrişim, bir dizi boyunca yerel korelasyonları kullanmak üzere tasarlanmıştır; ancak önerilen sistemde giriş, sıralanmamış 47 boyutlu düz bir öznitelik vektörüdür ve vektörün bitişik indeksleri ilgisiz miktarlara karşılık gelmektedir. Bu liste boyunca bir çekirdeği kaydıran evrişim işleminin öğrenebileceği anlamlı bir öteleme değişmezliği bulunmadığından, 1D-CNN modeli vektörü bir bütün olarak işleyen diğer üç DL mimarisinin gerisinde kalmakta ve doğruluk açısından Lojistik Regresyon tarafından bile geçilmektedir.</w:t>
       </w:r>
     </w:p>
     <w:p>
@@ -8185,41 +8134,7 @@
           <w:color w:val="333333"/>
           <w:sz w:val="17"/>
         </w:rPr>
-        <w:t>Tespit sistemlerinin operasyonel konuşlandırmaları çoğunlukla bir hedef kesinlik veya duyarlılık üzerinden bir karar noktası seçmeyi gerektirir. 0,083 Brier skoru bunu mümkün kılmaktadır; çünkü tahmin edilen olasılıklar gerçek arka olasılığa yakın karşılık gelmektedir. Bu, 0,7 eşiğinin gerçekten '%70 güvenli' anlamına geldiğini, 'skor dağılımının 70. yüzdelik dilimi' anlamına gelmediğini ifade eder. Youden-optimal kesim noktası 0,4316, mevcut sınıf oranı altında dengeli doğruluk için ilkesel bir varsayılan değerdir; ancak farklı operasyonel maliyetlere sahip kullanıcılar Şekil 15'te görselleştirilen eğri boyunca eşiği güvenle hareket ettirebilir.</w:t>
-      </w:r>
-    </w:p>
-    <w:p>
-      <w:pPr>
-        <w:spacing w:before="160" w:after="40" w:line="240" w:lineRule="auto"/>
-        <w:jc w:val="left"/>
-        <w:keepNext/>
-      </w:pPr>
-      <w:r>
-        <w:rPr>
-          <w:rFonts w:ascii="Times New Roman" w:hAnsi="Times New Roman" w:cs="Times New Roman" w:eastAsia="Times New Roman"/>
-          <w:b/>
-          <w:i/>
-          <w:color w:val="333333"/>
-          <w:sz w:val="17"/>
-        </w:rPr>
-        <w:t>3.12. Aşırı Öğrenme Tanısı (Overfit Diagnosis)</w:t>
-      </w:r>
-    </w:p>
-    <w:p>
-      <w:pPr>
-        <w:spacing w:line="240" w:lineRule="auto" w:before="0" w:after="120"/>
-        <w:ind w:firstLine="283"/>
-        <w:jc w:val="both"/>
-      </w:pPr>
-      <w:r>
-        <w:rPr>
-          <w:rFonts w:ascii="Times New Roman" w:hAnsi="Times New Roman" w:cs="Times New Roman" w:eastAsia="Times New Roman"/>
-          <w:b w:val="0"/>
-          <w:i w:val="0"/>
-          <w:color w:val="333333"/>
-          <w:sz w:val="17"/>
-        </w:rPr>
-        <w:t>Topluluğun ezberleyip ezberlemediğini doğrudan sorgulamanın bir yolu, her modelin eğitim doğruluğunu 5-katlı çapraz doğrulama doğruluğu ile karşılaştırmaktır. Şekil 18, sonucu raporlamaktadır. Rastgele Orman %100,0 eğitim doğruluğuna karşı CV altında %86,1'e ulaşmakta; bu 13,9 puanlık bir fark anlamına gelmektedir. LightGBM ve SVM sırasıyla 12,0 ve 13,4 puanlık farklarla yakın takipte. XGBoost ve Gradyan Artırma bile -daha güçlü yerleşik düzenleştirmelerine rağmen- 8-9 puanlık bir fark sergilemektedir. Eğitim ve CV doğruluklarının esasen örtüştüğü tek topluluk üyesi 0,6 puanlık fark ile Lojistik Regresyondur. Bu örüntü bilgilendiricidir: ağaç toplulukları, 5-katlı CV'nin yakaladığı ama tek bir eğitim/test bölünmesinin yakalamayacağı gerçek bir aşırı öğrenme taşımaktadır. Nihai %88,0 CV doğruluğu (LightGBM) anlamlı bir tavan olarak okunmalı, rahat bir marj olarak değil.</w:t>
+        <w:t>Topluluğun ezberleme eğilimini doğrudan değerlendirmek amacıyla, her modelin eğitim doğruluğu ile 5-katlı çapraz doğrulama doğruluğu karşılaştırmalı olarak incelenmiştir. Şekil 18'de sunulan sonuçlar şu örüntüyü ortaya koymaktadır: Rastgele Orman modeli %100,0 eğitim doğruluğuna karşı çapraz doğrulama altında %86,1 doğruluk elde etmiş olup aradaki 13,9 puanlık fark dikkat çekicidir. LightGBM ve SVM sırasıyla 12,0 ve 13,4 puanlık farklarla bu eğilimi takip etmektedir. XGBoost ve Gradyan Artırma modelleri ise -daha güçlü yerleşik düzenleştirmelerine rağmen- 8-9 puanlık bir fark sergilemektedir. Eğitim ve çapraz doğrulama doğruluklarının esasen örtüştüğü tek topluluk üyesi, yalnızca 0,6 puanlık fark ile Lojistik Regresyon olmuştur. Bu örüntü, ağaç tabanlı toplulukların 5-katlı çapraz doğrulamanın yakalayabildiği ancak tek bir eğitim/test bölünmesinin gizleyebileceği gerçek bir aşırı öğrenme (overfitting) eğilimi taşıdığını göstermektedir. Bu bulgu, %88,0'lık çapraz doğrulama doğruluğunun anlamlı bir performans tavanı olarak yorumlanmasını gerektirmektedir.</w:t>
       </w:r>
     </w:p>
     <w:p>
@@ -8277,7 +8192,7 @@
           <w:color w:val="333333"/>
           <w:sz w:val="17"/>
         </w:rPr>
-        <w:t>Şekil 18. Yedi öznitelik tabanlı modelin eğitim ve 5-katlı çapraz doğrulama doğrulukları. Fark, her modelin nominal doğruluğunun ne kadarının eğitim setini ezberlemekten geldiğini ölçmektedir.</w:t>
+        <w:t>Şekil 18. Yedi öznitelik tabanlı modelin eğitim ve 5-katlı çapraz doğrulama doğrulukları arasındaki farkın karşılaştırması.</w:t>
       </w:r>
     </w:p>
     <w:p>
@@ -8293,24 +8208,7 @@
           <w:color w:val="333333"/>
           <w:sz w:val="17"/>
         </w:rPr>
-        <w:t>(Train versus 5-fold cross-validation accuracy for the seven feature-based models. The gap quantifies how much of each model's nominal accuracy comes from memorising the training set.)</w:t>
-      </w:r>
-    </w:p>
-    <w:p>
-      <w:pPr>
-        <w:spacing w:before="160" w:after="40" w:line="240" w:lineRule="auto"/>
-        <w:jc w:val="left"/>
-        <w:keepNext/>
-      </w:pPr>
-      <w:r>
-        <w:rPr>
-          <w:rFonts w:ascii="Times New Roman" w:hAnsi="Times New Roman" w:cs="Times New Roman" w:eastAsia="Times New Roman"/>
-          <w:b/>
-          <w:i/>
-          <w:color w:val="333333"/>
-          <w:sz w:val="17"/>
-        </w:rPr>
-        <w:t>3.13. Öznitelik Fazlalığı (Feature Redundancy)</w:t>
+        <w:t>(Comparison of training accuracy and 5-fold cross-validation accuracy for the seven feature-based models.)</w:t>
       </w:r>
     </w:p>
     <w:p>
@@ -8327,7 +8225,7 @@
           <w:color w:val="333333"/>
           <w:sz w:val="17"/>
         </w:rPr>
-        <w:t>47 öznitelik tasarım gereği fazlalıklıdır -spektrum, ritim ve sesin örtüşen yönlerini kapsamaktadır- ancak fazlalık beklenenden ağırdır. Yirmi öznitelik çiftinin |Pearson r| değeri tüm veri kümesinde 0,85'in üzerindedir. Dört çift 0,97'yi aşmaktadır: has_vocals ile vocal_harmonic_ratio (r = 0,994), pitch_std_cents ile vibrato_extent_cents (0,983), vocal_texture_score ile vocal_harmonic_ratio (0,975) ve has_vocals ile vocal_texture_score (0,974). Vokal olmayan öznitelikler arasında spektral merkez, bant genişliği ve azalma ortalamaları sıkı bir küme oluşturmaktadır (ikili r &gt; 0,94). Şekil 19, tüm |r| matrisini çizmekte; aşağı-sağda yer alan koyu çapraz-dışı bloklar vokal öznitelik ailesine karşılık gelmektedir.</w:t>
+        <w:t>Öznitelik fazlalığı açısından yapılan analiz, 47 özniteliğin tasarım gereği fazlalıklı bir yapıya sahip olduğunu göstermiştir. Yirmi öznitelik çiftinin |Pearson r| değeri tüm veri kümesi üzerinde 0,85'in üzerinde ölçülmüştür. Bu çiftlerden dördü 0,97 değerini aşmaktadır: has_vocals ile vocal_harmonic_ratio (r = 0,994), pitch_std_cents ile vibrato_extent_cents (0,983), vocal_texture_score ile vocal_harmonic_ratio (0,975) ve has_vocals ile vocal_texture_score (0,974). Vokal olmayan öznitelikler arasında ise spektral merkez, bant genişliği ve azalma ortalamaları sıkı bir küme oluşturmaktadır (ikili r &gt; 0,94). Şekil 19, 47×47 boyutundaki tüm |r| matrisini görselleştirmekte; aşağı-sağda yer alan koyu çapraz-dışı bloklar vokal öznitelik ailesindeki yoğun fazlalığı yansıtmaktadır.</w:t>
       </w:r>
     </w:p>
     <w:p>
@@ -8385,7 +8283,7 @@
           <w:color w:val="333333"/>
           <w:sz w:val="17"/>
         </w:rPr>
-        <w:t>Şekil 19. 47 öznitelik arasında mutlak Pearson korelasyon ısı haritası (tüm 5.195 parça üzerinden). Koyu hücreler fazlalıklı çiftleri işaretlemektedir.</w:t>
+        <w:t>Şekil 19. 47 öznitelik arasında mutlak Pearson korelasyon ısı haritası.</w:t>
       </w:r>
     </w:p>
     <w:p>
@@ -8401,24 +8299,7 @@
           <w:color w:val="333333"/>
           <w:sz w:val="17"/>
         </w:rPr>
-        <w:t>(Absolute Pearson correlation heatmap between the 47 features across all 5,195 tracks. Dark cells mark redundant pairs.)</w:t>
-      </w:r>
-    </w:p>
-    <w:p>
-      <w:pPr>
-        <w:spacing w:before="160" w:after="40" w:line="240" w:lineRule="auto"/>
-        <w:jc w:val="left"/>
-        <w:keepNext/>
-      </w:pPr>
-      <w:r>
-        <w:rPr>
-          <w:rFonts w:ascii="Times New Roman" w:hAnsi="Times New Roman" w:cs="Times New Roman" w:eastAsia="Times New Roman"/>
-          <w:b/>
-          <w:i/>
-          <w:color w:val="333333"/>
-          <w:sz w:val="17"/>
-        </w:rPr>
-        <w:t>3.14. Kaç Öznitelik Gerçekten Gereklidir? (How Many Features Are Actually Needed?)</w:t>
+        <w:t>(Absolute Pearson correlation heatmap between the 47 features.)</w:t>
       </w:r>
     </w:p>
     <w:p>
@@ -8435,7 +8316,7 @@
           <w:color w:val="333333"/>
           <w:sz w:val="17"/>
         </w:rPr>
-        <w:t>Şekil 20, bir öznitelik çıkarma deneyi raporlamaktadır. Öznitelikler LightGBM önemine göre sıralanmakta ve ilk-N için N ∈ {1, 3, 5, 10, 15, 20, 30, 47} değerleri aynı 5-katlı çapraz doğrulama hattından geçirilmektedir. Eğri N = 10'a kadar diktir -doğruluk %59,8'den (N=1), %78,1 (N=5), %84,7 (N=10) değerlerine yükselmektedir- ve sonrasında plato yapar. N = 20'de doğruluk %88,0, N = 30'da %88,7'ye ulaşmakta ve tüm 47 özniteliğin kullanılması %88,5 vermektedir -bu N = 30 ile bir standart sapma içinde eşdeğerdir. Başka bir deyişle, önem sırasına göre sondaki on yedi öznitelik ölçülebilir ek doğruluk sağlamamaktadır. Pratik bir konuşlandırma, kalite kaybı olmadan bu uzun kuyruğu kesebilir.</w:t>
+        <w:t>Öznitelik sayısının model performansına etkisini değerlendirmek amacıyla kapsamlı bir öznitelik çıkarma deneyi gerçekleştirilmiştir. Bu deney kapsamında öznitelikler LightGBM önemine göre sıralanmış ve ilk-N öznitelik için N ∈ {1, 3, 5, 10, 15, 20, 30, 47} değerleri ile 5-katlı çapraz doğrulama tekrarlanmıştır. Şekil 20'de sunulan eğri, N = 10 değerine kadar dik bir artış göstermekte (doğruluk %59,8'den %84,7'ye yükselmekte) ve sonrasında belirgin bir plato sergilemektedir. N = 20 değerinde %88,0, N = 30 değerinde %88,7 doğruluk elde edilmiş; tüm 47 özniteliğin kullanılması ise %88,5 doğruluk vermiştir. Bu sonuç, N = 30 değeri ile bir standart sapma içerisinde eşdeğerdir. Diğer bir ifadeyle, önem sırasına göre sondaki on yedi öznitelik ölçülebilir bir ek doğruluk sağlamamaktadır. Bu bulgu, pratik bir konuşlandırma senaryosunda kalite kaybı yaşanmadan öznitelik vektörünün boyutunun azaltılabileceğini ortaya koymaktadır.</w:t>
       </w:r>
     </w:p>
     <w:p>
@@ -8493,7 +8374,7 @@
           <w:color w:val="333333"/>
           <w:sz w:val="17"/>
         </w:rPr>
-        <w:t>Şekil 20. LightGBM'in 5-katlı CV doğruluğunun, öneme göre sıralanmış korunan öznitelik sayısının bir fonksiyonu olarak değişimi. Plato yaklaşık 20 öznitelikte başlamakta; son 17 öznitelik ölçülen doğruluğu değiştirmemektedir.</w:t>
+        <w:t>Şekil 20. LightGBM modelinin 5-katlı çapraz doğrulama doğruluğunun kullanılan öznitelik sayısına bağlı değişimi.</w:t>
       </w:r>
     </w:p>
     <w:p>
@@ -8509,24 +8390,7 @@
           <w:color w:val="333333"/>
           <w:sz w:val="17"/>
         </w:rPr>
-        <w:t>(5-fold CV accuracy of LightGBM as a function of the number of features retained, ranked by importance. The plateau begins at roughly 20 features; the last 17 features do not change measured accuracy.)</w:t>
-      </w:r>
-    </w:p>
-    <w:p>
-      <w:pPr>
-        <w:spacing w:before="160" w:after="40" w:line="240" w:lineRule="auto"/>
-        <w:jc w:val="left"/>
-        <w:keepNext/>
-      </w:pPr>
-      <w:r>
-        <w:rPr>
-          <w:rFonts w:ascii="Times New Roman" w:hAnsi="Times New Roman" w:cs="Times New Roman" w:eastAsia="Times New Roman"/>
-          <w:b/>
-          <w:i/>
-          <w:color w:val="333333"/>
-          <w:sz w:val="17"/>
-        </w:rPr>
-        <w:t>3.15. Sınırlamalar (Limitations)</w:t>
+        <w:t>(5-fold cross-validation accuracy of LightGBM as a function of the number of features used.)</w:t>
       </w:r>
     </w:p>
     <w:p>
@@ -8543,7 +8407,7 @@
           <w:color w:val="333333"/>
           <w:sz w:val="17"/>
         </w:rPr>
-        <w:t>Açıkça kaydedilmesi gereken dört sınırlama bulunmaktadır. Birincisi, öznitelikler 15-30 saniye uzunluğundaki tam klipten çıkarılmaktadır; daha kısa klipler (&lt; 5 saniye) özellikle tempo ve vibrato istatistikleri için daha az güvenilir tahminler vermektedir, dolayısıyla sistem henüz canlı-mikrofon kısa-klip rejiminde değerlendirilmemiştir. İkincisi, veri kümesi yirmi türü kapsamakla birlikte, bazı türler (özellikle ambient ve lo-fi) yapay zekâ kısmında aşırı temsil edilmektedir; tür-stratifiye değerlendirme genellemeyi daha titiz olarak hesaba katacaktır. Üçüncüsü, düşmanca sağlamlık açıkça test edilmemiştir; MP3 sıkıştırma, perde kaydırma veya zaman gerdirme gibi sonradan işlemlerin tespit performansını azalttığı, vokoder izlerine dayanan sistemler için bilinmektedir (Afchar vd. [7]). AURIS, öznitelikleri vokoder izleri etrafında kurulu olmadığından bu etkiye daha az ciddi biçimde uğrayacaktır ama bağışıklık değildir. Dördüncüsü, §3.12'de raporlanan eğitim-CV farkları modelin dağılım kayışına duyarlı olduğunu göstermektedir; bu durum SONICS [23] ve FakeMusicCaps [24] gibi yeni kıyaslamalar üzerinde resmi bir tutulan değerlendirme ile teyit edilmelidir.</w:t>
+        <w:t>Önerilen sistemin sınırlamaları açık biçimde değerlendirildiğinde dört temel husus öne çıkmaktadır. Birincisi, öznitelikler 15-30 saniye uzunluğundaki tam ses kliplerinden çıkarılmakta olup daha kısa klipler (&lt; 5 saniye) özellikle tempo ve vibrato istatistikleri için daha az güvenilir tahminler üretebilmektedir; bu nedenle önerilen sistemin canlı mikrofon ve kısa klip senaryolarındaki performansı henüz değerlendirilmemiştir. İkincisi, kullanılan veri kümesi yirmi farklı tür kapsamakla birlikte bazı türlerin (özellikle ambient ve lo-fi) GenAI tarafında aşırı temsil edildiği gözlemlenmiştir; tür katmanlı bir değerlendirme, genelleme kapasitesinin daha titiz biçimde ölçülmesini sağlayacaktır. Üçüncüsü, düşmanca sağlamlık açıkça test edilmemiştir; MP3 sıkıştırma, perde kaydırma ve zaman gerdirme gibi sonradan işleme tekniklerinin vokoder izlerine dayanan sistemlerin performansını düşürdüğü Afchar vd. [7] tarafından raporlanmıştır. AURIS sistemi özniteliklerini vokoder izleri etrafında inşa etmediğinden bu etkiye daha az hassas olması beklenmektedir; ancak bu varsayımın deneysel olarak doğrulanması gerekmektedir. Dördüncüsü, eğitim ile çapraz doğrulama doğrulukları arasında tespit edilen fark, modelin dağılım kayışına karşı duyarlı olduğunu göstermektedir; bu durumun SONICS [23] ve FakeMusicCaps [24] gibi gelişmekte olan kıyaslamalar üzerinde yapılacak resmî değerlendirmelerle teyit edilmesi gerekmektedir.</w:t>
       </w:r>
     </w:p>
     <w:p>

</xml_diff>

<commit_message>
feat: update references in AURIS paper to use abbreviated author names for consistency
</commit_message>
<xml_diff>
--- a/docs/academic/paper/AURIS_paper_TR.docx
+++ b/docs/academic/paper/AURIS_paper_TR.docx
@@ -8492,7 +8492,7 @@
           <w:color w:val="333333"/>
           <w:sz w:val="16"/>
         </w:rPr>
-        <w:t>1. Copet J., Kreuk F., Gat I., Remez T., Kant D., Synnaeve G., Adi Y., Défossez A., Simple and Controllable Music Generation, Advances in Neural Information Processing Systems, 36, 2023. DOI: 10.48550/arXiv.2306.05284.</w:t>
+        <w:t>1. Copet J. vd., Simple and Controllable Music Generation, Advances in Neural Information Processing Systems, 36, 2023. DOI: 10.48550/arXiv.2306.05284.</w:t>
       </w:r>
     </w:p>
     <w:p>
@@ -8509,7 +8509,7 @@
           <w:color w:val="333333"/>
           <w:sz w:val="16"/>
         </w:rPr>
-        <w:t>2. Liu H., Chen Z., Yuan Y., Mei X., Liu X., Mandic D., Wang W., Plumbley M.D., AudioLDM: Text-to-Audio Generation with Latent Diffusion Models, Proceedings of the International Conference on Machine Learning (ICML 2023), 21450-21474, Honolulu, Hawaii, A.B.D., 23-29 Temmuz, 2023. DOI: 10.48550/arXiv.2301.12503.</w:t>
+        <w:t>2. Liu H. vd., AudioLDM: Text-to-Audio Generation with Latent Diffusion Models, Proceedings of the International Conference on Machine Learning (ICML 2023), 21450-21474, Honolulu, Hawaii, A.B.D., 23-29 Temmuz, 2023. DOI: 10.48550/arXiv.2301.12503.</w:t>
       </w:r>
     </w:p>
     <w:p>
@@ -8526,7 +8526,7 @@
           <w:color w:val="333333"/>
           <w:sz w:val="16"/>
         </w:rPr>
-        <w:t>3. Yi J., Fu R., Tao J., Nie S., Ma H., Wang C., Wang T., Tian Z., Bai Y., Fan C., ADD 2022: The First Audio Deep Synthesis Detection Challenge, Proceedings of the IEEE International Conference on Acoustics, Speech and Signal Processing (ICASSP 2022), 9216-9220, Singapur, 22-27 Mayıs, 2022. DOI: 10.1109/ICASSP43922.2022.9746939.</w:t>
+        <w:t>3. Yi J. vd., ADD 2022: The First Audio Deep Synthesis Detection Challenge, Proceedings of the IEEE International Conference on Acoustics, Speech and Signal Processing (ICASSP 2022), 9216-9220, Singapur, 22-27 Mayıs, 2022. DOI: 10.1109/ICASSP43922.2022.9746939.</w:t>
       </w:r>
     </w:p>
     <w:p>
@@ -8577,7 +8577,7 @@
           <w:color w:val="333333"/>
           <w:sz w:val="16"/>
         </w:rPr>
-        <w:t>6. Yi J., Wang C., Tao J., Zhang X., Zhang C.Y., Zhao Y., Audio Deepfake Detection: A Survey, arXiv preprint arXiv:2308.14970, 2023. DOI: 10.48550/arXiv.2308.14970.</w:t>
+        <w:t>6. Yi J. vd., Audio Deepfake Detection: A Survey, arXiv preprint arXiv:2308.14970, 2023. DOI: 10.48550/arXiv.2308.14970.</w:t>
       </w:r>
     </w:p>
     <w:p>
@@ -8645,7 +8645,7 @@
           <w:color w:val="333333"/>
           <w:sz w:val="16"/>
         </w:rPr>
-        <w:t>10. Ke G., Meng Q., Finley T., Wang T., Chen W., Ma W., Ye Q., Liu T.Y., LightGBM: A Highly Efficient Gradient Boosting Decision Tree, Advances in Neural Information Processing Systems 30 (NIPS 2017), 3149-3157, Long Beach, California, A.B.D., 4-9 Aralık, 2017.</w:t>
+        <w:t>10. Ke G. vd., LightGBM: A Highly Efficient Gradient Boosting Decision Tree, Advances in Neural Information Processing Systems 30 (NIPS 2017), 3149-3157, Long Beach, California, A.B.D., 4-9 Aralık, 2017.</w:t>
       </w:r>
     </w:p>
     <w:p>
@@ -8730,7 +8730,7 @@
           <w:color w:val="333333"/>
           <w:sz w:val="16"/>
         </w:rPr>
-        <w:t>15. Wu Y., Chen K., Zhang T., Hui Y., Berg-Kirkpatrick T., Dubnov S., Large-Scale Contrastive Language-Audio Pretraining with Feature Fusion and Keyword-to-Caption Augmentation, Proceedings of the IEEE International Conference on Acoustics, Speech and Signal Processing (ICASSP 2023), 1-5, Rhodes, Yunanistan, 4-10 Haziran, 2023. DOI: 10.1109/ICASSP49357.2023.10095969.</w:t>
+        <w:t>15. Wu Y. vd., Large-Scale Contrastive Language-Audio Pretraining with Feature Fusion and Keyword-to-Caption Augmentation, Proceedings of the IEEE International Conference on Acoustics, Speech and Signal Processing (ICASSP 2023), 1-5, Rhodes, Yunanistan, 4-10 Haziran, 2023. DOI: 10.1109/ICASSP49357.2023.10095969.</w:t>
       </w:r>
     </w:p>
     <w:p>
@@ -8951,7 +8951,7 @@
           <w:color w:val="333333"/>
           <w:sz w:val="16"/>
         </w:rPr>
-        <w:t>28. McFee B., Raffel C., Liang D., Ellis D.P.W., McVicar M., Battenberg E., Nieto O., librosa: Audio and Music Signal Analysis in Python, Proceedings of the 14th Python in Science Conference (SciPy 2015), 18-24, Austin, Texas, A.B.D., 6-12 Temmuz, 2015. DOI: 10.25080/Majora-7b98e3ed-003.</w:t>
+        <w:t>28. McFee B. vd., librosa: Audio and Music Signal Analysis in Python, Proceedings of the 14th Python in Science Conference (SciPy 2015), 18-24, Austin, Texas, A.B.D., 6-12 Temmuz, 2015. DOI: 10.25080/Majora-7b98e3ed-003.</w:t>
       </w:r>
     </w:p>
     <w:p>
@@ -8968,7 +8968,7 @@
           <w:color w:val="333333"/>
           <w:sz w:val="16"/>
         </w:rPr>
-        <w:t>29. Pedregosa F., Varoquaux G., Gramfort A., Michel V., Thirion B., Grisel O., Blondel M., Prettenhofer P., Weiss R., Dubourg V., Vanderplas J., Passos A., Cournapeau D., Brucher M., Perrot M., Duchesnay E., Scikit-learn: Machine Learning in Python, Journal of Machine Learning Research, 12, 2825-2830, 2011.</w:t>
+        <w:t>29. Pedregosa F. vd., Scikit-learn: Machine Learning in Python, Journal of Machine Learning Research, 12, 2825-2830, 2011.</w:t>
       </w:r>
     </w:p>
     <w:p>

</xml_diff>

<commit_message>
feat: update line spacing to 1.5 for improved readability in AURIS paper
</commit_message>
<xml_diff>
--- a/docs/academic/paper/AURIS_paper_TR.docx
+++ b/docs/academic/paper/AURIS_paper_TR.docx
@@ -13,7 +13,7 @@
           <w:b/>
           <w:i w:val="0"/>
           <w:color w:val="333333"/>
-          <w:sz w:val="27"/>
+          <w:sz w:val="28"/>
         </w:rPr>
         <w:t>AURIS: Çoklu-Model Topluluk Yaklaşımı ile Yapay Zekâ Tarafından Üretilen Müziklerin Tespiti</w:t>
       </w:r>
@@ -29,14 +29,30 @@
           <w:b/>
           <w:i w:val="0"/>
           <w:color w:val="333333"/>
-          <w:sz w:val="17"/>
+          <w:sz w:val="20"/>
         </w:rPr>
-        <w:t>Hasan Arthur Altuntaş</w:t>
+        <w:t>Hasan Arthur Altuntaş*</w:t>
       </w:r>
     </w:p>
     <w:p>
       <w:pPr>
-        <w:spacing w:after="320"/>
+        <w:spacing w:after="40"/>
+        <w:jc w:val="center"/>
+      </w:pPr>
+      <w:r>
+        <w:rPr>
+          <w:rFonts w:ascii="Times New Roman" w:hAnsi="Times New Roman" w:cs="Times New Roman" w:eastAsia="Times New Roman"/>
+          <w:b w:val="0"/>
+          <w:i/>
+          <w:color w:val="333333"/>
+          <w:sz w:val="18"/>
+        </w:rPr>
+        <w:t>Düzce Üniversitesi, Mühendislik Fakültesi, Bilgisayar Mühendisliği Bölümü, 81620, Düzce, Türkiye</w:t>
+      </w:r>
+    </w:p>
+    <w:p>
+      <w:pPr>
+        <w:spacing w:after="40"/>
         <w:jc w:val="center"/>
       </w:pPr>
       <w:r>
@@ -45,14 +61,30 @@
           <w:b w:val="0"/>
           <w:i w:val="0"/>
           <w:color w:val="333333"/>
-          <w:sz w:val="15"/>
+          <w:sz w:val="18"/>
         </w:rPr>
-        <w:t>Düzce Üniversitesi, Mühendislik Fakültesi, Bilgisayar Mühendisliği Bölümü, 81620, Düzce, Türkiye</w:t>
+        <w:t>ORCID: 0009-0002-8302-7657</w:t>
       </w:r>
     </w:p>
     <w:p>
       <w:pPr>
-        <w:spacing w:before="160" w:after="40" w:line="240" w:lineRule="auto"/>
+        <w:spacing w:after="320"/>
+        <w:jc w:val="center"/>
+      </w:pPr>
+      <w:r>
+        <w:rPr>
+          <w:rFonts w:ascii="Times New Roman" w:hAnsi="Times New Roman" w:cs="Times New Roman" w:eastAsia="Times New Roman"/>
+          <w:b w:val="0"/>
+          <w:i/>
+          <w:color w:val="333333"/>
+          <w:sz w:val="18"/>
+        </w:rPr>
+        <w:t>*Sorumlu Yazar / Corresponding Author: hasannarthurrr@gmail.com</w:t>
+      </w:r>
+    </w:p>
+    <w:p>
+      <w:pPr>
+        <w:spacing w:before="160" w:after="40" w:line="360" w:lineRule="auto"/>
         <w:jc w:val="left"/>
         <w:keepNext/>
       </w:pPr>
@@ -62,7 +94,7 @@
           <w:b/>
           <w:i/>
           <w:color w:val="333333"/>
-          <w:sz w:val="17"/>
+          <w:sz w:val="18"/>
         </w:rPr>
         <w:t>Ö N E   Ç I K A N L A R</w:t>
       </w:r>
@@ -78,7 +110,7 @@
           <w:b w:val="0"/>
           <w:i w:val="0"/>
           <w:color w:val="333333"/>
-          <w:sz w:val="17"/>
+          <w:sz w:val="18"/>
         </w:rPr>
         <w:t>• 5.195 müzik örneği ve 47 boyutlu akustik öznitelik vektörü ile yapay zekâ tarafından üretilen müziği insan kompozisyonundan ayırt eden uçtan-uca bir sistem önerilmiştir.</w:t>
       </w:r>
@@ -94,7 +126,7 @@
           <w:b w:val="0"/>
           <w:i w:val="0"/>
           <w:color w:val="333333"/>
-          <w:sz w:val="17"/>
+          <w:sz w:val="18"/>
         </w:rPr>
         <w:t>• Yedi makine öğrenmesi ve dört derin öğrenme algoritması, ortak bir 5-katlı çapraz doğrulama protokolü altında karşılaştırılmıştır.</w:t>
       </w:r>
@@ -110,7 +142,7 @@
           <w:b w:val="0"/>
           <w:i w:val="0"/>
           <w:color w:val="333333"/>
-          <w:sz w:val="17"/>
+          <w:sz w:val="18"/>
         </w:rPr>
         <w:t>• LightGBM, %95,48 ROC-AUC değeri ile en yüksek performansı sergilemiş; her kat arasında yalnızca ±0,0023 standart sapma ile en kararlı modeli oluşturmuştur.</w:t>
       </w:r>
@@ -126,14 +158,14 @@
           <w:b w:val="0"/>
           <w:i w:val="0"/>
           <w:color w:val="333333"/>
-          <w:sz w:val="17"/>
+          <w:sz w:val="18"/>
         </w:rPr>
         <w:t>• Spektral düzlük (spectral flatness) standart sapması, yapay zekâ-insan ayrımı için en bilgilendirici tek öznitelik olarak tespit edilmiştir.</w:t>
       </w:r>
     </w:p>
     <w:p>
       <w:pPr>
-        <w:spacing w:before="160" w:after="40" w:line="240" w:lineRule="auto"/>
+        <w:spacing w:before="160" w:after="40" w:line="360" w:lineRule="auto"/>
         <w:jc w:val="left"/>
         <w:keepNext/>
       </w:pPr>
@@ -143,14 +175,14 @@
           <w:b/>
           <w:i/>
           <w:color w:val="333333"/>
-          <w:sz w:val="17"/>
+          <w:sz w:val="18"/>
         </w:rPr>
         <w:t>Makale Bilgileri</w:t>
       </w:r>
     </w:p>
     <w:p>
       <w:pPr>
-        <w:spacing w:line="240" w:lineRule="auto" w:before="0" w:after="120"/>
+        <w:spacing w:line="360" w:lineRule="auto" w:before="0" w:after="120"/>
         <w:ind w:firstLine="283"/>
         <w:jc w:val="both"/>
       </w:pPr>
@@ -160,14 +192,14 @@
           <w:b w:val="0"/>
           <w:i w:val="0"/>
           <w:color w:val="333333"/>
-          <w:sz w:val="17"/>
+          <w:sz w:val="18"/>
         </w:rPr>
         <w:t>Araştırma Makalesi  ·  Geliş: 20.05.2026  ·  Anahtar Kelimeler: Yapay zekâ tarafından üretilen müzik, derin öğrenme, gradyan artırma, topluluk öğrenmesi, ses sınıflandırması, spektral düzlük.</w:t>
       </w:r>
     </w:p>
     <w:p>
       <w:pPr>
-        <w:spacing w:before="160" w:after="40" w:line="240" w:lineRule="auto"/>
+        <w:spacing w:before="160" w:after="40" w:line="360" w:lineRule="auto"/>
         <w:jc w:val="left"/>
         <w:keepNext/>
       </w:pPr>
@@ -177,14 +209,14 @@
           <w:b/>
           <w:i/>
           <w:color w:val="333333"/>
-          <w:sz w:val="17"/>
+          <w:sz w:val="18"/>
         </w:rPr>
         <w:t>ÖZ</w:t>
       </w:r>
     </w:p>
     <w:p>
       <w:pPr>
-        <w:spacing w:line="240" w:lineRule="auto" w:before="0" w:after="120"/>
+        <w:spacing w:line="360" w:lineRule="auto" w:before="0" w:after="120"/>
         <w:ind w:firstLine="283"/>
         <w:jc w:val="both"/>
       </w:pPr>
@@ -194,14 +226,14 @@
           <w:b w:val="0"/>
           <w:i w:val="0"/>
           <w:color w:val="333333"/>
-          <w:sz w:val="17"/>
+          <w:sz w:val="18"/>
         </w:rPr>
         <w:t>Üretken Yapay Zekâ (Generative Artificial Intelligence-GenAI) tabanlı metinden müziğe (text-to-music) üretim sistemlerinin -Suno, Udio ve MusicGen başta olmak üzere- son üç yıl içerisindeki hızlı yaygınlaşması, üretilen müzik parçalarının insan eliyle bestelenmiş kayıtlardan ayırt edilmesini bir tespit problemi olarak gündeme getirmiştir. Bu problem; telif hakkı atıflandırması, çevrimiçi akış platformlarının içerik bütünlüğü ve sanatçıların ekonomik hakları açısından önemli bir araştırma konusu hâline gelmiştir. Bu çalışmada, 47 boyutlu elle tasarlanmış bir akustik öznitelik vektörü ile yedi makine öğrenmesi (Machine Learning-ML) ve dört derin öğrenme (Deep Learning-DL) algoritmasından oluşan on bir modelli bir topluluk öğrenmesi yaklaşımını birleştiren AURIS adlı yenilikçi bir sistem önerilmektedir. Önerilen sistemin eğitimi ve değerlendirilmesi için, on iki veya daha fazla GenAI üretici sisteminden ve birden çok insan kaynağından (GTZAN, FMA, SleepyJesse kapakları) derlenen 5.195 örneklik halka açık bir veri kümesi kullanılmıştır. Önerilen sistem kapsamında değerlendirilen on bir model arasından LightGBM (Light Gradient Boosting Machine), %95,48 ROC-AUC değeri ve ±0,0023 standart sapma ile hem en yüksek ortalama hem de katlar-arası en düşük varyansı bir araya getirerek en başarılı sonucu elde etmiştir. Derin Çok Katmanlı Algılayıcı (Deep Multi-Layer Perceptron-DMLP) %95,42 ROC-AUC ile çok yakın bir ikinci sırayı almıştır. Spektral düzlük (spectral flatness) standart sapması özniteliği, öznitelik önem sıralamasında ilk sırayı belirgin bir farkla elde etmiştir. Youden'in J istatistiği ile optimize edilen θ* = 0,4316 karar eşiği, varsayılan 0,5 eşiğine kıyasla dengeli doğruluğu sistematik biçimde iyileştirmiştir. Brier skoru 0,083 olarak ölçülmüş ve önerilen modelin olasılık çıktılarının iyi kalibre olduğu doğrulanmıştır. Tanılayıcı analiz sonuçları, ağaç tabanlı tüm modellerin eğitim ve çapraz doğrulama doğrulukları arasında 8-14 puanlık bir fark sergilediğini ve mevcut 47 özniteliğin yaklaşık 17 tanesinin ölçülebilir bir ek doğruluk sağlamadığını ortaya koymuştur.</w:t>
       </w:r>
     </w:p>
     <w:p>
       <w:pPr>
-        <w:spacing w:before="160" w:after="40" w:line="240" w:lineRule="auto"/>
+        <w:spacing w:before="160" w:after="40" w:line="360" w:lineRule="auto"/>
         <w:jc w:val="left"/>
         <w:keepNext/>
       </w:pPr>
@@ -211,14 +243,14 @@
           <w:b/>
           <w:i/>
           <w:color w:val="333333"/>
-          <w:sz w:val="17"/>
+          <w:sz w:val="18"/>
         </w:rPr>
         <w:t>Anahtar Kelimeler</w:t>
       </w:r>
     </w:p>
     <w:p>
       <w:pPr>
-        <w:spacing w:line="240" w:lineRule="auto" w:before="0" w:after="120"/>
+        <w:spacing w:line="360" w:lineRule="auto" w:before="0" w:after="120"/>
         <w:ind w:firstLine="283"/>
         <w:jc w:val="both"/>
       </w:pPr>
@@ -228,7 +260,7 @@
           <w:b w:val="0"/>
           <w:i w:val="0"/>
           <w:color w:val="333333"/>
-          <w:sz w:val="17"/>
+          <w:sz w:val="18"/>
         </w:rPr>
         <w:t>Yapay zekâ tarafından üretilen müzik · Derin öğrenme · Gradyan artırma · Topluluk öğrenmesi · Ses sınıflandırması · Spektral düzlük</w:t>
       </w:r>
@@ -251,7 +283,7 @@
     </w:p>
     <w:p>
       <w:pPr>
-        <w:spacing w:before="160" w:after="40" w:line="240" w:lineRule="auto"/>
+        <w:spacing w:before="160" w:after="40" w:line="360" w:lineRule="auto"/>
         <w:jc w:val="left"/>
         <w:keepNext/>
       </w:pPr>
@@ -261,7 +293,7 @@
           <w:b/>
           <w:i/>
           <w:color w:val="333333"/>
-          <w:sz w:val="17"/>
+          <w:sz w:val="18"/>
         </w:rPr>
         <w:t>H I G H L I G H T S</w:t>
       </w:r>
@@ -277,7 +309,7 @@
           <w:b w:val="0"/>
           <w:i/>
           <w:color w:val="333333"/>
-          <w:sz w:val="17"/>
+          <w:sz w:val="18"/>
         </w:rPr>
         <w:t>• An end-to-end system distinguishing AI-generated music from human composition, using a 47-dimensional acoustic feature vector and 5,195 audio samples.</w:t>
       </w:r>
@@ -293,7 +325,7 @@
           <w:b w:val="0"/>
           <w:i/>
           <w:color w:val="333333"/>
-          <w:sz w:val="17"/>
+          <w:sz w:val="18"/>
         </w:rPr>
         <w:t>• Seven machine learning and four deep learning algorithms compared under a unified 5-fold cross-validation protocol.</w:t>
       </w:r>
@@ -309,7 +341,7 @@
           <w:b w:val="0"/>
           <w:i/>
           <w:color w:val="333333"/>
-          <w:sz w:val="17"/>
+          <w:sz w:val="18"/>
         </w:rPr>
         <w:t>• LightGBM achieves the top performance with 95.48% ROC-AUC and the lowest cross-fold variance (±0.0023) in the entire pool.</w:t>
       </w:r>
@@ -325,14 +357,14 @@
           <w:b w:val="0"/>
           <w:i/>
           <w:color w:val="333333"/>
-          <w:sz w:val="17"/>
+          <w:sz w:val="18"/>
         </w:rPr>
         <w:t>• Spectral flatness standard deviation emerges as the single most informative feature for the AI-versus-human distinction.</w:t>
       </w:r>
     </w:p>
     <w:p>
       <w:pPr>
-        <w:spacing w:before="160" w:after="40" w:line="240" w:lineRule="auto"/>
+        <w:spacing w:before="160" w:after="40" w:line="360" w:lineRule="auto"/>
         <w:jc w:val="left"/>
         <w:keepNext/>
       </w:pPr>
@@ -342,14 +374,14 @@
           <w:b/>
           <w:i/>
           <w:color w:val="333333"/>
-          <w:sz w:val="17"/>
+          <w:sz w:val="18"/>
         </w:rPr>
         <w:t>ABSTRACT</w:t>
       </w:r>
     </w:p>
     <w:p>
       <w:pPr>
-        <w:spacing w:line="240" w:lineRule="auto" w:before="0" w:after="120"/>
+        <w:spacing w:line="360" w:lineRule="auto" w:before="0" w:after="120"/>
         <w:ind w:firstLine="283"/>
         <w:jc w:val="both"/>
       </w:pPr>
@@ -359,14 +391,14 @@
           <w:b w:val="0"/>
           <w:i w:val="0"/>
           <w:color w:val="333333"/>
-          <w:sz w:val="17"/>
+          <w:sz w:val="18"/>
         </w:rPr>
         <w:t>The proliferation of text-to-music generators such as Suno, Udio and MusicGen has raised a detection problem of practical importance for copyright attribution, streaming-platform integrity and artist economics. This paper proposes AURIS, a system that couples a 47-dimensional handcrafted acoustic feature vector with an ensemble of eleven classifiers. The models are trained on a dataset of 5,195 samples drawn from twelve or more AI generation systems and multiple human sources (GTZAN, FMA, SleepyJesse covers) under 5-fold cross-validation. LightGBM achieves the top ROC-AUC of 0.9548 (±0.0023), combining the best mean with the lowest cross-fold variance; Deep MLP follows narrowly at 0.9542. Spectral-flatness standard deviation ranks first in feature importance. A Youden-J optimised decision threshold of θ* = 0.4316 improves balanced accuracy over the default 0.5 cutoff. A Brier score of 0.083 confirms that the probability outputs are well calibrated. Diagnostic analysis shows an 8-14 point train-CV accuracy gap for all tree-based models and reveals that roughly 17 of the 47 features contribute no measurable accuracy.</w:t>
       </w:r>
     </w:p>
     <w:p>
       <w:pPr>
-        <w:spacing w:before="160" w:after="40" w:line="240" w:lineRule="auto"/>
+        <w:spacing w:before="160" w:after="40" w:line="360" w:lineRule="auto"/>
         <w:jc w:val="left"/>
         <w:keepNext/>
       </w:pPr>
@@ -376,14 +408,14 @@
           <w:b/>
           <w:i/>
           <w:color w:val="333333"/>
-          <w:sz w:val="17"/>
+          <w:sz w:val="18"/>
         </w:rPr>
         <w:t>Keywords</w:t>
       </w:r>
     </w:p>
     <w:p>
       <w:pPr>
-        <w:spacing w:line="240" w:lineRule="auto" w:before="0" w:after="120"/>
+        <w:spacing w:line="360" w:lineRule="auto" w:before="0" w:after="120"/>
         <w:ind w:firstLine="283"/>
         <w:jc w:val="both"/>
       </w:pPr>
@@ -393,7 +425,7 @@
           <w:b w:val="0"/>
           <w:i w:val="0"/>
           <w:color w:val="333333"/>
-          <w:sz w:val="17"/>
+          <w:sz w:val="18"/>
         </w:rPr>
         <w:t>AI-generated music · Deep learning · Gradient boosting · Ensemble learning · Audio classification · Spectral flatness</w:t>
       </w:r>
@@ -402,7 +434,7 @@
       <w:pPr>
         <w:sectPr>
           <w:pgSz w:w="11906" w:h="16838"/>
-          <w:pgMar w:top="1582" w:right="850" w:bottom="278" w:left="850" w:header="720" w:footer="720" w:gutter="0"/>
+          <w:pgMar w:top="1417" w:right="1417" w:bottom="1417" w:left="1417" w:header="720" w:footer="720" w:gutter="0"/>
           <w:cols w:space="720"/>
           <w:docGrid w:linePitch="360"/>
         </w:sectPr>
@@ -410,7 +442,7 @@
     </w:p>
     <w:p>
       <w:pPr>
-        <w:spacing w:before="240" w:after="80" w:line="240" w:lineRule="auto"/>
+        <w:spacing w:before="240" w:after="80" w:line="360" w:lineRule="auto"/>
         <w:jc w:val="left"/>
         <w:keepNext/>
       </w:pPr>
@@ -420,14 +452,14 @@
           <w:b/>
           <w:i w:val="0"/>
           <w:color w:val="333333"/>
-          <w:sz w:val="17"/>
+          <w:sz w:val="18"/>
         </w:rPr>
         <w:t>1. Giriş (Introduction)</w:t>
       </w:r>
     </w:p>
     <w:p>
       <w:pPr>
-        <w:spacing w:line="240" w:lineRule="auto" w:before="0" w:after="120"/>
+        <w:spacing w:line="360" w:lineRule="auto" w:before="0" w:after="120"/>
         <w:ind w:firstLine="283"/>
         <w:jc w:val="both"/>
       </w:pPr>
@@ -437,14 +469,14 @@
           <w:b w:val="0"/>
           <w:i w:val="0"/>
           <w:color w:val="333333"/>
-          <w:sz w:val="17"/>
+          <w:sz w:val="18"/>
         </w:rPr>
         <w:t>Üretken Yapay Zekâ (Generative Artificial Intelligence-GenAI) sistemlerinin son üç yıl içerisinde araştırma laboratuvarlarından tüketici uygulamalarına doğru yaşadığı hızlı geçiş, metinden müziğe (text-to-music) üretim alanında belirgin bir dönüşümü beraberinde getirmiştir. Suno (sürüm 3-5), Udio, Meta tarafından geliştirilen MusicGen [1] sistemi ve AudioLDM [2] gibi difüzyon tabanlı modeller, kullanıcının sağladığı kısa bir metin istemi ile dakikalar mertebesinde tam uzunlukta müzik parçaları üretebilme kapasitesine ulaşmıştır. Üretilen bu parçaların, deneyimsiz bir dinleyici tarafından insan eliyle bestelenmiş kayıtlardan ayırt edilmesi çoğu durumda mümkün olmamaktadır. Bu gelişme, telif hakkı atıflandırması, çevrimiçi akış platformlarının içerik bütünlüğü, oturum müzisyenlerinin ekonomik hakları ve eğitimcilerin yazarlık değerlendirmesi gibi birçok kritik konuyu doğrudan etkilemektedir.</w:t>
       </w:r>
     </w:p>
     <w:p>
       <w:pPr>
-        <w:spacing w:line="240" w:lineRule="auto" w:before="0" w:after="120"/>
+        <w:spacing w:line="360" w:lineRule="auto" w:before="0" w:after="120"/>
         <w:ind w:firstLine="283"/>
         <w:jc w:val="both"/>
       </w:pPr>
@@ -454,14 +486,14 @@
           <w:b w:val="0"/>
           <w:i w:val="0"/>
           <w:color w:val="333333"/>
-          <w:sz w:val="17"/>
+          <w:sz w:val="18"/>
         </w:rPr>
         <w:t>Konuşma için ses derin sahte tespiti (audio deepfake detection), ADD 2022 [3] yarışmaları ve WaveFake [4] gibi büyük ölçekli veri kümeleri sayesinde aktif bir araştırma alanı hâline gelmiştir. Buna karşın, GenAI ile üretilen müziğin tespiti henüz benzer bir olgunluğa ulaşamamıştır. Bunun temel nedeni, müziğin konuşmadan farklı olarak sabit bir sözlüğe, doğrulanabilir bir konuşmacı kimliğine veya prozodi izine sahip olmamasıdır. Müzik; harmonik karmaşıklık, çokseslilik, perküsyon ve insan stüdyoları ile sentetik üretim hatları arasında geniş bir varyasyon gösteren kayıt artefaktları içermektedir. Konu üzerinde gerçekleştirilen güncel tarama çalışmaları [5,6], alanın henüz oluşum aşamasında olduğunu belirtmekte ve üretici modeller arası genellemeyi -yani eğitim aşamasında görülmemiş sistemler tarafından üretilen parçaları doğru biçimde tespit edebilme yetisini- alanın birincil açık problemi olarak vurgulamaktadır [5].</w:t>
       </w:r>
     </w:p>
     <w:p>
       <w:pPr>
-        <w:spacing w:line="240" w:lineRule="auto" w:before="0" w:after="120"/>
+        <w:spacing w:line="360" w:lineRule="auto" w:before="0" w:after="120"/>
         <w:ind w:firstLine="283"/>
         <w:jc w:val="both"/>
       </w:pPr>
@@ -471,14 +503,14 @@
           <w:b w:val="0"/>
           <w:i w:val="0"/>
           <w:color w:val="333333"/>
-          <w:sz w:val="17"/>
+          <w:sz w:val="18"/>
         </w:rPr>
         <w:t>Yakın tarihli iki örnek çalışma, bu alandaki dengesizliği açık biçimde yansıtmaktadır. Afchar vd. tarafından öne sürülen çalışmada [7], oto-kodlayıcı (auto-encoder) artefaktlarını tanımak amacıyla eğitilen bir tespit sisteminin, nöral vokoderlerin (neural vocoder) bıraktığı spektral kalıntıları kullanarak %99,8 doğruluk değerine ulaşabildiği gösterilmiştir; ancak aynı sistemin, MP3 sıkıştırma ve perde kaydırma (pitch shifting) gibi basit ses manipülasyonları altında performansının ciddi biçimde düştüğü raporlanmıştır. Kim ve Go [8] ise kısa müzik segmentlerini önceden eğitilmiş bir kodlayıcı ile gömüp bunları bir Dönüştürücü (Transformer) başlığı ile birleştirerek bir müzik parçasının tamamındaki yapısal örüntüleri yakalayan Segment Transformer modelini önermiştir. Her iki yaklaşım da aynı temel kabulü paylaşmaktadır: hiçbir tek öznitelik ailesi tek başına farklı üretici sistemlere karşı yeterince sağlam değildir.</w:t>
       </w:r>
     </w:p>
     <w:p>
       <w:pPr>
-        <w:spacing w:line="240" w:lineRule="auto" w:before="0" w:after="120"/>
+        <w:spacing w:line="360" w:lineRule="auto" w:before="0" w:after="120"/>
         <w:ind w:firstLine="283"/>
         <w:jc w:val="both"/>
       </w:pPr>
@@ -488,7 +520,7 @@
           <w:b w:val="0"/>
           <w:i w:val="0"/>
           <w:color w:val="333333"/>
-          <w:sz w:val="17"/>
+          <w:sz w:val="18"/>
         </w:rPr>
         <w:t>Bu çalışmada önerilen AURIS sistemi, söz konusu iki uç arasında dengeli bir konumda yer almaktadır. Sistem, tek bir temsile bağlı kalmak yerine; spektral, zamansal, harmonik ve vokal davranışı özetleyen 47 boyutlu elle tasarlanmış bir öznitelik vektörü ile kasıtlı biçimde heterojen on bir sınıflandırıcıdan oluşan bir topluluğu birleştirmektedir. Bu yaklaşımın amacı iki yönlüdür: (𝑖) birden çok GenAI üreticisi sisteminde rekabetçi tespit doğruluğu elde edebilmek ve (𝑖𝑖) tüketici donanımı üzerinde konuşlandırılabilir, yorumlanabilir ve güvenilir bir model elde edebilmek. Bu çalışmanın temel katkıları şu şekilde özetlenebilir:</w:t>
       </w:r>
@@ -505,7 +537,7 @@
           <w:b w:val="0"/>
           <w:i w:val="0"/>
           <w:color w:val="333333"/>
-          <w:sz w:val="17"/>
+          <w:sz w:val="18"/>
         </w:rPr>
         <w:t>(𝑖) Suno, Udio, MusicGen, AudioLDM2 ve diğer altı üretici sistem dahil olmak üzere on iki GenAI üreticisinden ve birden çok insan kaynağından (GTZAN, FMA, SleepyJesse kapakları) derlenen 5.195 örneklik, halka açık ve çoğaltılabilir nitelikte bir veri kümesinin oluşturulması;</w:t>
       </w:r>
@@ -522,7 +554,7 @@
           <w:b w:val="0"/>
           <w:i w:val="0"/>
           <w:color w:val="333333"/>
-          <w:sz w:val="17"/>
+          <w:sz w:val="18"/>
         </w:rPr>
         <w:t>(𝑖𝑖) Yedi ML algoritmasının (Lojistik Regresyon, Rastgele Orman, Gradyan Artırma, Destek Vektör Makineleri (Support Vector Machines-SVM), Çok Katmanlı Algılayıcı (Multi-Layer Perceptron-MLP), XGBoost [9] ve LightGBM [10]) ve dört DL mimarisinin (DMLP, Tek Boyutlu Evrişimli Sinir Ağı (One-Dimensional Convolutional Neural Network-1B-ESA), Artık MLP (Residual MLP), Dikkat MLP (Attention MLP)) ortak bir 5-katlı çapraz doğrulama protokolü altında karşılaştırmalı olarak değerlendirilmesi; değerlendirme sonucunda LightGBM modelinin %95,48 ROC-AUC değeri ve katlar-arası ±0,0023 standart sapma ile en başarılı sonucu sağladığının gösterilmesi;</w:t>
       </w:r>
@@ -539,14 +571,14 @@
           <w:b w:val="0"/>
           <w:i w:val="0"/>
           <w:color w:val="333333"/>
-          <w:sz w:val="17"/>
+          <w:sz w:val="18"/>
         </w:rPr>
         <w:t>(𝑖𝑖𝑖) Spektral düzlük standart sapması özniteliğinin, yapay zekâ ile insan müziği ayrımı için en bilgilendirici öznitelik olduğunu gösteren Shapley Katma Açıklamaları (Shapley Additive exPlanations-SHAP) [11] tabanlı bir yorumlanabilirlik analizinin sunulması; elde edilen bu sonucun, GenAI tarafından üretilen ses ile kaydedilmiş ses arasındaki spektral fark üzerinden açıklanabilir olduğunun tartışılması.</w:t>
       </w:r>
     </w:p>
     <w:p>
       <w:pPr>
-        <w:spacing w:line="240" w:lineRule="auto" w:before="0" w:after="120"/>
+        <w:spacing w:line="360" w:lineRule="auto" w:before="0" w:after="120"/>
         <w:ind w:firstLine="283"/>
         <w:jc w:val="both"/>
       </w:pPr>
@@ -556,14 +588,14 @@
           <w:b w:val="0"/>
           <w:i w:val="0"/>
           <w:color w:val="333333"/>
-          <w:sz w:val="17"/>
+          <w:sz w:val="18"/>
         </w:rPr>
         <w:t>Bu makalenin geri kalanı şu şekilde yapılandırılmıştır: 1.1-1.5 alt bölümleri kapsamında ses derin sahte tespiti, Dönüştürücü tabanlı ses temsilleri, ses sınıflandırma için topluluk yöntemleri ve GenAI müzik tespiti alanındaki güncel literatür kapsamlı biçimde gözden geçirilmektedir. 2. Bölümde önerilen sistemin geliştirilmesi sürecinde kullanılan veri kümesi, öznitelik çıkarma boru hattı, on bir sınıflandırma modeli ve eğitim protokolü ayrıntılı olarak açıklanmaktadır. 3. Bölümde deneysel sonuçlar tüm modeller üzerinde karşılaştırmalı biçimde sunulmakta; öznitelik önemi, kalibrasyon ve modelin sınırlamaları üzerine tartışmalar yapılmaktadır. Son olarak 4. Bölüm, çalışmanın temel bulgularını özetleyerek gelecek araştırmalar için öngörülen yönleri belirtmektedir. Önerilen sistem, https://huggingface.co/spaces/Rtur2003/AURIS adresinde halka açık olarak kullanıma sunulmuştur.</w:t>
       </w:r>
     </w:p>
     <w:p>
       <w:pPr>
-        <w:spacing w:before="160" w:after="40" w:line="240" w:lineRule="auto"/>
+        <w:spacing w:before="160" w:after="40" w:line="360" w:lineRule="auto"/>
         <w:jc w:val="left"/>
         <w:keepNext/>
       </w:pPr>
@@ -573,14 +605,14 @@
           <w:b/>
           <w:i/>
           <w:color w:val="333333"/>
-          <w:sz w:val="17"/>
+          <w:sz w:val="18"/>
         </w:rPr>
         <w:t>1.1. Konuşma için Ses Derin Sahte Tespiti (Audio Deepfake Detection for Speech)</w:t>
       </w:r>
     </w:p>
     <w:p>
       <w:pPr>
-        <w:spacing w:line="240" w:lineRule="auto" w:before="0" w:after="120"/>
+        <w:spacing w:line="360" w:lineRule="auto" w:before="0" w:after="120"/>
         <w:ind w:firstLine="283"/>
         <w:jc w:val="both"/>
       </w:pPr>
@@ -590,14 +622,14 @@
           <w:b w:val="0"/>
           <w:i w:val="0"/>
           <w:color w:val="333333"/>
-          <w:sz w:val="17"/>
+          <w:sz w:val="18"/>
         </w:rPr>
         <w:t>Konuşma için ses derin sahte tespiti, GenAI ile üretilen müzik tespiti çalışmaları açısından doğrudan örnek alınan en olgun komşu alanı oluşturmaktadır. Yi vd. tarafından öne sürülen ADD 2022 [3] yarışmasında, bu alan resmî biçimde bir topluluk değerlendirme problemi olarak kurulmuş ve düşük kaliteli sahte ses (LF), kısmî sahte ses (PF) ile oyun tabanlı algılama (FG) olmak üzere üç ayrı parça tanımlanmıştır. Martín-Doñas ve Álvarez tarafından öne sürülen Vicomtech sistemi [12], önceden eğitilmiş wav2vec2 [13] öznitelik çıkarıcısının üzerine bir sınıflandırma başlığı yerleştirerek bu yarışmada güçlü bir performans elde etmiştir. Yi vd. [6] tarafından yürütülen kapsamlı bir tarama çalışmasında, alanın hem teknik hem de etik zorlukları ayrıntılı biçimde özetlenmiştir. Bunun yanı sıra, Frank ve Schönherr tarafından öne sürülen WaveFake [4] gibi büyük ölçekli veri kümeleri, vokoder-spesifik artefaktların tespit edilebilirliğinin sistematik biçimde incelenmesi için altyapı oluşturmuştur.</w:t>
       </w:r>
     </w:p>
     <w:p>
       <w:pPr>
-        <w:spacing w:before="160" w:after="40" w:line="240" w:lineRule="auto"/>
+        <w:spacing w:before="160" w:after="40" w:line="360" w:lineRule="auto"/>
         <w:jc w:val="left"/>
         <w:keepNext/>
       </w:pPr>
@@ -607,14 +639,14 @@
           <w:b/>
           <w:i/>
           <w:color w:val="333333"/>
-          <w:sz w:val="17"/>
+          <w:sz w:val="18"/>
         </w:rPr>
         <w:t>1.2. Dönüştürücü Tabanlı Ses Temsilleri (Transformer-Based Audio Representations)</w:t>
       </w:r>
     </w:p>
     <w:p>
       <w:pPr>
-        <w:spacing w:line="240" w:lineRule="auto" w:before="0" w:after="120"/>
+        <w:spacing w:line="360" w:lineRule="auto" w:before="0" w:after="120"/>
         <w:ind w:firstLine="283"/>
         <w:jc w:val="both"/>
       </w:pPr>
@@ -624,14 +656,14 @@
           <w:b w:val="0"/>
           <w:i w:val="0"/>
           <w:color w:val="333333"/>
-          <w:sz w:val="17"/>
+          <w:sz w:val="18"/>
         </w:rPr>
         <w:t>Dönüştürücü temelli ve kendi kendini denetimli (self-supervised) ses temsilleri, son beş yıl içerisinde geleneksel akustik öznitelik mühendisliğinin önemli bir alternatifi hâline gelmiştir. Baevski vd. tarafından öne sürülen çalışmada [13], ham ses sinyalinden ince ayar gerektirmeyen öznitelikler üreten wav2vec 2.0 mimarisi sunulmuştur. Elizalde vd. tarafından geliştirilen CLAP (Contrastive Language-Audio Pretraining) [14] yöntemi, karşıt öğrenme (contrastive learning) yaklaşımı ile ses ve metin temsillerini ortak bir gömü uzayında hizalamaktadır. Söz konusu çalışma, Wu vd. tarafından öne sürülen büyük ölçekli CLAP varyantında [15] genişletilmiş ve 633.526 ses-metin çiftinden öğrenilmiş daha güçlü bir model elde edilmiştir. Bu modeller doğrudan tespit için kullanılmasa da, ileri görevler için sağlam bir temel oluşturmaktadır.</w:t>
       </w:r>
     </w:p>
     <w:p>
       <w:pPr>
-        <w:spacing w:before="160" w:after="40" w:line="240" w:lineRule="auto"/>
+        <w:spacing w:before="160" w:after="40" w:line="360" w:lineRule="auto"/>
         <w:jc w:val="left"/>
         <w:keepNext/>
       </w:pPr>
@@ -641,14 +673,14 @@
           <w:b/>
           <w:i/>
           <w:color w:val="333333"/>
-          <w:sz w:val="17"/>
+          <w:sz w:val="18"/>
         </w:rPr>
         <w:t>1.3. Ses İçin Topluluk Yöntemleri ve Gradyan Artırma (Ensemble Methods and Gradient Boosting for Audio)</w:t>
       </w:r>
     </w:p>
     <w:p>
       <w:pPr>
-        <w:spacing w:line="240" w:lineRule="auto" w:before="0" w:after="120"/>
+        <w:spacing w:line="360" w:lineRule="auto" w:before="0" w:after="120"/>
         <w:ind w:firstLine="283"/>
         <w:jc w:val="both"/>
       </w:pPr>
@@ -658,14 +690,14 @@
           <w:b w:val="0"/>
           <w:i w:val="0"/>
           <w:color w:val="333333"/>
-          <w:sz w:val="17"/>
+          <w:sz w:val="18"/>
         </w:rPr>
         <w:t>Topluluk öğrenmesi (ensemble learning) yöntemleri, ses sınıflandırma alanında istikrarlı biçimde rekabetçi sonuçlar üretmektedir. Liu vd. tarafından öne sürülen çalışmada [16], XGBoost tabanlı bir müzikal enstrüman tanıma sisteminin çoklu öznitelik füzyonu ile yüksek doğruluğa ulaşabildiği gösterilmiştir. Gan vd. [17], Değişken Mod Ayrıştırması (Variational Mode Decomposition-VMD) ve Geliştirilmiş Balina Optimizasyon Algoritması (Improved Whale Optimization Algorithm-IWOA) ile zenginleştirilen XGBoost modelinin (VMD-IWOA-XGBoost) GTZAN ve Bangla veri kümeleri üzerinde diğer modelleri beş değerlendirme kriterinde geride bıraktığını raporlamıştır. Türkçe literatür kapsamında, Hızlısoy ve Tüfekci [18] derin öğrenme tabanlı bir mimari ile Türkçe müziklerin tür sınıflandırması üzerinde çalışmış ve yeni bir Türkçe müzik veri tabanı oluşturmuşlardır. Özbalcı vd. [19], GTZAN veri kümesi üzerinde Rastgele Orman, SVM ve Yapay Sinir Ağı (Artificial Neural Network-YSA) algoritmalarını karşılaştırmalı olarak değerlendirmiş ve Rastgele Orman algoritması ile %81 doğruluk değerine ulaşmıştır. Turan ve Polat [20] ise yarı denetimli (semi-supervised) makine öğrenmesi yöntemlerini kullanarak müzik türlerinin tespiti üzerine bir çalışma sunmuşlardır. Kostrzewa vd. tarafından öne sürülen geniş sinir ağı toplulukları yaklaşımı [21], müzik tür sınıflandırmasında tek modellere kıyasla daha yüksek bir performans göstermiştir. Gourisaria vd. [22], Mel Frekans Kepstral Katsayıları (Mel Frequency Cepstral Coefficients-MFCC) ile Kısa Süreli Fourier Dönüşümü (Short-Time Fourier Transform-STFT) özniteliklerini karşılaştırmalı olarak inceleyerek ses sınıflandırması için en uygun temsil yöntemini araştırmışlardır.</w:t>
       </w:r>
     </w:p>
     <w:p>
       <w:pPr>
-        <w:spacing w:before="160" w:after="40" w:line="240" w:lineRule="auto"/>
+        <w:spacing w:before="160" w:after="40" w:line="360" w:lineRule="auto"/>
         <w:jc w:val="left"/>
         <w:keepNext/>
       </w:pPr>
@@ -675,14 +707,14 @@
           <w:b/>
           <w:i/>
           <w:color w:val="333333"/>
-          <w:sz w:val="17"/>
+          <w:sz w:val="18"/>
         </w:rPr>
         <w:t>1.4. GenAI Müzik Üretici Sistemleri (GenAI Music Generation Systems)</w:t>
       </w:r>
     </w:p>
     <w:p>
       <w:pPr>
-        <w:spacing w:line="240" w:lineRule="auto" w:before="0" w:after="120"/>
+        <w:spacing w:line="360" w:lineRule="auto" w:before="0" w:after="120"/>
         <w:ind w:firstLine="283"/>
         <w:jc w:val="both"/>
       </w:pPr>
@@ -692,14 +724,14 @@
           <w:b w:val="0"/>
           <w:i w:val="0"/>
           <w:color w:val="333333"/>
-          <w:sz w:val="17"/>
+          <w:sz w:val="18"/>
         </w:rPr>
         <w:t>GenAI müzik üretim sistemleri, tespit problemini doğrudan şekillendiren teknik çeşitliliği yansıtmaktadır. Copet vd. tarafından geliştirilen MusicGen [1] sistemi, metne koşullu sıkıştırılmış ses andıçları (audio tokens) üzerinde çalışan tek aşamalı bir Dönüştürücü dil modeli kullanmaktadır. Liu vd. tarafından öne sürülen AudioLDM [2] ise metinden sese üretim için CLAP gömmelerini koşullandırma sinyali olarak kullanan bir gizil difüzyon modelidir (latent diffusion model). Suno ve Udio gibi ticari ürünler altta yatan mimarilerini kamuoyu ile paylaşmamıştır; ancak çıktılarının sürümler arasında ölçülen spektral özellikleri, dağılımsal olarak gözlemlenebilir tutarlı bir iz bırakmaktadır.</w:t>
       </w:r>
     </w:p>
     <w:p>
       <w:pPr>
-        <w:spacing w:before="160" w:after="40" w:line="240" w:lineRule="auto"/>
+        <w:spacing w:before="160" w:after="40" w:line="360" w:lineRule="auto"/>
         <w:jc w:val="left"/>
         <w:keepNext/>
       </w:pPr>
@@ -709,14 +741,14 @@
           <w:b/>
           <w:i/>
           <w:color w:val="333333"/>
-          <w:sz w:val="17"/>
+          <w:sz w:val="18"/>
         </w:rPr>
         <w:t>1.5. GenAI Müzik Tespitinde Güncel Gelişmeler (2024-2025) (Recent Advances in GenAI Music Detection (2024-2025))</w:t>
       </w:r>
     </w:p>
     <w:p>
       <w:pPr>
-        <w:spacing w:line="240" w:lineRule="auto" w:before="0" w:after="120"/>
+        <w:spacing w:line="360" w:lineRule="auto" w:before="0" w:after="120"/>
         <w:ind w:firstLine="283"/>
         <w:jc w:val="both"/>
       </w:pPr>
@@ -726,7 +758,7 @@
           <w:b w:val="0"/>
           <w:i w:val="0"/>
           <w:color w:val="333333"/>
-          <w:sz w:val="17"/>
+          <w:sz w:val="18"/>
         </w:rPr>
         <w:t>Bu alandaki en doğrudan ilgili çalışmalar 2024-2025 yılları arasında yayımlanmıştır. Li vd. [5] ses derin sahte tespiti metodolojisini gelişmekte olan GenAI müzik tespiti alanına bağlayan bir yol haritası ve genel bakış sunmuş; aktarılabilir öznitelikleri katalogladıkları aynı çalışmada üretici modeller arası genellemenin alanın birincil açık problemi olduğunu vurgulamışlardır. Afchar vd. tarafından öne sürülen ICASSP 2025 çalışmasında [7], oto-kodlayıcı artefaktları üzerinde eğitilen tespit sistemlerinin nöral vokoderlerin spektral artıkları sayesinde %99,8 doğruluk değerine ulaşabileceği gösterilmiştir. Kim ve Go tarafından öne sürülen Segment Transformer [8], kısa müzik segmentlerini bir Dönüştürücü başlığı ile işleyen ve kendi kendini denetimli önceden eğitilmiş temsilleri yapısal örüntülerin yakalanması amacıyla entegre eden bir mimari sunmaktadır. Rahman vd. tarafından geliştirilen SONICS veri kümesi [23], 97.000'den fazla şarkı ve 49.000'den fazla Suno/Udio kaynaklı sentetik şarkı içermekte olup uçtan-uca sentetik şarkı tespiti için geniş ölçekli bir referans kıyaslama oluşturmaktadır. Comanducci vd. [24] tarafından geliştirilen FakeMusicCaps veri kümesi, beş farklı metinden-müziğe modeli ile yeniden üretilmiş MusicCaps eşlemelerinden oluşmakta ve hem tespit hem de atıflandırma deneyleri için bir temel sağlamaktadır. Pascu vd. tarafından öne sürülen Echoes [25] veri kümesi, on farklı popüler GenAI müzik üretim sistemi tarafından üretilen anlamsal-hizalı içeriği kapsamaktadır. Sunday [26] FakeMusicCaps üzerinde CNN tabanlı tespit yaklaşımının tempo gerdirme ve perde kaydırma altındaki performansını ölçmüştür; Sroka vd. tarafından öne sürülen çalışmada [27] ise ses büyütmeleri (audio augmentations) altında sahte müzik tespit performansının sistematik biçimde değerlendirilmesi gerçekleştirilmiştir. Bu çalışmaların ortak bulgusu şu şekilde özetlenebilir: hiçbir tek mimari ailesi, hem üretici modeller arası genellemeyi hem de düşmanca güçlendirilmiş sinyallere karşı sağlamlığı tek başına sağlayamamaktadır. AURIS ile karşılaştırma amacıyla ilgili çalışmaların genel bakışı Tablo 1'de sunulmuştur.</w:t>
       </w:r>
@@ -743,7 +775,7 @@
           <w:b/>
           <w:i w:val="0"/>
           <w:color w:val="333333"/>
-          <w:sz w:val="17"/>
+          <w:sz w:val="18"/>
         </w:rPr>
         <w:t>Tablo 1. Yapay zekâ müzik tespiti alanındaki ilgili çalışmaların genel bakışı</w:t>
       </w:r>
@@ -760,7 +792,7 @@
           <w:b w:val="0"/>
           <w:i/>
           <w:color w:val="333333"/>
-          <w:sz w:val="17"/>
+          <w:sz w:val="18"/>
         </w:rPr>
         <w:t>(Overview of related works in AI-generated music detection)</w:t>
       </w:r>
@@ -1794,7 +1826,7 @@
     </w:p>
     <w:p>
       <w:pPr>
-        <w:spacing w:before="240" w:after="80" w:line="240" w:lineRule="auto"/>
+        <w:spacing w:before="240" w:after="80" w:line="360" w:lineRule="auto"/>
         <w:jc w:val="left"/>
         <w:keepNext/>
       </w:pPr>
@@ -1804,14 +1836,14 @@
           <w:b/>
           <w:i w:val="0"/>
           <w:color w:val="333333"/>
-          <w:sz w:val="17"/>
+          <w:sz w:val="18"/>
         </w:rPr>
         <w:t>2. Materyal ve Yöntem (Material and Method)</w:t>
       </w:r>
     </w:p>
     <w:p>
       <w:pPr>
-        <w:spacing w:line="240" w:lineRule="auto" w:before="0" w:after="120"/>
+        <w:spacing w:line="360" w:lineRule="auto" w:before="0" w:after="120"/>
         <w:ind w:firstLine="283"/>
         <w:jc w:val="both"/>
       </w:pPr>
@@ -1821,7 +1853,7 @@
           <w:b w:val="0"/>
           <w:i w:val="0"/>
           <w:color w:val="333333"/>
-          <w:sz w:val="17"/>
+          <w:sz w:val="18"/>
         </w:rPr>
         <w:t>Bu bölümde önerilen AURIS sistemini geliştirmek için kullanılan materyal ve yöntemler özetlenmiştir. Alt bölümlerde sırasıyla (𝑖) kullanılan veri kümesi, (𝑖𝑖) öznitelik çıkarma boru hattı, (𝑖𝑖𝑖) sınıflandırma modelleri ve (𝑖𝑣) eğitim protokolü ile karar eşiği optimizasyonu detaylandırılmaktadır. Önerilen sistemin uçtan-uca işleyişine genel bir bakış Şekil 1'de sunulmuştur.</w:t>
       </w:r>
@@ -1879,7 +1911,7 @@
           <w:b/>
           <w:i w:val="0"/>
           <w:color w:val="333333"/>
-          <w:sz w:val="17"/>
+          <w:sz w:val="18"/>
         </w:rPr>
         <w:t>Şekil 1. AURIS uçtan-uca işleyiş şeması: ses girişi, 47 boyutlu öznitelik çıkarma, standartlaştırma, 11 modelli topluluk, olasılık füzyonu ve karar eşiği.</w:t>
       </w:r>
@@ -1895,14 +1927,14 @@
           <w:b w:val="0"/>
           <w:i/>
           <w:color w:val="333333"/>
-          <w:sz w:val="17"/>
+          <w:sz w:val="18"/>
         </w:rPr>
         <w:t>(End-to-end AURIS pipeline: audio input, 47-dimensional feature extraction, standardisation, 11-model ensemble, probability fusion and decision threshold.)</w:t>
       </w:r>
     </w:p>
     <w:p>
       <w:pPr>
-        <w:spacing w:before="160" w:after="40" w:line="240" w:lineRule="auto"/>
+        <w:spacing w:before="160" w:after="40" w:line="360" w:lineRule="auto"/>
         <w:jc w:val="left"/>
         <w:keepNext/>
       </w:pPr>
@@ -1912,14 +1944,14 @@
           <w:b/>
           <w:i/>
           <w:color w:val="333333"/>
-          <w:sz w:val="17"/>
+          <w:sz w:val="18"/>
         </w:rPr>
         <w:t>2.1. Kullanılan Veri Kümesi (Utilized Dataset)</w:t>
       </w:r>
     </w:p>
     <w:p>
       <w:pPr>
-        <w:spacing w:line="240" w:lineRule="auto" w:before="0" w:after="120"/>
+        <w:spacing w:line="360" w:lineRule="auto" w:before="0" w:after="120"/>
         <w:ind w:firstLine="283"/>
         <w:jc w:val="both"/>
       </w:pPr>
@@ -1929,7 +1961,7 @@
           <w:b w:val="0"/>
           <w:i w:val="0"/>
           <w:color w:val="333333"/>
-          <w:sz w:val="17"/>
+          <w:sz w:val="18"/>
         </w:rPr>
         <w:t>Güçlü bir ML/DL modelinin inşa edilebilmesi için en önemli gereksinimlerden biri altın standartta bir veri kümesine sahip olmaktır. Bu bağlamda, bu çalışmada toplam 5.195 ses örneğinden oluşan kapsamlı bir veri kümesi derlenmiştir. Bu örneklerin 3.113 tanesi insan tarafından bestelenmiş ve seslendirilmiş kayıtları (sınıf 0), 2.082 tanesi ise GenAI sistemleri tarafından üretilmiş örnekleri (sınıf 1) temsil etmektedir. İnsan kaynakları üç ayrı havuzdan oluşturulmuştur: GTZAN (899 örnek; on tür, 30 saniyelik klipler), FMA Small (1.000 örnek; sekiz tür) ve bir kapak performansı veri seti olan SleepyJesse (854 örnek). GenAI kaynakları daha çeşitli bir yapı sergilemekte olup Suno (500 örnek, sürüm 3-5), Udio, MusicGen [1], AudioLDM2 [2], Stable Audio, Riffusion, Mustango, JEN-1 ve dahili olarak adlandırılan 'Echoes' ile 'AImE' alt kümelerini içermektedir. Kullanılan veri kümesinin kompozisyonu ve sınıf dağılımı Tablo 2'de özetlenmiştir.</w:t>
       </w:r>
@@ -1946,7 +1978,7 @@
           <w:b/>
           <w:i w:val="0"/>
           <w:color w:val="333333"/>
-          <w:sz w:val="17"/>
+          <w:sz w:val="18"/>
         </w:rPr>
         <w:t>Tablo 2. Veri kümesi kompozisyonu ve sınıf dağılımı</w:t>
       </w:r>
@@ -1963,7 +1995,7 @@
           <w:b w:val="0"/>
           <w:i/>
           <w:color w:val="333333"/>
-          <w:sz w:val="17"/>
+          <w:sz w:val="18"/>
         </w:rPr>
         <w:t>(Dataset composition and class distribution)</w:t>
       </w:r>
@@ -2886,7 +2918,7 @@
     </w:p>
     <w:p>
       <w:pPr>
-        <w:spacing w:before="160" w:after="40" w:line="240" w:lineRule="auto"/>
+        <w:spacing w:before="160" w:after="40" w:line="360" w:lineRule="auto"/>
         <w:jc w:val="left"/>
         <w:keepNext/>
       </w:pPr>
@@ -2896,14 +2928,14 @@
           <w:b/>
           <w:i/>
           <w:color w:val="333333"/>
-          <w:sz w:val="17"/>
+          <w:sz w:val="18"/>
         </w:rPr>
         <w:t>2.2. Öznitelik Çıkarma (Feature Extraction)</w:t>
       </w:r>
     </w:p>
     <w:p>
       <w:pPr>
-        <w:spacing w:line="240" w:lineRule="auto" w:before="0" w:after="120"/>
+        <w:spacing w:line="360" w:lineRule="auto" w:before="0" w:after="120"/>
         <w:ind w:firstLine="283"/>
         <w:jc w:val="both"/>
       </w:pPr>
@@ -2913,7 +2945,7 @@
           <w:b w:val="0"/>
           <w:i w:val="0"/>
           <w:color w:val="333333"/>
-          <w:sz w:val="17"/>
+          <w:sz w:val="18"/>
         </w:rPr>
         <w:t>Tüm ML/DL modelleri sayısal verilerle çalışmaktadır. Bu nedenle, kullanılan veri kümesindeki ses parçalarının ayırt edici sayısal özniteliklerle temsil edilmesi gerekmektedir. Bu amaçla her ses parçası, 22.050 Hz örnekleme hızında yeniden örneklenmiş ve librosa [28] kütüphanesi kullanılarak 47 boyutlu bir öznitelik vektörüne dönüştürülmüştür. Elde edilen öznitelik vektörü, akustik karakteristikleri kapsamlı biçimde temsil edebilmek amacıyla dört aileye ayrılmıştır. (𝑖) Spektral aile (16 öznitelik), her bir özniteliğin ortalama ve standart sapması olmak üzere spektral merkezleme (spectral centroid), spektral düzlük (spectral flatness), spektral bant genişliği (spectral bandwidth), spektral kontrast (spectral contrast), spektral azalma (spectral rolloff) ve mel düzlüğünü içermektedir. (𝑖𝑖) Zamansal aile (10 öznitelik) yüksekliği ve zamanlamayı kapsamakta olup şu öznitelikleri içermektedir: Kök Ortalama Kare (Root Mean Square-RMS) enerji ve standart sapması, RMS dinamik aralığı, başlangıç gücü ortalaması ve standart sapması, sıfır geçiş oranı (zero crossing rate) ve standart sapması, tempo (BPM), tempo kararlılığı, tempo varyasyon katsayısı ile vuruş sayısı. (𝑖𝑖𝑖) Harmonik ve tonal aile (9 öznitelik), chroma standart sapması, chroma entropi, chroma geçiş oranı, tonnetz standart sapması, harmonik oran, kompozit harmonik-yapı skoru, mel düzlüğü, ortalama perde (Hz) ve perde standart sapmasını (cent cinsinden) raporlamaktadır. (𝑖𝑣) MFCC ailesi (3 öznitelik), MFCC varyansı ile birinci ve ikinci derece delta varyanslarından oluşmaktadır. (𝑣) Vokal aile (9 öznitelik) ise vokal varlık skoru, vokal güven, vokal AI skoru, perde kararlılığı, vibrato düzenliliği, formant tutarlılığı, nefes düzeni, vokal doku ve vokal harmonik oranı niceliklerini ölçmektedir. İlk sekiz öznitelik için insan ve GenAI örneklerinin dağılımları karşılaştırmalı olarak Şekil 2'de gösterilmiştir.</w:t>
       </w:r>
@@ -2971,7 +3003,7 @@
           <w:b/>
           <w:i w:val="0"/>
           <w:color w:val="333333"/>
-          <w:sz w:val="17"/>
+          <w:sz w:val="18"/>
         </w:rPr>
         <w:t>Şekil 2. LightGBM önemine göre sıralanmış ilk sekiz özniteliğin insan (yeşil) ile yapay zekâ (kırmızı) örnekleri için dağılımı. Spektral düzlük panelleri log-eksen ile gösterilmiştir.</w:t>
       </w:r>
@@ -2987,14 +3019,14 @@
           <w:b w:val="0"/>
           <w:i/>
           <w:color w:val="333333"/>
-          <w:sz w:val="17"/>
+          <w:sz w:val="18"/>
         </w:rPr>
         <w:t>(Distribution of the top eight features by LightGBM importance, human (green) versus AI (red). The spectral flatness panels use a log x-axis.)</w:t>
       </w:r>
     </w:p>
     <w:p>
       <w:pPr>
-        <w:spacing w:before="160" w:after="40" w:line="240" w:lineRule="auto"/>
+        <w:spacing w:before="160" w:after="40" w:line="360" w:lineRule="auto"/>
         <w:jc w:val="left"/>
         <w:keepNext/>
       </w:pPr>
@@ -3004,14 +3036,14 @@
           <w:b/>
           <w:i/>
           <w:color w:val="333333"/>
-          <w:sz w:val="17"/>
+          <w:sz w:val="18"/>
         </w:rPr>
         <w:t>2.3. Sınıflandırma Modelleri (Classification Models)</w:t>
       </w:r>
     </w:p>
     <w:p>
       <w:pPr>
-        <w:spacing w:line="240" w:lineRule="auto" w:before="0" w:after="120"/>
+        <w:spacing w:line="360" w:lineRule="auto" w:before="0" w:after="120"/>
         <w:ind w:firstLine="283"/>
         <w:jc w:val="both"/>
       </w:pPr>
@@ -3021,7 +3053,7 @@
           <w:b w:val="0"/>
           <w:i w:val="0"/>
           <w:color w:val="333333"/>
-          <w:sz w:val="17"/>
+          <w:sz w:val="18"/>
         </w:rPr>
         <w:t>On bir sınıflandırma modeli, ortak bir 5-katlı çapraz doğrulama protokolü altında karşılaştırılmıştır. Yedi makine öğrenmesi modeli scikit-learn [29] kütüphanesi kullanılarak uygulanmıştır: dengeli sınıf ağırlığı ile Lojistik Regresyon (C=2,0), balanced_subsample örnekleme ile Rastgele Orman (n_estimators=500), Gradyan Artırma (n_estimators=180, max_depth=4, learning_rate=0,07), RBF çekirdeği ile destek vektör makinesi SVM (C=10,0, gamma=0,05), ÇKA Sinir Ağı, XGBoost [9] ve LightGBM [10]. SVM, izotonik kalibrasyon ile CalibratedClassifierCV içinde sarılarak diğer modellerle uyumlu olasılık çıktısı sağlanmıştır. Dört derin öğrenme mimarisi PyTorch ile uygulanmıştır: Deep MLP (512-256-128-64 boyutlu katmanlar, BatchNorm ve Dropout), 1D-CNN (öznitelik vektörü üzerinde tek boyutlu konvolüsyon), Residual MLP (üç bloklu artık bağlantılar) ve Attention MLP (öznitelik grupları üzerinde öz-dikkat mekanizması). Tüm derin modeller pos_weight ile ağırlıklandırılmış BCEWithLogitsLoss kullanmakta ve Adam [30] optimizasyonu ile eğitilmektedir. Tablo 3 her modelin hiperparametrelerini özetlemektedir.</w:t>
       </w:r>
@@ -3038,7 +3070,7 @@
           <w:b/>
           <w:i w:val="0"/>
           <w:color w:val="333333"/>
-          <w:sz w:val="17"/>
+          <w:sz w:val="18"/>
         </w:rPr>
         <w:t>Tablo 3. On bir modelin temel hiperparametreleri</w:t>
       </w:r>
@@ -3055,7 +3087,7 @@
           <w:b w:val="0"/>
           <w:i/>
           <w:color w:val="333333"/>
-          <w:sz w:val="17"/>
+          <w:sz w:val="18"/>
         </w:rPr>
         <w:t>(Key hyperparameters of the eleven models)</w:t>
       </w:r>
@@ -3895,7 +3927,7 @@
     </w:p>
     <w:p>
       <w:pPr>
-        <w:spacing w:before="160" w:after="40" w:line="240" w:lineRule="auto"/>
+        <w:spacing w:before="160" w:after="40" w:line="360" w:lineRule="auto"/>
         <w:jc w:val="left"/>
         <w:keepNext/>
       </w:pPr>
@@ -3905,14 +3937,14 @@
           <w:b/>
           <w:i/>
           <w:color w:val="333333"/>
-          <w:sz w:val="17"/>
+          <w:sz w:val="18"/>
         </w:rPr>
         <w:t>2.4. Eğitim Protokolü ve Eşik Optimizasyonu (Training Protocol and Threshold Optimisation)</w:t>
       </w:r>
     </w:p>
     <w:p>
       <w:pPr>
-        <w:spacing w:line="240" w:lineRule="auto" w:before="0" w:after="120"/>
+        <w:spacing w:line="360" w:lineRule="auto" w:before="0" w:after="120"/>
         <w:ind w:firstLine="283"/>
         <w:jc w:val="both"/>
       </w:pPr>
@@ -3922,14 +3954,14 @@
           <w:b w:val="0"/>
           <w:i w:val="0"/>
           <w:color w:val="333333"/>
-          <w:sz w:val="17"/>
+          <w:sz w:val="18"/>
         </w:rPr>
         <w:t>Tüm modeller stratifiye edilmiş 5-katlı çapraz doğrulama (random_state=42) ile değerlendirilmiştir. Her kat içinde StandardScaler eğitim alt kümesi üzerinde fit edilmiş, ardından doğrulama alt kümesi üzerinde transform uygulanmıştır; bu sayede veri sızıntısı önlenmiştir. Karar eşiği θ, varsayılan 0,5 yerine Youden'in J istatistiği ile optimize edilmiştir: J(θ) = TPR(θ) - FPR(θ), Denklem (1). Bu maksimizasyon, duyarlılık ile özgüllüğün toplamını maksimize eden eşiği seçer. LightGBM için Youden-optimal eşik θ* = 0,4316 olarak ölçülmüştür ve aşağıdaki tüm sonuçlar bu eşik altında raporlanmıştır. Olasılıkların kalibrasyon kalitesi Brier skoru ile değerlendirilmiştir, Denklem (2): BS = (1/N) Σᵢ (pᵢ - yᵢ)².</w:t>
       </w:r>
     </w:p>
     <w:p>
       <w:pPr>
-        <w:spacing w:line="240" w:lineRule="auto" w:before="0" w:after="120"/>
+        <w:spacing w:line="360" w:lineRule="auto" w:before="0" w:after="120"/>
         <w:ind w:firstLine="283"/>
         <w:jc w:val="both"/>
       </w:pPr>
@@ -3939,14 +3971,14 @@
           <w:b w:val="0"/>
           <w:i w:val="0"/>
           <w:color w:val="333333"/>
-          <w:sz w:val="17"/>
+          <w:sz w:val="18"/>
         </w:rPr>
         <w:t>Modellerin yorumlanabilirliği, LightGBM üzerinde TreeSHAP [11] algoritması kullanılarak analiz edilmiştir. SHAP değerleri, her özniteliğin tahmine katkısını Shapley değerleri çerçevesinde tutarlı biçimde nicelleştirmektedir.</w:t>
       </w:r>
     </w:p>
     <w:p>
       <w:pPr>
-        <w:spacing w:before="240" w:after="80" w:line="240" w:lineRule="auto"/>
+        <w:spacing w:before="240" w:after="80" w:line="360" w:lineRule="auto"/>
         <w:jc w:val="left"/>
         <w:keepNext/>
       </w:pPr>
@@ -3956,14 +3988,14 @@
           <w:b/>
           <w:i w:val="0"/>
           <w:color w:val="333333"/>
-          <w:sz w:val="17"/>
+          <w:sz w:val="18"/>
         </w:rPr>
         <w:t>3. Sonuçlar ve Tartışmalar (Results and Discussions)</w:t>
       </w:r>
     </w:p>
     <w:p>
       <w:pPr>
-        <w:spacing w:before="160" w:after="40" w:line="240" w:lineRule="auto"/>
+        <w:spacing w:before="160" w:after="40" w:line="360" w:lineRule="auto"/>
         <w:jc w:val="left"/>
         <w:keepNext/>
       </w:pPr>
@@ -3973,14 +4005,14 @@
           <w:b/>
           <w:i/>
           <w:color w:val="333333"/>
-          <w:sz w:val="17"/>
+          <w:sz w:val="18"/>
         </w:rPr>
         <w:t>3.1. Genel Model Performansı (Overall Model Performance)</w:t>
       </w:r>
     </w:p>
     <w:p>
       <w:pPr>
-        <w:spacing w:line="240" w:lineRule="auto" w:before="0" w:after="120"/>
+        <w:spacing w:line="360" w:lineRule="auto" w:before="0" w:after="120"/>
         <w:ind w:firstLine="283"/>
         <w:jc w:val="both"/>
       </w:pPr>
@@ -3990,7 +4022,7 @@
           <w:b w:val="0"/>
           <w:i w:val="0"/>
           <w:color w:val="333333"/>
-          <w:sz w:val="17"/>
+          <w:sz w:val="18"/>
         </w:rPr>
         <w:t>Tablo 4, on bir modelin 5-katlı çapraz doğrulama sonuçlarını ROC-AUC'a göre sıralanmış biçimde sunmaktadır. LightGBM, %95,48 ortalama ROC-AUC değeri ile ilk sırada yer almakta ve Deep MLP %95,42 ile çok yakın bir ikinci sıra elde etmektedir; iki model arasındaki fark yalnızca 0,0006 AUC mertebesindedir. Üçüncü sıradaki XGBoost (%94,65) ve dördüncü sıradaki Residual MLP (%94,85) ile birlikte ilk dört modelin tamamı %94 üzerindeki ROC-AUC değerleriyle birbirine yakın performans göstermektedir. 1D-CNN, %85,43 ile en düşük performansı sergilemiştir; bu sonuç §3.10'da tartışılmaktadır. Şekil 3, dört derin öğrenme mimarisi için epok bazlı eğitim eğrilerini göstermektedir.</w:t>
       </w:r>
@@ -4007,7 +4039,7 @@
           <w:b/>
           <w:i w:val="0"/>
           <w:color w:val="333333"/>
-          <w:sz w:val="17"/>
+          <w:sz w:val="18"/>
         </w:rPr>
         <w:t>Tablo 4. On bir sınıflandırıcının 5-katlı çapraz doğrulama sonuçları (ROC-AUC'a göre sıralı)</w:t>
       </w:r>
@@ -4024,7 +4056,7 @@
           <w:b w:val="0"/>
           <w:i/>
           <w:color w:val="333333"/>
-          <w:sz w:val="17"/>
+          <w:sz w:val="18"/>
         </w:rPr>
         <w:t>(5-fold cross-validation results of the eleven classifiers, sorted by ROC-AUC)</w:t>
       </w:r>
@@ -5975,7 +6007,7 @@
           <w:b/>
           <w:i w:val="0"/>
           <w:color w:val="333333"/>
-          <w:sz w:val="17"/>
+          <w:sz w:val="18"/>
         </w:rPr>
         <w:t>Şekil 3. On bir sınıflandırıcının doğruluk, F1 ve ROC-AUC değerlerinin AUC'a göre azalan sırayla karşılaştırılması.</w:t>
       </w:r>
@@ -5991,7 +6023,7 @@
           <w:b w:val="0"/>
           <w:i/>
           <w:color w:val="333333"/>
-          <w:sz w:val="17"/>
+          <w:sz w:val="18"/>
         </w:rPr>
         <w:t>(Comparison of accuracy, F1 and ROC-AUC across the eleven classifiers, sorted by AUC in descending order.)</w:t>
       </w:r>
@@ -6049,7 +6081,7 @@
           <w:b/>
           <w:i w:val="0"/>
           <w:color w:val="333333"/>
-          <w:sz w:val="17"/>
+          <w:sz w:val="18"/>
         </w:rPr>
         <w:t>Şekil 4. Yedi öznitelik tabanlı sınıflandırıcının 5-katlı çapraz doğrulama ROC eğrileri. LightGBM AUC=0,9545 ile başı çekmekte; rastgele tahmin (AUC=0,500) referans olarak verilmiştir.</w:t>
       </w:r>
@@ -6065,7 +6097,7 @@
           <w:b w:val="0"/>
           <w:i/>
           <w:color w:val="333333"/>
-          <w:sz w:val="17"/>
+          <w:sz w:val="18"/>
         </w:rPr>
         <w:t>(ROC curves of the seven feature-based classifiers under 5-fold cross-validation. LightGBM leads with AUC=0.9545; random guessing (AUC=0.500) is shown as reference.)</w:t>
       </w:r>
@@ -6123,7 +6155,7 @@
           <w:b/>
           <w:i w:val="0"/>
           <w:color w:val="333333"/>
-          <w:sz w:val="17"/>
+          <w:sz w:val="18"/>
         </w:rPr>
         <w:t>Şekil 5. On bir modelin doğruluk, kesinlik, duyarlılık, F1 ve ROC-AUC değerlerinin ısı haritası; her sütundaki en iyi değer kalın gösterilmiştir.</w:t>
       </w:r>
@@ -6139,14 +6171,14 @@
           <w:b w:val="0"/>
           <w:i/>
           <w:color w:val="333333"/>
-          <w:sz w:val="17"/>
+          <w:sz w:val="18"/>
         </w:rPr>
         <w:t>(Heatmap of accuracy, precision, recall, F1 and ROC-AUC across the eleven models; the best per column is shown in bold.)</w:t>
       </w:r>
     </w:p>
     <w:p>
       <w:pPr>
-        <w:spacing w:before="160" w:after="40" w:line="240" w:lineRule="auto"/>
+        <w:spacing w:before="160" w:after="40" w:line="360" w:lineRule="auto"/>
         <w:jc w:val="left"/>
         <w:keepNext/>
       </w:pPr>
@@ -6156,14 +6188,14 @@
           <w:b/>
           <w:i/>
           <w:color w:val="333333"/>
-          <w:sz w:val="17"/>
+          <w:sz w:val="18"/>
         </w:rPr>
         <w:t>3.2. Makine Öğrenmesi ve Derin Öğrenme Karşılaştırması (ML versus DL Comparison)</w:t>
       </w:r>
     </w:p>
     <w:p>
       <w:pPr>
-        <w:spacing w:line="240" w:lineRule="auto" w:before="0" w:after="120"/>
+        <w:spacing w:line="360" w:lineRule="auto" w:before="0" w:after="120"/>
         <w:ind w:firstLine="283"/>
         <w:jc w:val="both"/>
       </w:pPr>
@@ -6173,7 +6205,7 @@
           <w:b w:val="0"/>
           <w:i w:val="0"/>
           <w:color w:val="333333"/>
-          <w:sz w:val="17"/>
+          <w:sz w:val="18"/>
         </w:rPr>
         <w:t>Şekil 6, iki aileyi doğrudan karşılaştırmaktadır. Yedi makine öğrenmesi sınıflandırıcısı %92,75 ortalama ROC-AUC değerine ulaşırken, dört derin öğrenme mimarisi %92,32'de kalmaktadır; ancak bu fark esas olarak 1D-CNN'nin DL ortalamasını aşağı çekmesinden kaynaklanmaktadır. 1D-CNN dışlandığında, kalan üç DL mimarisi %94,62 ortalama elde etmekte ve Lojistik Regresyon dışlandığında ML ortalaması %94,02'ye yükselmektedir. Bu sonuç, 47 boyutlu öznitelik vektörünün ayırt edici bilginin büyük kısmını zaten kodladığını; öznitelik mühendisliğinin model kapasitesinden daha belirleyici bir etken olduğunu göstermektedir. Aynı öznitelik vektörünü giriş olarak alan derin modeller, bu öznitelikler içinde mevcut olmayan ayırt edici bilgiye erişememekte; bu bulgu Yi vd. [6] tarafından özetlenen ses derin sahte literatürüyle de tutarlıdır.</w:t>
       </w:r>
@@ -6231,7 +6263,7 @@
           <w:b/>
           <w:i w:val="0"/>
           <w:color w:val="333333"/>
-          <w:sz w:val="17"/>
+          <w:sz w:val="18"/>
         </w:rPr>
         <w:t>Şekil 6. Makine öğrenmesi (altın) ve derin öğrenme (koyu) mimarilerinin doğruluk, ROC-AUC ve F1 değerleri açısından toplam karşılaştırması.</w:t>
       </w:r>
@@ -6247,7 +6279,7 @@
           <w:b w:val="0"/>
           <w:i/>
           <w:color w:val="333333"/>
-          <w:sz w:val="17"/>
+          <w:sz w:val="18"/>
         </w:rPr>
         <w:t>(Aggregate comparison of machine learning (gold) and deep learning (dark) architectures across accuracy, ROC-AUC and F1.)</w:t>
       </w:r>
@@ -6305,7 +6337,7 @@
           <w:b/>
           <w:i w:val="0"/>
           <w:color w:val="333333"/>
-          <w:sz w:val="17"/>
+          <w:sz w:val="18"/>
         </w:rPr>
         <w:t>Şekil 7. Dört derin öğrenme mimarisi için epok bazlı eğitim eğrileri; her panel beş katın ortalaması ve ±σ bant ile birlikte gösterilmektedir.</w:t>
       </w:r>
@@ -6321,14 +6353,14 @@
           <w:b w:val="0"/>
           <w:i/>
           <w:color w:val="333333"/>
-          <w:sz w:val="17"/>
+          <w:sz w:val="18"/>
         </w:rPr>
         <w:t>(Per-epoch training curves for the four deep learning architectures, mean across five folds with ±σ band.)</w:t>
       </w:r>
     </w:p>
     <w:p>
       <w:pPr>
-        <w:spacing w:before="160" w:after="40" w:line="240" w:lineRule="auto"/>
+        <w:spacing w:before="160" w:after="40" w:line="360" w:lineRule="auto"/>
         <w:jc w:val="left"/>
         <w:keepNext/>
       </w:pPr>
@@ -6338,14 +6370,14 @@
           <w:b/>
           <w:i/>
           <w:color w:val="333333"/>
-          <w:sz w:val="17"/>
+          <w:sz w:val="18"/>
         </w:rPr>
         <w:t>3.3. Katlar-Arası Kararlılık (Cross-Fold Stability)</w:t>
       </w:r>
     </w:p>
     <w:p>
       <w:pPr>
-        <w:spacing w:line="240" w:lineRule="auto" w:before="0" w:after="120"/>
+        <w:spacing w:line="360" w:lineRule="auto" w:before="0" w:after="120"/>
         <w:ind w:firstLine="283"/>
         <w:jc w:val="both"/>
       </w:pPr>
@@ -6355,7 +6387,7 @@
           <w:b w:val="0"/>
           <w:i w:val="0"/>
           <w:color w:val="333333"/>
-          <w:sz w:val="17"/>
+          <w:sz w:val="18"/>
         </w:rPr>
         <w:t>Şekil 8, on bir modelin her bir kat için ROC-AUC değerlerini, ortalamasını ve standart sapmasını sunmaktadır. LightGBM, ±0,0023 standart sapmasıyla havuzdaki en kararlı modeldir; beş katı 0,9515 ile 0,9580 arasında dar bir aralıkta değişmektedir. XGBoost (±0,0029) ve Gradyan Artırma (±0,0038) onu izlemektedir. En değişken modeller 1D-CNN (±0,0087) ve SVM-RBF (±0,0075) olmuştur. Kararlılığa göre sıralama, ortalama AUC sıralamasını yakından izlemekte; en yüksek skoru veren modeller aynı zamanda en az değişken olanlar olmaktadır. Bu örüntü, konuşlandırılabilir bir tespit sistemi için arzu edilen karakteristiği yansıtmaktadır.</w:t>
       </w:r>
@@ -6413,7 +6445,7 @@
           <w:b/>
           <w:i w:val="0"/>
           <w:color w:val="333333"/>
-          <w:sz w:val="17"/>
+          <w:sz w:val="18"/>
         </w:rPr>
         <w:t>Şekil 8. On bir modelin her bir katı için ROC-AUC değerleri, ortalama AUC (azalan sırada) ve standart sapma. LightGBM hem en yüksek ortalamaya hem de en düşük katlar-arası varyansa sahiptir (±0,0023).</w:t>
       </w:r>
@@ -6429,14 +6461,14 @@
           <w:b w:val="0"/>
           <w:i/>
           <w:color w:val="333333"/>
-          <w:sz w:val="17"/>
+          <w:sz w:val="18"/>
         </w:rPr>
         <w:t>(Per-fold ROC-AUC for all eleven models, mean AUC (descending) and standard deviation. LightGBM combines the highest mean with the lowest fold-to-fold variance (±0.0023).)</w:t>
       </w:r>
     </w:p>
     <w:p>
       <w:pPr>
-        <w:spacing w:before="160" w:after="40" w:line="240" w:lineRule="auto"/>
+        <w:spacing w:before="160" w:after="40" w:line="360" w:lineRule="auto"/>
         <w:jc w:val="left"/>
         <w:keepNext/>
       </w:pPr>
@@ -6446,14 +6478,14 @@
           <w:b/>
           <w:i/>
           <w:color w:val="333333"/>
-          <w:sz w:val="17"/>
+          <w:sz w:val="18"/>
         </w:rPr>
         <w:t>3.4. Öznitelik Önemi (Feature Importance)</w:t>
       </w:r>
     </w:p>
     <w:p>
       <w:pPr>
-        <w:spacing w:line="240" w:lineRule="auto" w:before="0" w:after="120"/>
+        <w:spacing w:line="360" w:lineRule="auto" w:before="0" w:after="120"/>
         <w:ind w:firstLine="283"/>
         <w:jc w:val="both"/>
       </w:pPr>
@@ -6463,7 +6495,7 @@
           <w:b w:val="0"/>
           <w:i w:val="0"/>
           <w:color w:val="333333"/>
-          <w:sz w:val="17"/>
+          <w:sz w:val="18"/>
         </w:rPr>
         <w:t>Tablo 5, LightGBM modelinde normalleştirilmiş kazanca göre sıralanan ilk yirmi özniteliği listelemektedir. Spektral düzlük -hem kare başına standart sapma hem de ortalama olarak ölçülen- ilk beş içinde iki kez yer almakta, standart sapması belirgin bir farkla ilk sırayı oluşturmaktadır. Spektral kontrast ortalaması (sıra 2), RMS enerji (sıra 3) ve başlangıç gücü standart sapması (sıra 4) ilk grubu tamamlamaktadır. Vokal aile özniteliklerinin ilk yirmi içinde yalnızca breath_pattern_score (sıra 18) yer almaktadır; bu durum, vokal özniteliklerinin enstrümantal parçalarda anlamlı sinyal üretmemesi ile tutarlıdır. Şekil 9, ilk yirmi özniteliğin önem skorlarını çubuk grafik olarak; Şekil 10 ise TreeSHAP [11] tabanlı global etki dağılımını görselleştirmektedir.</w:t>
       </w:r>
@@ -6480,7 +6512,7 @@
           <w:b/>
           <w:i w:val="0"/>
           <w:color w:val="333333"/>
-          <w:sz w:val="17"/>
+          <w:sz w:val="18"/>
         </w:rPr>
         <w:t>Tablo 5. LightGBM'in normalleştirilmiş kazanç önemine göre ilk on özniteliği</w:t>
       </w:r>
@@ -6497,7 +6529,7 @@
           <w:b w:val="0"/>
           <w:i/>
           <w:color w:val="333333"/>
-          <w:sz w:val="17"/>
+          <w:sz w:val="18"/>
         </w:rPr>
         <w:t>(Top ten features ranked by LightGBM's normalised gain importance)</w:t>
       </w:r>
@@ -7320,7 +7352,7 @@
           <w:b/>
           <w:i w:val="0"/>
           <w:color w:val="333333"/>
-          <w:sz w:val="17"/>
+          <w:sz w:val="18"/>
         </w:rPr>
         <w:t>Şekil 9. LightGBM modelinde ilk yirmi özniteliğin normalleştirilmiş önem skorları. Spektral düzlük standart sapması açık bir farkla ilk sırada.</w:t>
       </w:r>
@@ -7336,7 +7368,7 @@
           <w:b w:val="0"/>
           <w:i/>
           <w:color w:val="333333"/>
-          <w:sz w:val="17"/>
+          <w:sz w:val="18"/>
         </w:rPr>
         <w:t>(Top-twenty feature importances in LightGBM (normalised). spectral_flatness_std leads by a clear margin.)</w:t>
       </w:r>
@@ -7394,7 +7426,7 @@
           <w:b/>
           <w:i w:val="0"/>
           <w:color w:val="333333"/>
-          <w:sz w:val="17"/>
+          <w:sz w:val="18"/>
         </w:rPr>
         <w:t>Şekil 10. 2.000 örneklik bir CV diliminde LightGBM için TreeSHAP global etki diyagramı; her nokta tek bir örneği, yatay konum SHAP değerini, renk ise öznitelik büyüklüğünü kodlamaktadır.</w:t>
       </w:r>
@@ -7410,14 +7442,14 @@
           <w:b w:val="0"/>
           <w:i/>
           <w:color w:val="333333"/>
-          <w:sz w:val="17"/>
+          <w:sz w:val="18"/>
         </w:rPr>
         <w:t>(TreeSHAP global effect plot for LightGBM on a 2,000-sample CV slice; each point is one sample, horizontal position is the SHAP value, colour encodes feature magnitude.)</w:t>
       </w:r>
     </w:p>
     <w:p>
       <w:pPr>
-        <w:spacing w:before="160" w:after="40" w:line="240" w:lineRule="auto"/>
+        <w:spacing w:before="160" w:after="40" w:line="360" w:lineRule="auto"/>
         <w:jc w:val="left"/>
         <w:keepNext/>
       </w:pPr>
@@ -7427,14 +7459,14 @@
           <w:b/>
           <w:i/>
           <w:color w:val="333333"/>
-          <w:sz w:val="17"/>
+          <w:sz w:val="18"/>
         </w:rPr>
         <w:t>3.5. Karmaşıklık Matrisi, Skor Dağılımı ve Kalibrasyon (Confusion Matrix, Score Distribution and Calibration)</w:t>
       </w:r>
     </w:p>
     <w:p>
       <w:pPr>
-        <w:spacing w:line="240" w:lineRule="auto" w:before="0" w:after="120"/>
+        <w:spacing w:line="360" w:lineRule="auto" w:before="0" w:after="120"/>
         <w:ind w:firstLine="283"/>
         <w:jc w:val="both"/>
       </w:pPr>
@@ -7444,7 +7476,7 @@
           <w:b w:val="0"/>
           <w:i w:val="0"/>
           <w:color w:val="333333"/>
-          <w:sz w:val="17"/>
+          <w:sz w:val="18"/>
         </w:rPr>
         <w:t>Şekil 11, LightGBM'in 5-katlı doğrulama tahminlerinin Youden-optimal eşik θ* = 0,4316 ile eşiklendiği durumda elde edilen karmaşıklık matrisini göstermektedir. Matris şu değerleri raporlamaktadır: 2.721 doğru negatif (insan örneklerinin %87,4'ü), 1.862 doğru pozitif (yapay zekâ örneklerinin %89,4'ü), 392 yanlış pozitif (insan örneklerinin %12,6'sı yapay zekâ olarak atanmış) ve 220 yanlış negatif (yapay zekâ örneklerinin %10,6'sı insan olarak atanmış). Yapay zekâ sınıfı için duyarlılık (%89,4) insan örnekleri için özgüllük (%87,4) ile esasen dengelidir; küçük asimetri Youden ölçütünden kaynaklanmaktadır.</w:t>
       </w:r>
@@ -7502,7 +7534,7 @@
           <w:b/>
           <w:i w:val="0"/>
           <w:color w:val="333333"/>
-          <w:sz w:val="17"/>
+          <w:sz w:val="18"/>
         </w:rPr>
         <w:t>Şekil 11. LightGBM için Youden-optimal eşik θ* = 0,4316 altında karmaşıklık matrisi. Hücreler örnek sayıları ve ilgili sınıf-içi yüzdeleri göstermektedir.</w:t>
       </w:r>
@@ -7518,14 +7550,14 @@
           <w:b w:val="0"/>
           <w:i/>
           <w:color w:val="333333"/>
-          <w:sz w:val="17"/>
+          <w:sz w:val="18"/>
         </w:rPr>
         <w:t>(Confusion matrix for LightGBM at the Youden-optimal threshold θ* = 0.4316. Cells show sample counts and corresponding within-class percentages.)</w:t>
       </w:r>
     </w:p>
     <w:p>
       <w:pPr>
-        <w:spacing w:line="240" w:lineRule="auto" w:before="0" w:after="120"/>
+        <w:spacing w:line="360" w:lineRule="auto" w:before="0" w:after="120"/>
         <w:ind w:firstLine="283"/>
         <w:jc w:val="both"/>
       </w:pPr>
@@ -7535,7 +7567,7 @@
           <w:b w:val="0"/>
           <w:i w:val="0"/>
           <w:color w:val="333333"/>
-          <w:sz w:val="17"/>
+          <w:sz w:val="18"/>
         </w:rPr>
         <w:t>Şekil 12, insan ve yapay zekâ sınıfları için P(AI) tahmini olasılık dağılımlarını ayrı ayrı çizmektedir. İki dağılım iyi ayrılmıştır; örtüşme yalnızca 0,4-0,6 merkezi bölgede önemli ölçüde mevcuttur. Kesik çizgi Youden-optimal eşiği işaretlemektedir; eşiğin simetrik 0,5 değerinin solunda konumlanması sınıf dengesizliği (yapay zekâ : insan ≈ 1 : 1,5) ile J(θ) maksimizasyonunun birleşik etkisini yansıtmaktadır. Şekil 13, kalibrasyon eğrisini sunmaktadır. Eğri olasılık aralığı boyunca köşegene yakın seyretmekte ve Brier skoru 0,083 olarak ölçülmektedir; bu değer, üretilen olasılıkların gerçek arka olasılığın güvenilir tahminleri olduğunu doğrulamaktadır.</w:t>
       </w:r>
@@ -7593,7 +7625,7 @@
           <w:b/>
           <w:i w:val="0"/>
           <w:color w:val="333333"/>
-          <w:sz w:val="17"/>
+          <w:sz w:val="18"/>
         </w:rPr>
         <w:t>Şekil 12. İnsan (yeşil) ve yapay zekâ (kırmızı) örnekleri için P(AI) tahmin olasılık dağılımları. Kesik çizgi Youden-optimal karar eşiği θ* = 0,4316.</w:t>
       </w:r>
@@ -7609,7 +7641,7 @@
           <w:b w:val="0"/>
           <w:i/>
           <w:color w:val="333333"/>
-          <w:sz w:val="17"/>
+          <w:sz w:val="18"/>
         </w:rPr>
         <w:t>(Predicted-probability distributions of P(AI) for human (green) and AI (red) samples. Dashed line marks the Youden-optimal decision threshold θ* = 0.4316.)</w:t>
       </w:r>
@@ -7667,7 +7699,7 @@
           <w:b/>
           <w:i w:val="0"/>
           <w:color w:val="333333"/>
-          <w:sz w:val="17"/>
+          <w:sz w:val="18"/>
         </w:rPr>
         <w:t>Şekil 13. LightGBM için kalibrasyon eğrisi. Köşegen ideal kalibrasyona karşılık gelir; Brier skoru = 0,083.</w:t>
       </w:r>
@@ -7683,7 +7715,7 @@
           <w:b w:val="0"/>
           <w:i/>
           <w:color w:val="333333"/>
-          <w:sz w:val="17"/>
+          <w:sz w:val="18"/>
         </w:rPr>
         <w:t>(Calibration curve for LightGBM. Diagonal corresponds to perfect calibration; Brier score = 0.083.)</w:t>
       </w:r>
@@ -7741,7 +7773,7 @@
           <w:b/>
           <w:i w:val="0"/>
           <w:color w:val="333333"/>
-          <w:sz w:val="17"/>
+          <w:sz w:val="18"/>
         </w:rPr>
         <w:t>Şekil 14. LightGBM için kesinlik-duyarlılık eğrisi; ortalama kesinlik 0,934 olarak ölçülmüştür ve sınıf oranı 1:1,5 için ima edilen 0,401 baz çizgisinin çok üstündedir.</w:t>
       </w:r>
@@ -7757,14 +7789,14 @@
           <w:b w:val="0"/>
           <w:i/>
           <w:color w:val="333333"/>
-          <w:sz w:val="17"/>
+          <w:sz w:val="18"/>
         </w:rPr>
         <w:t>(Precision-recall curve for LightGBM; average precision is 0.934, well above the no-skill baseline of 0.401 implied by the 1:1.5 class ratio.)</w:t>
       </w:r>
     </w:p>
     <w:p>
       <w:pPr>
-        <w:spacing w:before="160" w:after="40" w:line="240" w:lineRule="auto"/>
+        <w:spacing w:before="160" w:after="40" w:line="360" w:lineRule="auto"/>
         <w:jc w:val="left"/>
         <w:keepNext/>
       </w:pPr>
@@ -7774,14 +7806,14 @@
           <w:b/>
           <w:i/>
           <w:color w:val="333333"/>
-          <w:sz w:val="17"/>
+          <w:sz w:val="18"/>
         </w:rPr>
         <w:t>3.6. Eşik Taraması ve Karar Çalışma Noktaları (Threshold Sweep and Decision Operating Points)</w:t>
       </w:r>
     </w:p>
     <w:p>
       <w:pPr>
-        <w:spacing w:line="240" w:lineRule="auto" w:before="0" w:after="120"/>
+        <w:spacing w:line="360" w:lineRule="auto" w:before="0" w:after="120"/>
         <w:ind w:firstLine="283"/>
         <w:jc w:val="both"/>
       </w:pPr>
@@ -7791,7 +7823,7 @@
           <w:b w:val="0"/>
           <w:i w:val="0"/>
           <w:color w:val="333333"/>
-          <w:sz w:val="17"/>
+          <w:sz w:val="18"/>
         </w:rPr>
         <w:t>Şekil 15, kesinlik, duyarlılık, F1 ve doğruluğun karar eşiğine göre nasıl değiştiğini göstermektedir. F1 skoru 0,40-0,50 aralığında bir plato oluşturmakta; Youden-optimal eşik bu platonun sol kenarında konumlanmaktadır. Bu örüntü, farklı çalıştırma maliyetlerine sahip kullanıcıların eğri üzerinde güvenle hareket edebileceğini göstermektedir.</w:t>
       </w:r>
@@ -7849,7 +7881,7 @@
           <w:b/>
           <w:i w:val="0"/>
           <w:color w:val="333333"/>
-          <w:sz w:val="17"/>
+          <w:sz w:val="18"/>
         </w:rPr>
         <w:t>Şekil 15. LightGBM için karar eşiğine karşı kesinlik, duyarlılık ve F1 taraması. Youden-J optimumu θ* = 0,4316 kesik çizgi ile işaretlenmiştir.</w:t>
       </w:r>
@@ -7865,14 +7897,14 @@
           <w:b w:val="0"/>
           <w:i/>
           <w:color w:val="333333"/>
-          <w:sz w:val="17"/>
+          <w:sz w:val="18"/>
         </w:rPr>
         <w:t>(Threshold sweep of precision, recall and F1 versus decision threshold for LightGBM. Youden-J optimum θ* = 0.4316 is marked with the dashed line.)</w:t>
       </w:r>
     </w:p>
     <w:p>
       <w:pPr>
-        <w:spacing w:before="160" w:after="40" w:line="240" w:lineRule="auto"/>
+        <w:spacing w:before="160" w:after="40" w:line="360" w:lineRule="auto"/>
         <w:jc w:val="left"/>
         <w:keepNext/>
       </w:pPr>
@@ -7882,14 +7914,14 @@
           <w:b/>
           <w:i/>
           <w:color w:val="333333"/>
-          <w:sz w:val="17"/>
+          <w:sz w:val="18"/>
         </w:rPr>
         <w:t>3.7. Üretici Bazlı Performans (Per-Generator Performance)</w:t>
       </w:r>
     </w:p>
     <w:p>
       <w:pPr>
-        <w:spacing w:line="240" w:lineRule="auto" w:before="0" w:after="120"/>
+        <w:spacing w:line="360" w:lineRule="auto" w:before="0" w:after="120"/>
         <w:ind w:firstLine="283"/>
         <w:jc w:val="both"/>
       </w:pPr>
@@ -7899,7 +7931,7 @@
           <w:b w:val="0"/>
           <w:i w:val="0"/>
           <w:color w:val="333333"/>
-          <w:sz w:val="17"/>
+          <w:sz w:val="18"/>
         </w:rPr>
         <w:t>Veri kümesi 12'den fazla üretici sistemden örnek içerdiğinden, üretici bazlı performans toplam metriklerin ötesinde bilgilendiricidir. Şekil 16, LightGBM'in kaynak bazlı performansını sunmaktadır. Suno parçaları %93,0 duyarlılık (500'de 465) ile, Echoes %88,6 (1.128'de 999) ile kurtarılmaktadır. AImE alt kümesi (n=204) %79,9'a düşmektedir. Deepfake seti ise tam olarak %50,0'da kalmakta; yani bu parçaların yarısı tespit edilememektedir. İnsan tarafında, GTZAN (%93,2) ve FMA (%88,9) güvenilir biçimde tanınırken SleepyJesse kapak seti (n=854) %76,3'e düşmektedir. İki başarısızlık noktası -deepfake alt kümesi ve SleepyJesse kapakları- aynı yöne işaret etmektedir: akustik profili kendi sınıf etiketinin geri kalanından sistematik olarak farklı olan parçalar modeli zorlamaktadır. Bu durum Li vd. [5] tarafından vurgulanan üretici-modeller arası genelleme zorluğu ile tutarlıdır.</w:t>
       </w:r>
@@ -7957,7 +7989,7 @@
           <w:b/>
           <w:i w:val="0"/>
           <w:color w:val="333333"/>
-          <w:sz w:val="17"/>
+          <w:sz w:val="18"/>
         </w:rPr>
         <w:t>Şekil 16. LightGBM'in 5-katlı çapraz doğrulama tahminleri üzerinde θ* = 0,4316 ile kaynak bazlı performansı. Yapay zekâ kaynakları (kırmızı) AI sınıfı duyarlılığı ile, insan kaynakları (yeşil) özgüllük ile değerlendirilmiştir.</w:t>
       </w:r>
@@ -7973,7 +8005,7 @@
           <w:b w:val="0"/>
           <w:i/>
           <w:color w:val="333333"/>
-          <w:sz w:val="17"/>
+          <w:sz w:val="18"/>
         </w:rPr>
         <w:t>(Per-source LightGBM performance on 5-fold CV predictions at θ* = 0.4316. AI sources (red) evaluated by AI-class recall; human sources (green) by specificity.)</w:t>
       </w:r>
@@ -8031,7 +8063,7 @@
           <w:b/>
           <w:i w:val="0"/>
           <w:color w:val="333333"/>
-          <w:sz w:val="17"/>
+          <w:sz w:val="18"/>
         </w:rPr>
         <w:t>Şekil 17. LightGBM için sınıf bazlı kesinlik, duyarlılık ve F1 değerleri.</w:t>
       </w:r>
@@ -8047,14 +8079,14 @@
           <w:b w:val="0"/>
           <w:i/>
           <w:color w:val="333333"/>
-          <w:sz w:val="17"/>
+          <w:sz w:val="18"/>
         </w:rPr>
         <w:t>(Per-class precision, recall and F1 for LightGBM.)</w:t>
       </w:r>
     </w:p>
     <w:p>
       <w:pPr>
-        <w:spacing w:before="160" w:after="40" w:line="240" w:lineRule="auto"/>
+        <w:spacing w:before="160" w:after="40" w:line="360" w:lineRule="auto"/>
         <w:jc w:val="left"/>
         <w:keepNext/>
       </w:pPr>
@@ -8064,14 +8096,14 @@
           <w:b/>
           <w:i/>
           <w:color w:val="333333"/>
-          <w:sz w:val="17"/>
+          <w:sz w:val="18"/>
         </w:rPr>
         <w:t>3.8. Tartışma (Discussion)</w:t>
       </w:r>
     </w:p>
     <w:p>
       <w:pPr>
-        <w:spacing w:line="240" w:lineRule="auto" w:before="0" w:after="120"/>
+        <w:spacing w:line="360" w:lineRule="auto" w:before="0" w:after="120"/>
         <w:ind w:firstLine="283"/>
         <w:jc w:val="both"/>
       </w:pPr>
@@ -8081,14 +8113,14 @@
           <w:b w:val="0"/>
           <w:i w:val="0"/>
           <w:color w:val="333333"/>
-          <w:sz w:val="17"/>
+          <w:sz w:val="18"/>
         </w:rPr>
         <w:t>Bu alt bölümde, elde edilen deneysel sonuçlar literatür ışığında ayrıntılı biçimde tartışılmıştır. Spektral düzlük özniteliğinin öznitelik önem sıralamasındaki baskın konumu, daha geniş ses derin sahte literatürüyle [6] tutarlı ve yorumlanabilir bir bulgu niteliğindedir. Spektral düzlük, bir sinyalin güç spektrumunun geometrik ve aritmetik ortalamaları arasındaki oranı ölçerek spektrumun ne kadar tonal veya gürültü-benzeri olduğunu yakalamaktadır. Güncel GenAI üretim sistemleri, algısal kalite ölçütlerini optimize etme eğiliminde olup bunun yan etkisi olarak insan kayıtlarınınkinden sistematik biçimde daha temiz spektrumlar üreten sinyaller ortaya çıkarmaktadır. İnsan kayıtları ise kayıt ortamı, mikrofon ön-yükselticileri ve enstrümantal performansın katkıda bulunduğu geniş bantlı gürültüyü taşımaktadır. Bu yapısal fark, spektral düzlüğün ayırt edici güç olarak öne çıkmasının temel nedenini oluşturmaktadır.</w:t>
       </w:r>
     </w:p>
     <w:p>
       <w:pPr>
-        <w:spacing w:line="240" w:lineRule="auto" w:before="0" w:after="120"/>
+        <w:spacing w:line="360" w:lineRule="auto" w:before="0" w:after="120"/>
         <w:ind w:firstLine="283"/>
         <w:jc w:val="both"/>
       </w:pPr>
@@ -8098,14 +8130,14 @@
           <w:b w:val="0"/>
           <w:i w:val="0"/>
           <w:color w:val="333333"/>
-          <w:sz w:val="17"/>
+          <w:sz w:val="18"/>
         </w:rPr>
         <w:t>Üretici modeller arası genelleme bağlamında, kullanılan veri kümesinin otoregresif modellerden (MusicGen [1]) difüzyon tabanlı sistemlere (AudioLDM [2]) ve ticari üreticilere (Suno, Udio) kadar on iki veya daha fazla GenAI üretim sistemini kapsadığı görülmektedir. Bu çeşitliliğin temel amacı, modelin tek bir üretici ailenin parmak izlerine aşırı uyum sağlamasını engellemektir. Bölüm 3.7'de raporlanan kaynak bazlı sonuçlar bu yaklaşımın kısmen başarılı olduğunu göstermektedir; Suno ve Echoes parçalarında %88-93 duyarlılık değeri elde edilirken deepfake alt kümesinde bu değer %50'ye düşmektedir. Bu sonuç, Li vd. [5] tarafından alanın açık problemi olarak işaret edilen üretici modeller arası genelleme zorluğunu doğrular niteliktedir.</w:t>
       </w:r>
     </w:p>
     <w:p>
       <w:pPr>
-        <w:spacing w:line="240" w:lineRule="auto" w:before="0" w:after="120"/>
+        <w:spacing w:line="360" w:lineRule="auto" w:before="0" w:after="120"/>
         <w:ind w:firstLine="283"/>
         <w:jc w:val="both"/>
       </w:pPr>
@@ -8115,14 +8147,14 @@
           <w:b w:val="0"/>
           <w:i w:val="0"/>
           <w:color w:val="333333"/>
-          <w:sz w:val="17"/>
+          <w:sz w:val="18"/>
         </w:rPr>
         <w:t>1D-CNN modelinin diğer mimarilere kıyasla belirgin biçimde düşük performansı (ROC-AUC = 0,8543), mimari bir uyumsuzluğun sonucu olarak değerlendirilmektedir. Tek boyutlu evrişim, bir dizi boyunca yerel korelasyonları kullanmak üzere tasarlanmıştır; ancak önerilen sistemde giriş, sıralanmamış 47 boyutlu düz bir öznitelik vektörüdür ve vektörün bitişik indeksleri ilgisiz miktarlara karşılık gelmektedir. Bu liste boyunca bir çekirdeği kaydıran evrişim işleminin öğrenebileceği anlamlı bir öteleme değişmezliği bulunmadığından, 1D-CNN modeli vektörü bir bütün olarak işleyen diğer üç DL mimarisinin gerisinde kalmakta ve doğruluk açısından Lojistik Regresyon tarafından bile geçilmektedir.</w:t>
       </w:r>
     </w:p>
     <w:p>
       <w:pPr>
-        <w:spacing w:line="240" w:lineRule="auto" w:before="0" w:after="120"/>
+        <w:spacing w:line="360" w:lineRule="auto" w:before="0" w:after="120"/>
         <w:ind w:firstLine="283"/>
         <w:jc w:val="both"/>
       </w:pPr>
@@ -8132,7 +8164,7 @@
           <w:b w:val="0"/>
           <w:i w:val="0"/>
           <w:color w:val="333333"/>
-          <w:sz w:val="17"/>
+          <w:sz w:val="18"/>
         </w:rPr>
         <w:t>Topluluğun ezberleme eğilimini doğrudan değerlendirmek amacıyla, her modelin eğitim doğruluğu ile 5-katlı çapraz doğrulama doğruluğu karşılaştırmalı olarak incelenmiştir. Şekil 18'de sunulan sonuçlar şu örüntüyü ortaya koymaktadır: Rastgele Orman modeli %100,0 eğitim doğruluğuna karşı çapraz doğrulama altında %86,1 doğruluk elde etmiş olup aradaki 13,9 puanlık fark dikkat çekicidir. LightGBM ve SVM sırasıyla 12,0 ve 13,4 puanlık farklarla bu eğilimi takip etmektedir. XGBoost ve Gradyan Artırma modelleri ise -daha güçlü yerleşik düzenleştirmelerine rağmen- 8-9 puanlık bir fark sergilemektedir. Eğitim ve çapraz doğrulama doğruluklarının esasen örtüştüğü tek topluluk üyesi, yalnızca 0,6 puanlık fark ile Lojistik Regresyon olmuştur. Bu örüntü, ağaç tabanlı toplulukların 5-katlı çapraz doğrulamanın yakalayabildiği ancak tek bir eğitim/test bölünmesinin gizleyebileceği gerçek bir aşırı öğrenme (overfitting) eğilimi taşıdığını göstermektedir. Bu bulgu, %88,0'lık çapraz doğrulama doğruluğunun anlamlı bir performans tavanı olarak yorumlanmasını gerektirmektedir.</w:t>
       </w:r>
@@ -8190,7 +8222,7 @@
           <w:b/>
           <w:i w:val="0"/>
           <w:color w:val="333333"/>
-          <w:sz w:val="17"/>
+          <w:sz w:val="18"/>
         </w:rPr>
         <w:t>Şekil 18. Yedi öznitelik tabanlı modelin eğitim ve 5-katlı çapraz doğrulama doğrulukları arasındaki farkın karşılaştırması.</w:t>
       </w:r>
@@ -8206,14 +8238,14 @@
           <w:b w:val="0"/>
           <w:i/>
           <w:color w:val="333333"/>
-          <w:sz w:val="17"/>
+          <w:sz w:val="18"/>
         </w:rPr>
         <w:t>(Comparison of training accuracy and 5-fold cross-validation accuracy for the seven feature-based models.)</w:t>
       </w:r>
     </w:p>
     <w:p>
       <w:pPr>
-        <w:spacing w:line="240" w:lineRule="auto" w:before="0" w:after="120"/>
+        <w:spacing w:line="360" w:lineRule="auto" w:before="0" w:after="120"/>
         <w:ind w:firstLine="283"/>
         <w:jc w:val="both"/>
       </w:pPr>
@@ -8223,7 +8255,7 @@
           <w:b w:val="0"/>
           <w:i w:val="0"/>
           <w:color w:val="333333"/>
-          <w:sz w:val="17"/>
+          <w:sz w:val="18"/>
         </w:rPr>
         <w:t>Öznitelik fazlalığı açısından yapılan analiz, 47 özniteliğin tasarım gereği fazlalıklı bir yapıya sahip olduğunu göstermiştir. Yirmi öznitelik çiftinin |Pearson r| değeri tüm veri kümesi üzerinde 0,85'in üzerinde ölçülmüştür. Bu çiftlerden dördü 0,97 değerini aşmaktadır: has_vocals ile vocal_harmonic_ratio (r = 0,994), pitch_std_cents ile vibrato_extent_cents (0,983), vocal_texture_score ile vocal_harmonic_ratio (0,975) ve has_vocals ile vocal_texture_score (0,974). Vokal olmayan öznitelikler arasında ise spektral merkez, bant genişliği ve azalma ortalamaları sıkı bir küme oluşturmaktadır (ikili r &gt; 0,94). Şekil 19, 47×47 boyutundaki tüm |r| matrisini görselleştirmekte; aşağı-sağda yer alan koyu çapraz-dışı bloklar vokal öznitelik ailesindeki yoğun fazlalığı yansıtmaktadır.</w:t>
       </w:r>
@@ -8281,7 +8313,7 @@
           <w:b/>
           <w:i w:val="0"/>
           <w:color w:val="333333"/>
-          <w:sz w:val="17"/>
+          <w:sz w:val="18"/>
         </w:rPr>
         <w:t>Şekil 19. 47 öznitelik arasında mutlak Pearson korelasyon ısı haritası.</w:t>
       </w:r>
@@ -8297,14 +8329,14 @@
           <w:b w:val="0"/>
           <w:i/>
           <w:color w:val="333333"/>
-          <w:sz w:val="17"/>
+          <w:sz w:val="18"/>
         </w:rPr>
         <w:t>(Absolute Pearson correlation heatmap between the 47 features.)</w:t>
       </w:r>
     </w:p>
     <w:p>
       <w:pPr>
-        <w:spacing w:line="240" w:lineRule="auto" w:before="0" w:after="120"/>
+        <w:spacing w:line="360" w:lineRule="auto" w:before="0" w:after="120"/>
         <w:ind w:firstLine="283"/>
         <w:jc w:val="both"/>
       </w:pPr>
@@ -8314,7 +8346,7 @@
           <w:b w:val="0"/>
           <w:i w:val="0"/>
           <w:color w:val="333333"/>
-          <w:sz w:val="17"/>
+          <w:sz w:val="18"/>
         </w:rPr>
         <w:t>Öznitelik sayısının model performansına etkisini değerlendirmek amacıyla kapsamlı bir öznitelik çıkarma deneyi gerçekleştirilmiştir. Bu deney kapsamında öznitelikler LightGBM önemine göre sıralanmış ve ilk-N öznitelik için N ∈ {1, 3, 5, 10, 15, 20, 30, 47} değerleri ile 5-katlı çapraz doğrulama tekrarlanmıştır. Şekil 20'de sunulan eğri, N = 10 değerine kadar dik bir artış göstermekte (doğruluk %59,8'den %84,7'ye yükselmekte) ve sonrasında belirgin bir plato sergilemektedir. N = 20 değerinde %88,0, N = 30 değerinde %88,7 doğruluk elde edilmiş; tüm 47 özniteliğin kullanılması ise %88,5 doğruluk vermiştir. Bu sonuç, N = 30 değeri ile bir standart sapma içerisinde eşdeğerdir. Diğer bir ifadeyle, önem sırasına göre sondaki on yedi öznitelik ölçülebilir bir ek doğruluk sağlamamaktadır. Bu bulgu, pratik bir konuşlandırma senaryosunda kalite kaybı yaşanmadan öznitelik vektörünün boyutunun azaltılabileceğini ortaya koymaktadır.</w:t>
       </w:r>
@@ -8372,7 +8404,7 @@
           <w:b/>
           <w:i w:val="0"/>
           <w:color w:val="333333"/>
-          <w:sz w:val="17"/>
+          <w:sz w:val="18"/>
         </w:rPr>
         <w:t>Şekil 20. LightGBM modelinin 5-katlı çapraz doğrulama doğruluğunun kullanılan öznitelik sayısına bağlı değişimi.</w:t>
       </w:r>
@@ -8388,14 +8420,14 @@
           <w:b w:val="0"/>
           <w:i/>
           <w:color w:val="333333"/>
-          <w:sz w:val="17"/>
+          <w:sz w:val="18"/>
         </w:rPr>
         <w:t>(5-fold cross-validation accuracy of LightGBM as a function of the number of features used.)</w:t>
       </w:r>
     </w:p>
     <w:p>
       <w:pPr>
-        <w:spacing w:line="240" w:lineRule="auto" w:before="0" w:after="120"/>
+        <w:spacing w:line="360" w:lineRule="auto" w:before="0" w:after="120"/>
         <w:ind w:firstLine="283"/>
         <w:jc w:val="both"/>
       </w:pPr>
@@ -8405,14 +8437,14 @@
           <w:b w:val="0"/>
           <w:i w:val="0"/>
           <w:color w:val="333333"/>
-          <w:sz w:val="17"/>
+          <w:sz w:val="18"/>
         </w:rPr>
         <w:t>Önerilen sistemin sınırlamaları açık biçimde değerlendirildiğinde dört temel husus öne çıkmaktadır. Birincisi, öznitelikler 15-30 saniye uzunluğundaki tam ses kliplerinden çıkarılmakta olup daha kısa klipler (&lt; 5 saniye) özellikle tempo ve vibrato istatistikleri için daha az güvenilir tahminler üretebilmektedir; bu nedenle önerilen sistemin canlı mikrofon ve kısa klip senaryolarındaki performansı henüz değerlendirilmemiştir. İkincisi, kullanılan veri kümesi yirmi farklı tür kapsamakla birlikte bazı türlerin (özellikle ambient ve lo-fi) GenAI tarafında aşırı temsil edildiği gözlemlenmiştir; tür katmanlı bir değerlendirme, genelleme kapasitesinin daha titiz biçimde ölçülmesini sağlayacaktır. Üçüncüsü, düşmanca sağlamlık açıkça test edilmemiştir; MP3 sıkıştırma, perde kaydırma ve zaman gerdirme gibi sonradan işleme tekniklerinin vokoder izlerine dayanan sistemlerin performansını düşürdüğü Afchar vd. [7] tarafından raporlanmıştır. AURIS sistemi özniteliklerini vokoder izleri etrafında inşa etmediğinden bu etkiye daha az hassas olması beklenmektedir; ancak bu varsayımın deneysel olarak doğrulanması gerekmektedir. Dördüncüsü, eğitim ile çapraz doğrulama doğrulukları arasında tespit edilen fark, modelin dağılım kayışına karşı duyarlı olduğunu göstermektedir; bu durumun SONICS [23] ve FakeMusicCaps [24] gibi gelişmekte olan kıyaslamalar üzerinde yapılacak resmî değerlendirmelerle teyit edilmesi gerekmektedir.</w:t>
       </w:r>
     </w:p>
     <w:p>
       <w:pPr>
-        <w:spacing w:before="240" w:after="80" w:line="240" w:lineRule="auto"/>
+        <w:spacing w:before="240" w:after="80" w:line="360" w:lineRule="auto"/>
         <w:jc w:val="left"/>
         <w:keepNext/>
       </w:pPr>
@@ -8422,14 +8454,14 @@
           <w:b/>
           <w:i w:val="0"/>
           <w:color w:val="333333"/>
-          <w:sz w:val="17"/>
+          <w:sz w:val="18"/>
         </w:rPr>
         <w:t>Sonuçlar (Conclusions)</w:t>
       </w:r>
     </w:p>
     <w:p>
       <w:pPr>
-        <w:spacing w:line="240" w:lineRule="auto" w:before="0" w:after="120"/>
+        <w:spacing w:line="360" w:lineRule="auto" w:before="0" w:after="120"/>
         <w:ind w:firstLine="283"/>
         <w:jc w:val="both"/>
       </w:pPr>
@@ -8439,14 +8471,14 @@
           <w:b w:val="0"/>
           <w:i w:val="0"/>
           <w:color w:val="333333"/>
-          <w:sz w:val="17"/>
+          <w:sz w:val="18"/>
         </w:rPr>
         <w:t>Bu çalışmada, GenAI tarafından üretilen müziği insan tarafından bestelenmiş kayıtlardan ayırt edebilmek için AURIS adlı uçtan-uca bir tespit sistemi önerilmiştir. Önerilen sistem; 47 boyutlu elle tasarlanmış bir akustik öznitelik vektörünü, on iki veya daha fazla GenAI üretim sisteminden derlenen 5.195 örnek üzerinde eğitilen on bir sınıflandırma modelinden oluşan bir topluluk ile birleştirmektedir. Elde edilen temel ampirik bulgular şu şekilde özetlenebilir: LightGBM modeli, %95,48 ortalama ROC-AUC değeri ile en yüksek performansı elde etmiş; DMLP ise %95,42 ile çok yakın bir ikinci sırayı almıştır. Ayrıca LightGBM, ±0,0023 standart sapma ile havuzdaki en düşük katlar-arası varyansa sahip modeli oluşturmuştur. Spektral düzlük özniteliği, GenAI ile insan müziği ayrımı için en bilgilendirici tek öznitelik olarak öne çıkmakta; bu örüntü, sentetik ve kaydedilmiş spektrumlar arasındaki fark üzerinden yorumlanabilir bir nitelik taşımaktadır. Youden J ölçütü ile her kat için optimize edilen θ* = 0,4316 karar eşiği, mevcut 1:1,5 sınıf dengesizliği altında varsayılan 0,5 kesim noktasını sistematik biçimde geçmektedir. Tanılayıcı analiz ise iki önemli sınırlamayı açık biçimde ortaya koymaktadır: (𝑖) tüm ağaç tabanlı modeller eğitim ile çapraz doğrulama doğrulukları arasında 8-14 puanlık bir fark sergilemekte ve (𝑖𝑖) 47 özniteliğin önem sırasına göre sondaki yaklaşık on yedisi ölçülebilir bir ek doğruluk sağlamamaktadır.</w:t>
       </w:r>
     </w:p>
     <w:p>
       <w:pPr>
-        <w:spacing w:line="240" w:lineRule="auto" w:before="0" w:after="120"/>
+        <w:spacing w:line="360" w:lineRule="auto" w:before="0" w:after="120"/>
         <w:ind w:firstLine="283"/>
         <w:jc w:val="both"/>
       </w:pPr>
@@ -8456,14 +8488,14 @@
           <w:b w:val="0"/>
           <w:i w:val="0"/>
           <w:color w:val="333333"/>
-          <w:sz w:val="17"/>
+          <w:sz w:val="18"/>
         </w:rPr>
         <w:t>Bu araştırma, GenAI tarafından üretilen müziklerin tespiti alanında derin öğrenme ve topluluk öğrenmesi tekniklerinin etkinliğini vurgulayarak, çok üreticili müzik tespiti alanında daha fazla ilerleme için umut verici yollar sunmaktadır. Gelecek çalışmalar kapsamında dört yön takip edilecektir. Birincisi, SONICS [23] ve FakeMusicCaps [24] gibi gelişmekte olan halka açık kıyaslamalar üzerinde resmi bir üretici-modeller arası tutulan değerlendirme gerçekleştirilecektir. İkincisi, ince ayar yapılmış wav2vec2 [13] modeli, öznitelik tabanlı sınıflandırıcılarla doğrudan karşılaştırma için 5-katlı çapraz doğrulama protokolüne entegre edilecektir. Üçüncüsü, düşmanca sağlamlık (adversarial robustness); MP3 sıkıştırma, perde kaydırma ve zaman gerdirme gibi ses manipülasyonları altında açıkça değerlendirilecektir. Dördüncüsü, kullanılan veri kümesi on bin örneğe doğru genişletilecek ve ortaya çıkan yeni GenAI üretim sistemleri kapsama dahil edilecektir; özellikle Li vd. [5] tarafından tanımlanan üretici-modeller arası genelleme zorluğuna odaklanılması hedeflenmektedir.</w:t>
       </w:r>
     </w:p>
     <w:p>
       <w:pPr>
-        <w:spacing w:before="240" w:after="80" w:line="240" w:lineRule="auto"/>
+        <w:spacing w:before="240" w:after="80" w:line="360" w:lineRule="auto"/>
         <w:jc w:val="left"/>
         <w:keepNext/>
       </w:pPr>
@@ -8473,7 +8505,7 @@
           <w:b/>
           <w:i w:val="0"/>
           <w:color w:val="333333"/>
-          <w:sz w:val="17"/>
+          <w:sz w:val="18"/>
         </w:rPr>
         <w:t>Kaynaklar (References)</w:t>
       </w:r>

</xml_diff>

<commit_message>
feat: update author details and add advisor information in AURIS paper
</commit_message>
<xml_diff>
--- a/docs/academic/paper/AURIS_paper_TR.docx
+++ b/docs/academic/paper/AURIS_paper_TR.docx
@@ -31,7 +31,7 @@
           <w:color w:val="333333"/>
           <w:sz w:val="20"/>
         </w:rPr>
-        <w:t>Hasan Arthur Altuntaş*</w:t>
+        <w:t>Hasan Arthur Altuntaş*, Büşra Takgil</w:t>
       </w:r>
     </w:p>
     <w:p>
@@ -63,12 +63,12 @@
           <w:color w:val="333333"/>
           <w:sz w:val="18"/>
         </w:rPr>
-        <w:t>ORCID: 0009-0002-8302-7657</w:t>
+        <w:t>ORCID: 0009-0002-8302-7657 (H.A. Altuntaş)</w:t>
       </w:r>
     </w:p>
     <w:p>
       <w:pPr>
-        <w:spacing w:after="320"/>
+        <w:spacing w:after="40"/>
         <w:jc w:val="center"/>
       </w:pPr>
       <w:r>
@@ -80,6 +80,22 @@
           <w:sz w:val="18"/>
         </w:rPr>
         <w:t>*Sorumlu Yazar / Corresponding Author: hasannarthurrr@gmail.com</w:t>
+      </w:r>
+    </w:p>
+    <w:p>
+      <w:pPr>
+        <w:spacing w:after="320"/>
+        <w:jc w:val="center"/>
+      </w:pPr>
+      <w:r>
+        <w:rPr>
+          <w:rFonts w:ascii="Times New Roman" w:hAnsi="Times New Roman" w:cs="Times New Roman" w:eastAsia="Times New Roman"/>
+          <w:b w:val="0"/>
+          <w:i/>
+          <w:color w:val="333333"/>
+          <w:sz w:val="18"/>
+        </w:rPr>
+        <w:t>Danışman / Advisor: Dr. Öğr. Üyesi Büşra Takgil, busratakgil@duzce.edu.tr</w:t>
       </w:r>
     </w:p>
     <w:p>

</xml_diff>